<commit_message>
docs: refine AI process report (table flowchart, pseudocode, anonymous, remove section 4)
</commit_message>
<xml_diff>
--- a/AI_활용_개발_프로세스_보고서.docx
+++ b/AI_활용_개발_프로세스_보고서.docx
@@ -68,7 +68,7 @@
                 <w:color w:val="1E3A8A"/>
                 <w:sz w:val="20"/>
               </w:rPr>
-              <w:t xml:space="preserve">: 본 문서는 프로그래밍 및 AI에 대한 사전 배경지식이 없는 청중(약학대학 교수님, 학우, 비전공자)도 쉽게 이해할 수 있도록, 기획 아이디어 발굴부터 피그마(Figma) 디자인, AI 기반 아키텍처 설계, 코드 전환 및 스토어 출시에 이르는 </w:t>
+              <w:t xml:space="preserve">: 본 문서는 프로그래밍 및 AI에 대한 사전 배경지식이 없는 청중(약학대학 교수님, 학우, 비전공자)도 직관적으로 이해할 수 있도록, 기획 아이디어 발굴부터 피그마(Figma) 디자인, 순서도 및 가재코드(의사코드) 설계, AI 기반 아키텍처 수립, 실제 코드 전환 및 스토어 출시에 이르는 </w:t>
             </w:r>
             <w:r>
               <w:rPr>
@@ -78,7 +78,7 @@
                 <w:color w:val="1E3A8A"/>
                 <w:sz w:val="20"/>
               </w:rPr>
-              <w:t>전 과정의 AI 협업 개발 방법론(AI Pair-Programming Pipeline)</w:t>
+              <w:t>전 과정의 AI 협업 개발 파이프라인(AI Pair-Programming Pipeline)</w:t>
             </w:r>
             <w:r>
               <w:rPr>
@@ -187,7 +187,7 @@
           <w:color w:val="334155"/>
           <w:sz w:val="21"/>
         </w:rPr>
-        <w:t>기획자, UI 디자이너, 시니어 소프트웨어 엔지니어 역할을 분담하는 '가상 팀원(AI Pair Programmer)'</w:t>
+        <w:t>기획자, UI 디자이너, 소프트웨어 엔지니어 역할을 분담하는 '가상 팀원(AI Pair Programmer)'</w:t>
       </w:r>
       <w:r>
         <w:rPr>
@@ -198,6 +198,29 @@
         <w:t>으로 프로세스 전반에 투입함.</w:t>
       </w:r>
     </w:p>
+    <w:p>
+      <w:pPr>
+        <w:spacing w:before="160" w:after="160"/>
+        <w:pBdr>
+          <w:bottom w:val="single" w:sz="6" w:space="1" w:color="E2E8F0"/>
+        </w:pBdr>
+      </w:pPr>
+    </w:p>
+    <w:p>
+      <w:pPr>
+        <w:keepNext/>
+        <w:spacing w:before="220" w:after="80"/>
+      </w:pPr>
+      <w:r>
+        <w:rPr>
+          <w:rFonts w:ascii="맑은 고딕" w:hAnsi="맑은 고딕" w:eastAsia="맑은 고딕"/>
+          <w:b/>
+          <w:color w:val="2563EB"/>
+          <w:sz w:val="24"/>
+        </w:rPr>
+        <w:t>📋 5단계 AI 협업 파이프라인 한눈에 보기</w:t>
+      </w:r>
+    </w:p>
     <w:tbl>
       <w:tblPr>
         <w:tblW w:type="auto" w:w="0"/>
@@ -205,10 +228,10 @@
         <w:tblLayout w:type="fixed"/>
         <w:tblLook w:firstColumn="1" w:firstRow="1" w:lastColumn="0" w:lastRow="0" w:noHBand="0" w:noVBand="1" w:val="04A0"/>
         <w:tblBorders>
-          <w:top w:val="none"/>
-          <w:bottom w:val="none"/>
-          <w:left w:val="single" w:sz="24" w:space="0" w:color="7C3AED"/>
-          <w:right w:val="none"/>
+          <w:top w:val="single" w:sz="4" w:space="0" w:color="CBD5E1"/>
+          <w:bottom w:val="single" w:sz="4" w:space="0" w:color="CBD5E1"/>
+          <w:left w:val="single" w:sz="4" w:space="0" w:color="CBD5E1"/>
+          <w:right w:val="single" w:sz="4" w:space="0" w:color="CBD5E1"/>
           <w:insideH w:val="none"/>
           <w:insideV w:val="none"/>
         </w:tblBorders>
@@ -220,55 +243,823 @@
         <w:tc>
           <w:tcPr>
             <w:tcW w:type="dxa" w:w="9360"/>
-            <w:shd w:fill="F5F3FF"/>
+            <w:shd w:fill="F8FAFC"/>
             <w:tcMar>
               <w:top w:w="140" w:type="dxa"/>
               <w:bottom w:w="140" w:type="dxa"/>
-              <w:left w:w="200" w:type="dxa"/>
+              <w:left w:w="180" w:type="dxa"/>
+              <w:right w:w="180" w:type="dxa"/>
+            </w:tcMar>
+          </w:tcPr>
+          <w:p>
+            <w:pPr>
+              <w:spacing w:before="40" w:after="40"/>
+            </w:pPr>
+            <w:r>
+              <w:rPr>
+                <w:rFonts w:ascii="Consolas" w:hAnsi="Consolas"/>
+                <w:color w:val="1E293B"/>
+                <w:sz w:val="18"/>
+              </w:rPr>
+              <w:t>[1단계: 아이디어 &amp; 타당성] ➔ [2단계: Figma 디자인 자동화] ➔ [3단계: 가재코드·기획 &amp; 스킬] ➔ [4단계: Flutter 코드 전환] ➔ [5단계: 플레이스토어 배포]</w:t>
+            </w:r>
+          </w:p>
+        </w:tc>
+      </w:tr>
+    </w:tbl>
+    <w:p>
+      <w:pPr>
+        <w:spacing w:before="0" w:after="80"/>
+      </w:pPr>
+    </w:p>
+    <w:tbl>
+      <w:tblPr>
+        <w:tblW w:type="auto" w:w="0"/>
+        <w:jc w:val="center"/>
+        <w:tblLayout w:type="autofit"/>
+        <w:tblLook w:firstColumn="1" w:firstRow="1" w:lastColumn="0" w:lastRow="0" w:noHBand="0" w:noVBand="1" w:val="04A0"/>
+        <w:tblBorders>
+          <w:top w:val="single" w:sz="6" w:space="0" w:color="CBD5E1"/>
+          <w:bottom w:val="single" w:sz="8" w:space="0" w:color="CBD5E1"/>
+          <w:insideH w:val="single" w:sz="4" w:space="0" w:color="E2E8F0"/>
+          <w:insideV w:val="none"/>
+          <w:left w:val="none"/>
+          <w:right w:val="none"/>
+        </w:tblBorders>
+      </w:tblPr>
+      <w:tblGrid>
+        <w:gridCol w:w="1872"/>
+        <w:gridCol w:w="1872"/>
+        <w:gridCol w:w="1872"/>
+        <w:gridCol w:w="1872"/>
+        <w:gridCol w:w="1872"/>
+      </w:tblGrid>
+      <w:tr>
+        <w:tc>
+          <w:tcPr>
+            <w:tcW w:type="dxa" w:w="1872"/>
+            <w:shd w:fill="EDE9FE"/>
+            <w:tcMar>
+              <w:top w:w="140" w:type="dxa"/>
+              <w:bottom w:w="140" w:type="dxa"/>
+              <w:left w:w="160" w:type="dxa"/>
+              <w:right w:w="160" w:type="dxa"/>
+            </w:tcMar>
+          </w:tcPr>
+          <w:p>
+            <w:pPr>
+              <w:spacing w:before="40" w:after="40"/>
+            </w:pPr>
+            <w:r>
+              <w:rPr>
+                <w:rFonts w:ascii="맑은 고딕" w:hAnsi="맑은 고딕" w:eastAsia="맑은 고딕"/>
+                <w:b/>
+                <w:color w:val="4338CA"/>
+                <w:sz w:val="20"/>
+              </w:rPr>
+              <w:t>단계</w:t>
+            </w:r>
+          </w:p>
+        </w:tc>
+        <w:tc>
+          <w:tcPr>
+            <w:tcW w:type="dxa" w:w="1872"/>
+            <w:shd w:fill="EDE9FE"/>
+            <w:tcMar>
+              <w:top w:w="140" w:type="dxa"/>
+              <w:bottom w:w="140" w:type="dxa"/>
+              <w:left w:w="160" w:type="dxa"/>
+              <w:right w:w="160" w:type="dxa"/>
+            </w:tcMar>
+          </w:tcPr>
+          <w:p>
+            <w:pPr>
+              <w:spacing w:before="40" w:after="40"/>
+            </w:pPr>
+            <w:r>
+              <w:rPr>
+                <w:rFonts w:ascii="맑은 고딕" w:hAnsi="맑은 고딕" w:eastAsia="맑은 고딕"/>
+                <w:b/>
+                <w:color w:val="4338CA"/>
+                <w:sz w:val="20"/>
+              </w:rPr>
+              <w:t>개발 단계명</w:t>
+            </w:r>
+          </w:p>
+        </w:tc>
+        <w:tc>
+          <w:tcPr>
+            <w:tcW w:type="dxa" w:w="1872"/>
+            <w:shd w:fill="EDE9FE"/>
+            <w:tcMar>
+              <w:top w:w="140" w:type="dxa"/>
+              <w:bottom w:w="140" w:type="dxa"/>
+              <w:left w:w="160" w:type="dxa"/>
+              <w:right w:w="160" w:type="dxa"/>
+            </w:tcMar>
+          </w:tcPr>
+          <w:p>
+            <w:pPr>
+              <w:spacing w:before="40" w:after="40"/>
+            </w:pPr>
+            <w:r>
+              <w:rPr>
+                <w:rFonts w:ascii="맑은 고딕" w:hAnsi="맑은 고딕" w:eastAsia="맑은 고딕"/>
+                <w:b/>
+                <w:color w:val="4338CA"/>
+                <w:sz w:val="20"/>
+              </w:rPr>
+              <w:t>핵심 협업 활동</w:t>
+            </w:r>
+          </w:p>
+        </w:tc>
+        <w:tc>
+          <w:tcPr>
+            <w:tcW w:type="dxa" w:w="1872"/>
+            <w:shd w:fill="EDE9FE"/>
+            <w:tcMar>
+              <w:top w:w="140" w:type="dxa"/>
+              <w:bottom w:w="140" w:type="dxa"/>
+              <w:left w:w="160" w:type="dxa"/>
+              <w:right w:w="160" w:type="dxa"/>
+            </w:tcMar>
+          </w:tcPr>
+          <w:p>
+            <w:pPr>
+              <w:spacing w:before="40" w:after="40"/>
+            </w:pPr>
+            <w:r>
+              <w:rPr>
+                <w:rFonts w:ascii="맑은 고딕" w:hAnsi="맑은 고딕" w:eastAsia="맑은 고딕"/>
+                <w:b/>
+                <w:color w:val="4338CA"/>
+                <w:sz w:val="20"/>
+              </w:rPr>
+              <w:t>투입된 AI 및 도구</w:t>
+            </w:r>
+          </w:p>
+        </w:tc>
+        <w:tc>
+          <w:tcPr>
+            <w:tcW w:type="dxa" w:w="1872"/>
+            <w:shd w:fill="EDE9FE"/>
+            <w:tcMar>
+              <w:top w:w="140" w:type="dxa"/>
+              <w:bottom w:w="140" w:type="dxa"/>
+              <w:left w:w="160" w:type="dxa"/>
+              <w:right w:w="160" w:type="dxa"/>
+            </w:tcMar>
+          </w:tcPr>
+          <w:p>
+            <w:pPr>
+              <w:spacing w:before="40" w:after="40"/>
+            </w:pPr>
+            <w:r>
+              <w:rPr>
+                <w:rFonts w:ascii="맑은 고딕" w:hAnsi="맑은 고딕" w:eastAsia="맑은 고딕"/>
+                <w:b/>
+                <w:color w:val="4338CA"/>
+                <w:sz w:val="20"/>
+              </w:rPr>
+              <w:t>주요 산출물</w:t>
+            </w:r>
+          </w:p>
+        </w:tc>
+      </w:tr>
+      <w:tr>
+        <w:tc>
+          <w:tcPr>
+            <w:tcW w:type="dxa" w:w="1872"/>
+            <w:tcMar>
+              <w:top w:w="100" w:type="dxa"/>
+              <w:bottom w:w="100" w:type="dxa"/>
+              <w:left w:w="140" w:type="dxa"/>
               <w:right w:w="140" w:type="dxa"/>
             </w:tcMar>
           </w:tcPr>
           <w:p>
             <w:pPr>
-              <w:spacing w:before="40" w:after="80"/>
+              <w:spacing w:before="40" w:after="40"/>
             </w:pPr>
             <w:r>
               <w:rPr>
-                <w:rFonts w:ascii="맑은 고딕" w:hAnsi="맑은 고딕"/>
+                <w:rFonts w:ascii="맑은 고딕" w:hAnsi="맑은 고딕" w:eastAsia="맑은 고딕"/>
                 <w:b/>
-                <w:color w:val="6D28D9"/>
+                <w:color w:val="334155"/>
                 <w:sz w:val="19"/>
               </w:rPr>
-              <w:t>📊 플로우차트 / 다이어그램 명세 (Mermaid)</w:t>
-              <w:br/>
+              <w:t>1단계</w:t>
+            </w:r>
+          </w:p>
+        </w:tc>
+        <w:tc>
+          <w:tcPr>
+            <w:tcW w:type="dxa" w:w="1872"/>
+            <w:tcMar>
+              <w:top w:w="100" w:type="dxa"/>
+              <w:bottom w:w="100" w:type="dxa"/>
+              <w:left w:w="140" w:type="dxa"/>
+              <w:right w:w="140" w:type="dxa"/>
+            </w:tcMar>
+          </w:tcPr>
+          <w:p>
+            <w:pPr>
+              <w:spacing w:before="40" w:after="40"/>
+            </w:pPr>
+            <w:r>
+              <w:rPr>
+                <w:rFonts w:ascii="맑은 고딕" w:hAnsi="맑은 고딕" w:eastAsia="맑은 고딕"/>
+                <w:b/>
+                <w:color w:val="334155"/>
+                <w:sz w:val="19"/>
+              </w:rPr>
+              <w:t>아이디어 도출 &amp; 타당성 검증</w:t>
+            </w:r>
+          </w:p>
+        </w:tc>
+        <w:tc>
+          <w:tcPr>
+            <w:tcW w:type="dxa" w:w="1872"/>
+            <w:tcMar>
+              <w:top w:w="100" w:type="dxa"/>
+              <w:bottom w:w="100" w:type="dxa"/>
+              <w:left w:w="140" w:type="dxa"/>
+              <w:right w:w="140" w:type="dxa"/>
+            </w:tcMar>
+          </w:tcPr>
+          <w:p>
+            <w:pPr>
+              <w:spacing w:before="40" w:after="40"/>
+            </w:pPr>
+            <w:r>
+              <w:rPr>
+                <w:rFonts w:ascii="맑은 고딕" w:hAnsi="맑은 고딕" w:eastAsia="맑은 고딕"/>
+                <w:color w:val="334155"/>
+                <w:sz w:val="19"/>
+              </w:rPr>
+              <w:t>브레인스토밍, 실현 가능성 질의, 비처벌적 UX 방향 확립</w:t>
+            </w:r>
+          </w:p>
+        </w:tc>
+        <w:tc>
+          <w:tcPr>
+            <w:tcW w:type="dxa" w:w="1872"/>
+            <w:tcMar>
+              <w:top w:w="100" w:type="dxa"/>
+              <w:bottom w:w="100" w:type="dxa"/>
+              <w:left w:w="140" w:type="dxa"/>
+              <w:right w:w="140" w:type="dxa"/>
+            </w:tcMar>
+          </w:tcPr>
+          <w:p>
+            <w:pPr>
+              <w:spacing w:before="40" w:after="40"/>
+            </w:pPr>
+            <w:r>
+              <w:rPr>
+                <w:rFonts w:ascii="맑은 고딕" w:hAnsi="맑은 고딕" w:eastAsia="맑은 고딕"/>
+                <w:color w:val="334155"/>
+                <w:sz w:val="19"/>
+              </w:rPr>
+              <w:t>AI 대화 모델 (사운딩 보드)</w:t>
+            </w:r>
+          </w:p>
+        </w:tc>
+        <w:tc>
+          <w:tcPr>
+            <w:tcW w:type="dxa" w:w="1872"/>
+            <w:tcMar>
+              <w:top w:w="100" w:type="dxa"/>
+              <w:bottom w:w="100" w:type="dxa"/>
+              <w:left w:w="140" w:type="dxa"/>
+              <w:right w:w="140" w:type="dxa"/>
+            </w:tcMar>
+          </w:tcPr>
+          <w:p>
+            <w:pPr>
+              <w:spacing w:before="40" w:after="40"/>
+            </w:pPr>
+            <w:r>
+              <w:rPr>
+                <w:rFonts w:ascii="맑은 고딕" w:hAnsi="맑은 고딕" w:eastAsia="맑은 고딕"/>
+                <w:color w:val="334155"/>
+                <w:sz w:val="19"/>
+              </w:rPr>
+              <w:t>기획 아이디어 초안</w:t>
+            </w:r>
+          </w:p>
+        </w:tc>
+      </w:tr>
+      <w:tr>
+        <w:tc>
+          <w:tcPr>
+            <w:tcW w:type="dxa" w:w="1872"/>
+            <w:shd w:fill="F8FAFC"/>
+            <w:tcMar>
+              <w:top w:w="100" w:type="dxa"/>
+              <w:bottom w:w="100" w:type="dxa"/>
+              <w:left w:w="140" w:type="dxa"/>
+              <w:right w:w="140" w:type="dxa"/>
+            </w:tcMar>
+          </w:tcPr>
+          <w:p>
+            <w:pPr>
+              <w:spacing w:before="40" w:after="40"/>
+            </w:pPr>
+            <w:r>
+              <w:rPr>
+                <w:rFonts w:ascii="맑은 고딕" w:hAnsi="맑은 고딕" w:eastAsia="맑은 고딕"/>
+                <w:b/>
+                <w:color w:val="334155"/>
+                <w:sz w:val="19"/>
+              </w:rPr>
+              <w:t>2단계</w:t>
+            </w:r>
+          </w:p>
+        </w:tc>
+        <w:tc>
+          <w:tcPr>
+            <w:tcW w:type="dxa" w:w="1872"/>
+            <w:shd w:fill="F8FAFC"/>
+            <w:tcMar>
+              <w:top w:w="100" w:type="dxa"/>
+              <w:bottom w:w="100" w:type="dxa"/>
+              <w:left w:w="140" w:type="dxa"/>
+              <w:right w:w="140" w:type="dxa"/>
+            </w:tcMar>
+          </w:tcPr>
+          <w:p>
+            <w:pPr>
+              <w:spacing w:before="40" w:after="40"/>
+            </w:pPr>
+            <w:r>
+              <w:rPr>
+                <w:rFonts w:ascii="맑은 고딕" w:hAnsi="맑은 고딕" w:eastAsia="맑은 고딕"/>
+                <w:b/>
+                <w:color w:val="334155"/>
+                <w:sz w:val="19"/>
+              </w:rPr>
+              <w:t>화면 설계 &amp; 디자인 자동화</w:t>
+            </w:r>
+          </w:p>
+        </w:tc>
+        <w:tc>
+          <w:tcPr>
+            <w:tcW w:type="dxa" w:w="1872"/>
+            <w:shd w:fill="F8FAFC"/>
+            <w:tcMar>
+              <w:top w:w="100" w:type="dxa"/>
+              <w:bottom w:w="100" w:type="dxa"/>
+              <w:left w:w="140" w:type="dxa"/>
+              <w:right w:w="140" w:type="dxa"/>
+            </w:tcMar>
+          </w:tcPr>
+          <w:p>
+            <w:pPr>
+              <w:spacing w:before="40" w:after="40"/>
+            </w:pPr>
+            <w:r>
+              <w:rPr>
+                <w:rFonts w:ascii="맑은 고딕" w:hAnsi="맑은 고딕" w:eastAsia="맑은 고딕"/>
+                <w:color w:val="334155"/>
+                <w:sz w:val="19"/>
+              </w:rPr>
+              <w:t>초기 와이어프레임 생성, A/B 시안 추천, Figma MCP 캔버스 제어</w:t>
+            </w:r>
+          </w:p>
+        </w:tc>
+        <w:tc>
+          <w:tcPr>
+            <w:tcW w:type="dxa" w:w="1872"/>
+            <w:shd w:fill="F8FAFC"/>
+            <w:tcMar>
+              <w:top w:w="100" w:type="dxa"/>
+              <w:bottom w:w="100" w:type="dxa"/>
+              <w:left w:w="140" w:type="dxa"/>
+              <w:right w:w="140" w:type="dxa"/>
+            </w:tcMar>
+          </w:tcPr>
+          <w:p>
+            <w:pPr>
+              <w:spacing w:before="40" w:after="40"/>
+            </w:pPr>
+            <w:r>
+              <w:rPr>
+                <w:rFonts w:ascii="맑은 고딕" w:hAnsi="맑은 고딕" w:eastAsia="맑은 고딕"/>
+                <w:color w:val="334155"/>
+                <w:sz w:val="19"/>
+              </w:rPr>
+              <w:t>Figma AI, Figma MCP, Antigravity</w:t>
+            </w:r>
+          </w:p>
+        </w:tc>
+        <w:tc>
+          <w:tcPr>
+            <w:tcW w:type="dxa" w:w="1872"/>
+            <w:shd w:fill="F8FAFC"/>
+            <w:tcMar>
+              <w:top w:w="100" w:type="dxa"/>
+              <w:bottom w:w="100" w:type="dxa"/>
+              <w:left w:w="140" w:type="dxa"/>
+              <w:right w:w="140" w:type="dxa"/>
+            </w:tcMar>
+          </w:tcPr>
+          <w:p>
+            <w:pPr>
+              <w:spacing w:before="40" w:after="40"/>
+            </w:pPr>
+            <w:r>
+              <w:rPr>
+                <w:rFonts w:ascii="맑은 고딕" w:hAnsi="맑은 고딕" w:eastAsia="맑은 고딕"/>
+                <w:color w:val="334155"/>
+                <w:sz w:val="19"/>
+              </w:rPr>
+              <w:t>피그마 인터랙티브 프로토타입</w:t>
+            </w:r>
+          </w:p>
+        </w:tc>
+      </w:tr>
+      <w:tr>
+        <w:tc>
+          <w:tcPr>
+            <w:tcW w:type="dxa" w:w="1872"/>
+            <w:tcMar>
+              <w:top w:w="100" w:type="dxa"/>
+              <w:bottom w:w="100" w:type="dxa"/>
+              <w:left w:w="140" w:type="dxa"/>
+              <w:right w:w="140" w:type="dxa"/>
+            </w:tcMar>
+          </w:tcPr>
+          <w:p>
+            <w:pPr>
+              <w:spacing w:before="40" w:after="40"/>
+            </w:pPr>
+            <w:r>
+              <w:rPr>
+                <w:rFonts w:ascii="맑은 고딕" w:hAnsi="맑은 고딕" w:eastAsia="맑은 고딕"/>
+                <w:b/>
+                <w:color w:val="334155"/>
+                <w:sz w:val="19"/>
+              </w:rPr>
+              <w:t>3단계</w:t>
+            </w:r>
+          </w:p>
+        </w:tc>
+        <w:tc>
+          <w:tcPr>
+            <w:tcW w:type="dxa" w:w="1872"/>
+            <w:tcMar>
+              <w:top w:w="100" w:type="dxa"/>
+              <w:bottom w:w="100" w:type="dxa"/>
+              <w:left w:w="140" w:type="dxa"/>
+              <w:right w:w="140" w:type="dxa"/>
+            </w:tcMar>
+          </w:tcPr>
+          <w:p>
+            <w:pPr>
+              <w:spacing w:before="40" w:after="40"/>
+            </w:pPr>
+            <w:r>
+              <w:rPr>
+                <w:rFonts w:ascii="맑은 고딕" w:hAnsi="맑은 고딕" w:eastAsia="맑은 고딕"/>
+                <w:b/>
+                <w:color w:val="334155"/>
+                <w:sz w:val="19"/>
+              </w:rPr>
+              <w:t>순서도·가재코드 &amp; 스킬 표준화</w:t>
+            </w:r>
+          </w:p>
+        </w:tc>
+        <w:tc>
+          <w:tcPr>
+            <w:tcW w:type="dxa" w:w="1872"/>
+            <w:tcMar>
+              <w:top w:w="100" w:type="dxa"/>
+              <w:bottom w:w="100" w:type="dxa"/>
+              <w:left w:w="140" w:type="dxa"/>
+              <w:right w:w="140" w:type="dxa"/>
+            </w:tcMar>
+          </w:tcPr>
+          <w:p>
+            <w:pPr>
+              <w:spacing w:before="40" w:after="40"/>
+            </w:pPr>
+            <w:r>
+              <w:rPr>
+                <w:rFonts w:ascii="맑은 고딕" w:hAnsi="맑은 고딕" w:eastAsia="맑은 고딕"/>
+                <w:color w:val="334155"/>
+                <w:sz w:val="19"/>
+              </w:rPr>
+              <w:t>로직 순서도 및 가재코드(의사코드) 도출, PRD 수립, AI 코딩 스킬 장착</w:t>
+            </w:r>
+          </w:p>
+        </w:tc>
+        <w:tc>
+          <w:tcPr>
+            <w:tcW w:type="dxa" w:w="1872"/>
+            <w:tcMar>
+              <w:top w:w="100" w:type="dxa"/>
+              <w:bottom w:w="100" w:type="dxa"/>
+              <w:left w:w="140" w:type="dxa"/>
+              <w:right w:w="140" w:type="dxa"/>
+            </w:tcMar>
+          </w:tcPr>
+          <w:p>
+            <w:pPr>
+              <w:spacing w:before="40" w:after="40"/>
+            </w:pPr>
+            <w:r>
+              <w:rPr>
+                <w:rFonts w:ascii="맑은 고딕" w:hAnsi="맑은 고딕" w:eastAsia="맑은 고딕"/>
+                <w:color w:val="334155"/>
+                <w:sz w:val="19"/>
+              </w:rPr>
+              <w:t>AI 의사코드 생성기, GitHub Skills, Antigravity</w:t>
+            </w:r>
+          </w:p>
+        </w:tc>
+        <w:tc>
+          <w:tcPr>
+            <w:tcW w:type="dxa" w:w="1872"/>
+            <w:tcMar>
+              <w:top w:w="100" w:type="dxa"/>
+              <w:bottom w:w="100" w:type="dxa"/>
+              <w:left w:w="140" w:type="dxa"/>
+              <w:right w:w="140" w:type="dxa"/>
+            </w:tcMar>
+          </w:tcPr>
+          <w:p>
+            <w:pPr>
+              <w:spacing w:before="40" w:after="40"/>
+            </w:pPr>
+            <w:r>
+              <w:rPr>
+                <w:rFonts w:ascii="맑은 고딕" w:hAnsi="맑은 고딕" w:eastAsia="맑은 고딕"/>
+                <w:color w:val="334155"/>
+                <w:sz w:val="19"/>
+              </w:rPr>
+              <w:t xml:space="preserve">순서도, 가재코드, PRD 명세서, </w:t>
             </w:r>
             <w:r>
               <w:rPr>
-                <w:rFonts w:ascii="Consolas" w:hAnsi="Consolas"/>
-                <w:color w:val="475569"/>
-                <w:sz w:val="17"/>
+                <w:rFonts w:ascii="Consolas" w:hAnsi="Consolas" w:eastAsia="맑은 고딕"/>
+                <w:color w:val="B42846"/>
+                <w:sz w:val="18"/>
               </w:rPr>
-              <w:t>flowchart LR</w:t>
-              <w:br/>
-              <w:t xml:space="preserve">    A["1단계&lt;br&gt;아이디어 발굴&lt;br&gt;&amp; 타당성 검증"] --&gt; B["2단계&lt;br&gt;Figma AI &amp; MCP&lt;br&gt;디자인 자동화"]</w:t>
-              <w:br/>
-              <w:t xml:space="preserve">    B --&gt; C["3단계&lt;br&gt;기획 명세화&lt;br&gt;&amp; AI 스킬(Skills) 표준화"]</w:t>
-              <w:br/>
-              <w:t xml:space="preserve">    C --&gt; D["4단계&lt;br&gt;AI 에이전트 기반&lt;br&gt;Flutter 코드 전환"]</w:t>
-              <w:br/>
-              <w:t xml:space="preserve">    D --&gt; E["5단계&lt;br&gt;검증, 빌드 &amp;&lt;br&gt;구글 플레이스토어 배포"]</w:t>
-              <w:br/>
-              <w:t xml:space="preserve">    </w:t>
-              <w:br/>
-              <w:t xml:space="preserve">    style A fill:#EDE9FE,stroke:#7C3AED,stroke-width:2px</w:t>
-              <w:br/>
-              <w:t xml:space="preserve">    style B fill:#E0E7FF,stroke:#4338CA,stroke-width:2px</w:t>
-              <w:br/>
-              <w:t xml:space="preserve">    style C fill:#FEF3C7,stroke:#D97706,stroke-width:2px</w:t>
-              <w:br/>
-              <w:t xml:space="preserve">    style D fill:#ECFDF5,stroke:#059669,stroke-width:2px</w:t>
-              <w:br/>
-              <w:t xml:space="preserve">    style E fill:#FEE2E2,stroke:#DC2626,stroke-width:2px</w:t>
+              <w:t>.agents/skills</w:t>
+            </w:r>
+          </w:p>
+        </w:tc>
+      </w:tr>
+      <w:tr>
+        <w:tc>
+          <w:tcPr>
+            <w:tcW w:type="dxa" w:w="1872"/>
+            <w:shd w:fill="F8FAFC"/>
+            <w:tcMar>
+              <w:top w:w="100" w:type="dxa"/>
+              <w:bottom w:w="100" w:type="dxa"/>
+              <w:left w:w="140" w:type="dxa"/>
+              <w:right w:w="140" w:type="dxa"/>
+            </w:tcMar>
+          </w:tcPr>
+          <w:p>
+            <w:pPr>
+              <w:spacing w:before="40" w:after="40"/>
+            </w:pPr>
+            <w:r>
+              <w:rPr>
+                <w:rFonts w:ascii="맑은 고딕" w:hAnsi="맑은 고딕" w:eastAsia="맑은 고딕"/>
+                <w:b/>
+                <w:color w:val="334155"/>
+                <w:sz w:val="19"/>
+              </w:rPr>
+              <w:t>4단계</w:t>
+            </w:r>
+          </w:p>
+        </w:tc>
+        <w:tc>
+          <w:tcPr>
+            <w:tcW w:type="dxa" w:w="1872"/>
+            <w:shd w:fill="F8FAFC"/>
+            <w:tcMar>
+              <w:top w:w="100" w:type="dxa"/>
+              <w:bottom w:w="100" w:type="dxa"/>
+              <w:left w:w="140" w:type="dxa"/>
+              <w:right w:w="140" w:type="dxa"/>
+            </w:tcMar>
+          </w:tcPr>
+          <w:p>
+            <w:pPr>
+              <w:spacing w:before="40" w:after="40"/>
+            </w:pPr>
+            <w:r>
+              <w:rPr>
+                <w:rFonts w:ascii="맑은 고딕" w:hAnsi="맑은 고딕" w:eastAsia="맑은 고딕"/>
+                <w:b/>
+                <w:color w:val="334155"/>
+                <w:sz w:val="19"/>
+              </w:rPr>
+              <w:t>프로덕션 코드 전환</w:t>
+            </w:r>
+          </w:p>
+        </w:tc>
+        <w:tc>
+          <w:tcPr>
+            <w:tcW w:type="dxa" w:w="1872"/>
+            <w:shd w:fill="F8FAFC"/>
+            <w:tcMar>
+              <w:top w:w="100" w:type="dxa"/>
+              <w:bottom w:w="100" w:type="dxa"/>
+              <w:left w:w="140" w:type="dxa"/>
+              <w:right w:w="140" w:type="dxa"/>
+            </w:tcMar>
+          </w:tcPr>
+          <w:p>
+            <w:pPr>
+              <w:spacing w:before="40" w:after="40"/>
+            </w:pPr>
+            <w:r>
+              <w:rPr>
+                <w:rFonts w:ascii="맑은 고딕" w:hAnsi="맑은 고딕" w:eastAsia="맑은 고딕"/>
+                <w:color w:val="334155"/>
+                <w:sz w:val="19"/>
+              </w:rPr>
+              <w:t>피그마 ➔ Flutter 1:1 변환, 클린 아키텍처(MVVM), 로컬 DB 연동</w:t>
+            </w:r>
+          </w:p>
+        </w:tc>
+        <w:tc>
+          <w:tcPr>
+            <w:tcW w:type="dxa" w:w="1872"/>
+            <w:shd w:fill="F8FAFC"/>
+            <w:tcMar>
+              <w:top w:w="100" w:type="dxa"/>
+              <w:bottom w:w="100" w:type="dxa"/>
+              <w:left w:w="140" w:type="dxa"/>
+              <w:right w:w="140" w:type="dxa"/>
+            </w:tcMar>
+          </w:tcPr>
+          <w:p>
+            <w:pPr>
+              <w:spacing w:before="40" w:after="40"/>
+            </w:pPr>
+            <w:r>
+              <w:rPr>
+                <w:rFonts w:ascii="맑은 고딕" w:hAnsi="맑은 고딕" w:eastAsia="맑은 고딕"/>
+                <w:color w:val="334155"/>
+                <w:sz w:val="19"/>
+              </w:rPr>
+              <w:t>figma-to-flutter, Riverpod, Copilot</w:t>
+            </w:r>
+          </w:p>
+        </w:tc>
+        <w:tc>
+          <w:tcPr>
+            <w:tcW w:type="dxa" w:w="1872"/>
+            <w:shd w:fill="F8FAFC"/>
+            <w:tcMar>
+              <w:top w:w="100" w:type="dxa"/>
+              <w:bottom w:w="100" w:type="dxa"/>
+              <w:left w:w="140" w:type="dxa"/>
+              <w:right w:w="140" w:type="dxa"/>
+            </w:tcMar>
+          </w:tcPr>
+          <w:p>
+            <w:pPr>
+              <w:spacing w:before="40" w:after="40"/>
+            </w:pPr>
+            <w:r>
+              <w:rPr>
+                <w:rFonts w:ascii="맑은 고딕" w:hAnsi="맑은 고딕" w:eastAsia="맑은 고딕"/>
+                <w:color w:val="334155"/>
+                <w:sz w:val="19"/>
+              </w:rPr>
+              <w:t>실제 구동 모바일 앱 코드</w:t>
+            </w:r>
+          </w:p>
+        </w:tc>
+      </w:tr>
+      <w:tr>
+        <w:tc>
+          <w:tcPr>
+            <w:tcW w:type="dxa" w:w="1872"/>
+            <w:tcMar>
+              <w:top w:w="100" w:type="dxa"/>
+              <w:bottom w:w="100" w:type="dxa"/>
+              <w:left w:w="140" w:type="dxa"/>
+              <w:right w:w="140" w:type="dxa"/>
+            </w:tcMar>
+          </w:tcPr>
+          <w:p>
+            <w:pPr>
+              <w:spacing w:before="40" w:after="40"/>
+            </w:pPr>
+            <w:r>
+              <w:rPr>
+                <w:rFonts w:ascii="맑은 고딕" w:hAnsi="맑은 고딕" w:eastAsia="맑은 고딕"/>
+                <w:b/>
+                <w:color w:val="334155"/>
+                <w:sz w:val="19"/>
+              </w:rPr>
+              <w:t>5단계</w:t>
+            </w:r>
+          </w:p>
+        </w:tc>
+        <w:tc>
+          <w:tcPr>
+            <w:tcW w:type="dxa" w:w="1872"/>
+            <w:tcMar>
+              <w:top w:w="100" w:type="dxa"/>
+              <w:bottom w:w="100" w:type="dxa"/>
+              <w:left w:w="140" w:type="dxa"/>
+              <w:right w:w="140" w:type="dxa"/>
+            </w:tcMar>
+          </w:tcPr>
+          <w:p>
+            <w:pPr>
+              <w:spacing w:before="40" w:after="40"/>
+            </w:pPr>
+            <w:r>
+              <w:rPr>
+                <w:rFonts w:ascii="맑은 고딕" w:hAnsi="맑은 고딕" w:eastAsia="맑은 고딕"/>
+                <w:b/>
+                <w:color w:val="334155"/>
+                <w:sz w:val="19"/>
+              </w:rPr>
+              <w:t>스토어 배포 &amp; 상용화</w:t>
+            </w:r>
+          </w:p>
+        </w:tc>
+        <w:tc>
+          <w:tcPr>
+            <w:tcW w:type="dxa" w:w="1872"/>
+            <w:tcMar>
+              <w:top w:w="100" w:type="dxa"/>
+              <w:bottom w:w="100" w:type="dxa"/>
+              <w:left w:w="140" w:type="dxa"/>
+              <w:right w:w="140" w:type="dxa"/>
+            </w:tcMar>
+          </w:tcPr>
+          <w:p>
+            <w:pPr>
+              <w:spacing w:before="40" w:after="40"/>
+            </w:pPr>
+            <w:r>
+              <w:rPr>
+                <w:rFonts w:ascii="맑은 고딕" w:hAnsi="맑은 고딕" w:eastAsia="맑은 고딕"/>
+                <w:color w:val="334155"/>
+                <w:sz w:val="19"/>
+              </w:rPr>
+              <w:t>릴리스 빌드, 개인정보 처리방침 자동화, 구글 플레이스토어 심사</w:t>
+            </w:r>
+          </w:p>
+        </w:tc>
+        <w:tc>
+          <w:tcPr>
+            <w:tcW w:type="dxa" w:w="1872"/>
+            <w:tcMar>
+              <w:top w:w="100" w:type="dxa"/>
+              <w:bottom w:w="100" w:type="dxa"/>
+              <w:left w:w="140" w:type="dxa"/>
+              <w:right w:w="140" w:type="dxa"/>
+            </w:tcMar>
+          </w:tcPr>
+          <w:p>
+            <w:pPr>
+              <w:spacing w:before="40" w:after="40"/>
+            </w:pPr>
+            <w:r>
+              <w:rPr>
+                <w:rFonts w:ascii="맑은 고딕" w:hAnsi="맑은 고딕" w:eastAsia="맑은 고딕"/>
+                <w:color w:val="334155"/>
+                <w:sz w:val="19"/>
+              </w:rPr>
+              <w:t>Google Play Console, 스토어 등록 AI 지원</w:t>
+            </w:r>
+          </w:p>
+        </w:tc>
+        <w:tc>
+          <w:tcPr>
+            <w:tcW w:type="dxa" w:w="1872"/>
+            <w:tcMar>
+              <w:top w:w="100" w:type="dxa"/>
+              <w:bottom w:w="100" w:type="dxa"/>
+              <w:left w:w="140" w:type="dxa"/>
+              <w:right w:w="140" w:type="dxa"/>
+            </w:tcMar>
+          </w:tcPr>
+          <w:p>
+            <w:pPr>
+              <w:spacing w:before="40" w:after="40"/>
+            </w:pPr>
+            <w:r>
+              <w:rPr>
+                <w:rFonts w:ascii="맑은 고딕" w:hAnsi="맑은 고딕" w:eastAsia="맑은 고딕"/>
+                <w:color w:val="334155"/>
+                <w:sz w:val="19"/>
+              </w:rPr>
+              <w:t>구글 플레이스토어 정식 출시 앱</w:t>
             </w:r>
           </w:p>
         </w:tc>
@@ -369,7 +1160,7 @@
           <w:color w:val="334155"/>
           <w:sz w:val="20"/>
         </w:rPr>
-        <w:t>조원들이 모여 자유 브레인스토밍을 진행함 (ADHD/우울증 환자의 복약 타이트레이션, 뇌과학 기반 게이미피케이션, 마스코트 인터랙션 등).</w:t>
+        <w:t>팀원들이 모여 자유 브레인스토밍을 진행함 (ADHD/우울증 환자의 복약 타이트레이션, 뇌과학 기반 게이미피케이션, 마스코트 인터랙션 등).</w:t>
       </w:r>
     </w:p>
     <w:p>
@@ -670,7 +1461,7 @@
           <w:color w:val="334155"/>
           <w:sz w:val="20"/>
         </w:rPr>
-        <w:t>: 레이아웃이 고민될 때는 AI에게 5~6가지 대안 시안(1안: 도파민 연속 달성, 2안: 마스코트 응원 등)을 한 번에 뽑아내게 한 뒤 조원 토론을 거쳐 최적의 안을 선별함.</w:t>
+        <w:t>: 레이아웃이 고민될 때는 AI에게 5~6가지 대안 시안(1안: 도파민 연속 달성, 2안: 마스코트 응원 등)을 한 번에 추천받은 뒤 팀원 토론을 거쳐 최적의 안을 선별함.</w:t>
       </w:r>
     </w:p>
     <w:p>
@@ -919,7 +1710,102 @@
           <w:color w:val="2563EB"/>
           <w:sz w:val="24"/>
         </w:rPr>
-        <w:t>[3단계] 기획 명세화 및 AI 스킬(Skills) 표준화 (Current Stage)</w:t>
+        <w:t>[3단계] 순서도·가재코드(의사코드) 설계, 기획 명세화 및 AI 스킬 표준화 (Current Stage)</w:t>
+      </w:r>
+    </w:p>
+    <w:p>
+      <w:pPr>
+        <w:spacing w:before="30" w:after="30"/>
+        <w:ind w:left="360"/>
+      </w:pPr>
+      <w:r>
+        <w:rPr>
+          <w:rFonts w:ascii="맑은 고딕" w:hAnsi="맑은 고딕"/>
+          <w:b/>
+          <w:color w:val="6366F1"/>
+          <w:sz w:val="20"/>
+        </w:rPr>
+        <w:t xml:space="preserve">• </w:t>
+      </w:r>
+      <w:r>
+        <w:rPr>
+          <w:rFonts w:ascii="맑은 고딕" w:hAnsi="맑은 고딕" w:eastAsia="맑은 고딕"/>
+          <w:b/>
+          <w:color w:val="334155"/>
+          <w:sz w:val="20"/>
+        </w:rPr>
+        <w:t>순서도(Flowchart) 및 가재코드(의사코드, Pseudocode) AI 사전 도출</w:t>
+      </w:r>
+      <w:r>
+        <w:rPr>
+          <w:rFonts w:ascii="맑은 고딕" w:hAnsi="맑은 고딕" w:eastAsia="맑은 고딕"/>
+          <w:color w:val="334155"/>
+          <w:sz w:val="20"/>
+        </w:rPr>
+        <w:t>:</w:t>
+      </w:r>
+    </w:p>
+    <w:p>
+      <w:pPr>
+        <w:spacing w:before="30" w:after="30"/>
+        <w:ind w:left="720"/>
+      </w:pPr>
+      <w:r>
+        <w:rPr>
+          <w:rFonts w:ascii="맑은 고딕" w:hAnsi="맑은 고딕"/>
+          <w:b/>
+          <w:color w:val="6366F1"/>
+          <w:sz w:val="20"/>
+        </w:rPr>
+        <w:t xml:space="preserve">⁃ </w:t>
+      </w:r>
+      <w:r>
+        <w:rPr>
+          <w:rFonts w:ascii="맑은 고딕" w:hAnsi="맑은 고딕" w:eastAsia="맑은 고딕"/>
+          <w:color w:val="334155"/>
+          <w:sz w:val="20"/>
+        </w:rPr>
+        <w:t xml:space="preserve">본격적인 코딩에 들어가기 전, 앱이 어떤 논리 구조로 동작해야 하는지 명확히 하기 위해 </w:t>
+      </w:r>
+      <w:r>
+        <w:rPr>
+          <w:rFonts w:ascii="맑은 고딕" w:hAnsi="맑은 고딕" w:eastAsia="맑은 고딕"/>
+          <w:b/>
+          <w:color w:val="334155"/>
+          <w:sz w:val="20"/>
+        </w:rPr>
+        <w:t>AI를 활용하여 순서도와 가재코드(의사코드)를 먼저 작성</w:t>
+      </w:r>
+      <w:r>
+        <w:rPr>
+          <w:rFonts w:ascii="맑은 고딕" w:hAnsi="맑은 고딕" w:eastAsia="맑은 고딕"/>
+          <w:color w:val="334155"/>
+          <w:sz w:val="20"/>
+        </w:rPr>
+        <w:t>함.</w:t>
+      </w:r>
+    </w:p>
+    <w:p>
+      <w:pPr>
+        <w:spacing w:before="30" w:after="30"/>
+        <w:ind w:left="720"/>
+      </w:pPr>
+      <w:r>
+        <w:rPr>
+          <w:rFonts w:ascii="맑은 고딕" w:hAnsi="맑은 고딕"/>
+          <w:b/>
+          <w:color w:val="6366F1"/>
+          <w:sz w:val="20"/>
+        </w:rPr>
+        <w:t xml:space="preserve">⁃ </w:t>
+      </w:r>
+      <w:r>
+        <w:rPr>
+          <w:rFonts w:ascii="맑은 고딕" w:hAnsi="맑은 고딕" w:eastAsia="맑은 고딕"/>
+          <w:color w:val="334155"/>
+          <w:sz w:val="20"/>
+        </w:rPr>
+        <w:t>복약 완료 체크 시 타임스탬프 기록 로직, 복용 시간 변경 및 건너뛰기 예외 처리, 1~3일 미접속 시 알림 분기 조건 등을 일반 언어에 가까운 가재코드로 정리함으로써 비전공 팀원들도 전체 비즈니스 로직을 한눈에 파악하고 결함을 사전에 방지함.</w:t>
       </w:r>
     </w:p>
     <w:p>
@@ -974,7 +1860,7 @@
           <w:color w:val="334155"/>
           <w:sz w:val="20"/>
         </w:rPr>
-        <w:t xml:space="preserve">피그마 시안과 조원 논의 내역을 종합하여 </w:t>
+        <w:t xml:space="preserve">피그마 시안, 가재코드 및 팀원 논의 내역을 종합하여 </w:t>
       </w:r>
       <w:r>
         <w:rPr>
@@ -1063,7 +1949,7 @@
           <w:color w:val="334155"/>
           <w:sz w:val="20"/>
         </w:rPr>
-        <w:t xml:space="preserve">단순 문서에 머무르지 않고, AI 에이전트가 코드를 짤 때 언제든 꺼내볼 수 있는 </w:t>
+        <w:t xml:space="preserve">단순 문서에 머무르지 않고, AI 에이전트가 코드를 작성할 때 언제든 꺼내볼 수 있는 </w:t>
       </w:r>
       <w:r>
         <w:rPr>
@@ -1361,7 +2247,7 @@
           <w:color w:val="334155"/>
           <w:sz w:val="20"/>
         </w:rPr>
-        <w:t xml:space="preserve">: Figma 디자인과 PRD 명세를 실제 스마트폰에서 터치되고 데이터가 저장되는 </w:t>
+        <w:t xml:space="preserve">: Figma 디자인, 가재코드 및 PRD 명세를 실제 스마트폰에서 터치되고 데이터가 저장되는 </w:t>
       </w:r>
       <w:r>
         <w:rPr>
@@ -1527,7 +2413,7 @@
           <w:color w:val="334155"/>
           <w:sz w:val="20"/>
         </w:rPr>
-        <w:t>조원 김나연, 김영채가 AI와 실시간 페어 프로그래밍을 진행하며 누락된 엣지 케이스를 보완하고 테스트 코드를 실행함.</w:t>
+        <w:t>개발 담당 팀원들이 AI와 실시간 페어 프로그래밍을 진행하며 누락된 엣지 케이스를 보완하고 테스트 코드를 실행함.</w:t>
       </w:r>
     </w:p>
     <w:p>
@@ -2449,263 +3335,7 @@
           <w:color w:val="1E3A8A"/>
           <w:sz w:val="28"/>
         </w:rPr>
-        <w:t>4. 사람이 미처 생각지 못한 숨은 AI 활약 사례 (비하인드)</w:t>
-      </w:r>
-    </w:p>
-    <w:p>
-      <w:pPr>
-        <w:spacing w:before="50" w:after="70" w:line="300" w:lineRule="auto"/>
-      </w:pPr>
-      <w:r>
-        <w:rPr>
-          <w:rFonts w:ascii="맑은 고딕" w:hAnsi="맑은 고딕" w:eastAsia="맑은 고딕"/>
-          <w:color w:val="334155"/>
-          <w:sz w:val="21"/>
-        </w:rPr>
-        <w:t>프로젝트 진행 중 조원들이 인지하지 못했던 기술적 난관들을 AI가 자율적으로 해결한 주요 사례들임:</w:t>
-      </w:r>
-    </w:p>
-    <w:p>
-      <w:pPr>
-        <w:spacing w:before="30" w:after="30"/>
-        <w:ind w:left="360"/>
-      </w:pPr>
-      <w:r>
-        <w:rPr>
-          <w:rFonts w:ascii="맑은 고딕" w:hAnsi="맑은 고딕"/>
-          <w:b/>
-          <w:color w:val="2563EB"/>
-          <w:sz w:val="20"/>
-        </w:rPr>
-        <w:t xml:space="preserve">1. </w:t>
-      </w:r>
-      <w:r>
-        <w:rPr>
-          <w:rFonts w:ascii="맑은 고딕" w:hAnsi="맑은 고딕" w:eastAsia="맑은 고딕"/>
-          <w:b/>
-          <w:color w:val="334155"/>
-          <w:sz w:val="20"/>
-        </w:rPr>
-        <w:t>런타임 크래시 자율 복구 (Self-Healing)</w:t>
-      </w:r>
-      <w:r>
-        <w:rPr>
-          <w:rFonts w:ascii="맑은 고딕" w:hAnsi="맑은 고딕" w:eastAsia="맑은 고딕"/>
-          <w:color w:val="334155"/>
-          <w:sz w:val="20"/>
-        </w:rPr>
-        <w:t>:</w:t>
-      </w:r>
-    </w:p>
-    <w:p>
-      <w:pPr>
-        <w:spacing w:before="30" w:after="30"/>
-        <w:ind w:left="720"/>
-      </w:pPr>
-      <w:r>
-        <w:rPr>
-          <w:rFonts w:ascii="맑은 고딕" w:hAnsi="맑은 고딕"/>
-          <w:b/>
-          <w:color w:val="6366F1"/>
-          <w:sz w:val="20"/>
-        </w:rPr>
-        <w:t xml:space="preserve">⁃ </w:t>
-      </w:r>
-      <w:r>
-        <w:rPr>
-          <w:rFonts w:ascii="맑은 고딕" w:hAnsi="맑은 고딕" w:eastAsia="맑은 고딕"/>
-          <w:color w:val="334155"/>
-          <w:sz w:val="20"/>
-        </w:rPr>
-        <w:t xml:space="preserve">피그마 스크립트 실행 중 </w:t>
-      </w:r>
-      <w:r>
-        <w:rPr>
-          <w:rFonts w:ascii="Consolas" w:hAnsi="Consolas" w:eastAsia="맑은 고딕"/>
-          <w:color w:val="B42846"/>
-          <w:sz w:val="19"/>
-        </w:rPr>
-        <w:t>TypeError: cannot read property 'includes' of undefined</w:t>
-      </w:r>
-      <w:r>
-        <w:rPr>
-          <w:rFonts w:ascii="맑은 고딕" w:hAnsi="맑은 고딕" w:eastAsia="맑은 고딕"/>
-          <w:color w:val="334155"/>
-          <w:sz w:val="20"/>
-        </w:rPr>
-        <w:t xml:space="preserve"> 에러로 캔버스 작업이 중단되는 문제가 발생함.</w:t>
-      </w:r>
-    </w:p>
-    <w:p>
-      <w:pPr>
-        <w:spacing w:before="30" w:after="30"/>
-        <w:ind w:left="720"/>
-      </w:pPr>
-      <w:r>
-        <w:rPr>
-          <w:rFonts w:ascii="맑은 고딕" w:hAnsi="맑은 고딕"/>
-          <w:b/>
-          <w:color w:val="6366F1"/>
-          <w:sz w:val="20"/>
-        </w:rPr>
-        <w:t xml:space="preserve">⁃ </w:t>
-      </w:r>
-      <w:r>
-        <w:rPr>
-          <w:rFonts w:ascii="맑은 고딕" w:hAnsi="맑은 고딕" w:eastAsia="맑은 고딕"/>
-          <w:color w:val="334155"/>
-          <w:sz w:val="20"/>
-        </w:rPr>
-        <w:t xml:space="preserve">AI가 스크립트 내 2,100줄을 실시간 전수 감사하여, 비-텍스트 노드 순회 시 발생하는 예외임을 스스로 밝혀내고 242개 호출부를 </w:t>
-      </w:r>
-      <w:r>
-        <w:rPr>
-          <w:rFonts w:ascii="Consolas" w:hAnsi="Consolas" w:eastAsia="맑은 고딕"/>
-          <w:color w:val="B42846"/>
-          <w:sz w:val="19"/>
-        </w:rPr>
-        <w:t>strIncludes</w:t>
-      </w:r>
-      <w:r>
-        <w:rPr>
-          <w:rFonts w:ascii="맑은 고딕" w:hAnsi="맑은 고딕" w:eastAsia="맑은 고딕"/>
-          <w:color w:val="334155"/>
-          <w:sz w:val="20"/>
-        </w:rPr>
-        <w:t>라는 안전 방어 함수로 일괄 교체해 0 Error로 자동 복구함.</w:t>
-      </w:r>
-    </w:p>
-    <w:p>
-      <w:pPr>
-        <w:spacing w:before="30" w:after="30"/>
-        <w:ind w:left="360"/>
-      </w:pPr>
-      <w:r>
-        <w:rPr>
-          <w:rFonts w:ascii="맑은 고딕" w:hAnsi="맑은 고딕"/>
-          <w:b/>
-          <w:color w:val="2563EB"/>
-          <w:sz w:val="20"/>
-        </w:rPr>
-        <w:t xml:space="preserve">2. </w:t>
-      </w:r>
-      <w:r>
-        <w:rPr>
-          <w:rFonts w:ascii="맑은 고딕" w:hAnsi="맑은 고딕" w:eastAsia="맑은 고딕"/>
-          <w:b/>
-          <w:color w:val="334155"/>
-          <w:sz w:val="20"/>
-        </w:rPr>
-        <w:t>손그림 일러스트 바이너리 자동 결합</w:t>
-      </w:r>
-      <w:r>
-        <w:rPr>
-          <w:rFonts w:ascii="맑은 고딕" w:hAnsi="맑은 고딕" w:eastAsia="맑은 고딕"/>
-          <w:color w:val="334155"/>
-          <w:sz w:val="20"/>
-        </w:rPr>
-        <w:t>:</w:t>
-      </w:r>
-    </w:p>
-    <w:p>
-      <w:pPr>
-        <w:spacing w:before="30" w:after="30"/>
-        <w:ind w:left="720"/>
-      </w:pPr>
-      <w:r>
-        <w:rPr>
-          <w:rFonts w:ascii="맑은 고딕" w:hAnsi="맑은 고딕"/>
-          <w:b/>
-          <w:color w:val="6366F1"/>
-          <w:sz w:val="20"/>
-        </w:rPr>
-        <w:t xml:space="preserve">⁃ </w:t>
-      </w:r>
-      <w:r>
-        <w:rPr>
-          <w:rFonts w:ascii="맑은 고딕" w:hAnsi="맑은 고딕" w:eastAsia="맑은 고딕"/>
-          <w:color w:val="334155"/>
-          <w:sz w:val="20"/>
-        </w:rPr>
-        <w:t>조원이 종이에 연필로 그린 하곰이 캐릭터 사진을 Base64 바이너리 코드로 자동 변환하여, 외부 서버 의존 없이 피그마 플러그인 스크립트 내부와 Word 문서에 영구 결합함.</w:t>
-      </w:r>
-    </w:p>
-    <w:p>
-      <w:pPr>
-        <w:spacing w:before="30" w:after="30"/>
-        <w:ind w:left="360"/>
-      </w:pPr>
-      <w:r>
-        <w:rPr>
-          <w:rFonts w:ascii="맑은 고딕" w:hAnsi="맑은 고딕"/>
-          <w:b/>
-          <w:color w:val="2563EB"/>
-          <w:sz w:val="20"/>
-        </w:rPr>
-        <w:t xml:space="preserve">3. </w:t>
-      </w:r>
-      <w:r>
-        <w:rPr>
-          <w:rFonts w:ascii="맑은 고딕" w:hAnsi="맑은 고딕" w:eastAsia="맑은 고딕"/>
-          <w:b/>
-          <w:color w:val="334155"/>
-          <w:sz w:val="20"/>
-        </w:rPr>
-        <w:t>전문 Word 보고서(`.docx`) 원클릭 자동 렌더링</w:t>
-      </w:r>
-      <w:r>
-        <w:rPr>
-          <w:rFonts w:ascii="맑은 고딕" w:hAnsi="맑은 고딕" w:eastAsia="맑은 고딕"/>
-          <w:color w:val="334155"/>
-          <w:sz w:val="20"/>
-        </w:rPr>
-        <w:t>:</w:t>
-      </w:r>
-    </w:p>
-    <w:p>
-      <w:pPr>
-        <w:spacing w:before="30" w:after="30"/>
-        <w:ind w:left="720"/>
-      </w:pPr>
-      <w:r>
-        <w:rPr>
-          <w:rFonts w:ascii="맑은 고딕" w:hAnsi="맑은 고딕"/>
-          <w:b/>
-          <w:color w:val="6366F1"/>
-          <w:sz w:val="20"/>
-        </w:rPr>
-        <w:t xml:space="preserve">⁃ </w:t>
-      </w:r>
-      <w:r>
-        <w:rPr>
-          <w:rFonts w:ascii="맑은 고딕" w:hAnsi="맑은 고딕" w:eastAsia="맑은 고딕"/>
-          <w:color w:val="334155"/>
-          <w:sz w:val="20"/>
-        </w:rPr>
-        <w:t>마크다운 문서를 줄바꿈·표 서식·손그림 사진까지 완벽히 갖춘 공식 워드 문서로 자동 변환하는 파이썬 스크립트를 직접 작성·실행하여 문서화 시간을 90% 이상 단축함.</w:t>
-      </w:r>
-    </w:p>
-    <w:p>
-      <w:pPr>
-        <w:spacing w:before="160" w:after="160"/>
-        <w:pBdr>
-          <w:bottom w:val="single" w:sz="6" w:space="1" w:color="E2E8F0"/>
-        </w:pBdr>
-      </w:pPr>
-    </w:p>
-    <w:p>
-      <w:pPr>
-        <w:keepNext/>
-        <w:spacing w:before="280" w:after="120"/>
-      </w:pPr>
-      <w:r>
-        <w:rPr>
-          <w:rFonts w:ascii="맑은 고딕" w:hAnsi="맑은 고딕" w:eastAsia="맑은 고딕"/>
-          <w:b/>
-          <w:color w:val="1E3A8A"/>
-          <w:sz w:val="28"/>
-        </w:rPr>
-        <w:t>5. 공학적 관점의 효율화 제언 (발표 시 가산점 포인트)</w:t>
+        <w:t>4. 공학적 관점의 효율화 제언 (발표 가산점 포인트)</w:t>
       </w:r>
     </w:p>
     <w:p>

</xml_diff>

<commit_message>
docs: apply humanizer to AI development process report and update all docx exports
</commit_message>
<xml_diff>
--- a/AI_활용_개발_프로세스_보고서.docx
+++ b/AI_활용_개발_프로세스_보고서.docx
@@ -14,89 +14,21 @@
           <w:color w:val="0F172A"/>
           <w:sz w:val="36"/>
         </w:rPr>
-        <w:t>🤖 [보건약학프로젝트] AI 협업 헬스케어 앱 개발 프로세스 보고서</w:t>
+        <w:t>보건약학 헬스케어 앱 개발: AI 협업 프로세스 보고서</w:t>
       </w:r>
     </w:p>
-    <w:tbl>
-      <w:tblPr>
-        <w:tblW w:type="auto" w:w="0"/>
-        <w:jc w:val="center"/>
-        <w:tblLayout w:type="fixed"/>
-        <w:tblLook w:firstColumn="1" w:firstRow="1" w:lastColumn="0" w:lastRow="0" w:noHBand="0" w:noVBand="1" w:val="04A0"/>
-        <w:tblBorders>
-          <w:top w:val="none"/>
-          <w:bottom w:val="none"/>
-          <w:left w:val="single" w:sz="24" w:space="0" w:color="3B82F6"/>
-          <w:right w:val="none"/>
-          <w:insideH w:val="none"/>
-          <w:insideV w:val="none"/>
-        </w:tblBorders>
-      </w:tblPr>
-      <w:tblGrid>
-        <w:gridCol w:w="9360"/>
-      </w:tblGrid>
-      <w:tr>
-        <w:tc>
-          <w:tcPr>
-            <w:tcW w:type="dxa" w:w="9360"/>
-            <w:shd w:fill="EFF6FF"/>
-            <w:tcMar>
-              <w:top w:w="140" w:type="dxa"/>
-              <w:bottom w:w="140" w:type="dxa"/>
-              <w:left w:w="200" w:type="dxa"/>
-              <w:right w:w="140" w:type="dxa"/>
-            </w:tcMar>
-          </w:tcPr>
-          <w:p>
-            <w:pPr>
-              <w:spacing w:before="60" w:after="60"/>
-            </w:pPr>
-            <w:r>
-              <w:rPr>
-                <w:rFonts w:ascii="맑은 고딕" w:hAnsi="맑은 고딕" w:eastAsia="맑은 고딕"/>
-                <w:b/>
-                <w:i/>
-                <w:color w:val="1E3A8A"/>
-                <w:sz w:val="20"/>
-              </w:rPr>
-              <w:t>문서 개요</w:t>
-            </w:r>
-            <w:r>
-              <w:rPr>
-                <w:rFonts w:ascii="맑은 고딕" w:hAnsi="맑은 고딕" w:eastAsia="맑은 고딕"/>
-                <w:i/>
-                <w:color w:val="1E3A8A"/>
-                <w:sz w:val="20"/>
-              </w:rPr>
-              <w:t xml:space="preserve">: 본 문서는 프로그래밍 및 AI에 대한 사전 배경지식이 없는 청중(약학대학 교수님, 학우, 비전공자)도 직관적으로 이해할 수 있도록, 기획 아이디어 발굴부터 피그마(Figma) 디자인, 순서도 및 가재코드(의사코드) 설계, AI 기반 아키텍처 수립, 실제 코드 전환 및 스토어 출시에 이르는 </w:t>
-            </w:r>
-            <w:r>
-              <w:rPr>
-                <w:rFonts w:ascii="맑은 고딕" w:hAnsi="맑은 고딕" w:eastAsia="맑은 고딕"/>
-                <w:b/>
-                <w:i/>
-                <w:color w:val="1E3A8A"/>
-                <w:sz w:val="20"/>
-              </w:rPr>
-              <w:t>전 과정의 AI 협업 개발 파이프라인(AI Pair-Programming Pipeline)</w:t>
-            </w:r>
-            <w:r>
-              <w:rPr>
-                <w:rFonts w:ascii="맑은 고딕" w:hAnsi="맑은 고딕" w:eastAsia="맑은 고딕"/>
-                <w:i/>
-                <w:color w:val="1E3A8A"/>
-                <w:sz w:val="20"/>
-              </w:rPr>
-              <w:t>을 체계적으로 정리한 발표·보고용 가이드임.</w:t>
-            </w:r>
-          </w:p>
-        </w:tc>
-      </w:tr>
-    </w:tbl>
     <w:p>
       <w:pPr>
-        <w:spacing w:before="0" w:after="60"/>
+        <w:spacing w:before="50" w:after="70" w:line="300" w:lineRule="auto"/>
       </w:pPr>
+      <w:r>
+        <w:rPr>
+          <w:rFonts w:ascii="맑은 고딕" w:hAnsi="맑은 고딕" w:eastAsia="맑은 고딕"/>
+          <w:color w:val="334155"/>
+          <w:sz w:val="21"/>
+        </w:rPr>
+        <w:t>약학 전공 학부생 팀이 기획 아이디어 발굴부터 피그마(Figma) 화면 디자인, 순서도 및 로직 설계, 가재코드(gjc) 하네스 적용, Flutter 코드 변환 및 구글 플레이스토어 출시 계획까지 진행하며 AI를 활용한 실무 협업 프로세스를 정리한 보고서임. 비전공자 및 청중이 쉽게 이해할 수 있도록 실제 협업 흐름과 도구별 역할을 중심으로 기술함.</w:t>
+      </w:r>
     </w:p>
     <w:p>
       <w:pPr>
@@ -118,7 +50,7 @@
           <w:color w:val="1E3A8A"/>
           <w:sz w:val="28"/>
         </w:rPr>
-        <w:t>1. 개요: 약대생 팀이 AI를 협업 파트너로 선택한 이유</w:t>
+        <w:t>1. 약대생 팀이 AI를 협업 파트너로 선택한 배경</w:t>
       </w:r>
     </w:p>
     <w:p>
@@ -131,41 +63,7 @@
           <w:color w:val="334155"/>
           <w:sz w:val="21"/>
         </w:rPr>
-        <w:t xml:space="preserve">모바일 헬스케어 서비스는 </w:t>
-      </w:r>
-      <w:r>
-        <w:rPr>
-          <w:rFonts w:ascii="맑은 고딕" w:hAnsi="맑은 고딕" w:eastAsia="맑은 고딕"/>
-          <w:b/>
-          <w:color w:val="334155"/>
-          <w:sz w:val="21"/>
-        </w:rPr>
-        <w:t>[보건약학적 전문 지식(약효 지속 시간, 치료역, 환자 복약 심리)]</w:t>
-      </w:r>
-      <w:r>
-        <w:rPr>
-          <w:rFonts w:ascii="맑은 고딕" w:hAnsi="맑은 고딕" w:eastAsia="맑은 고딕"/>
-          <w:color w:val="334155"/>
-          <w:sz w:val="21"/>
-        </w:rPr>
-        <w:t xml:space="preserve">과 </w:t>
-      </w:r>
-      <w:r>
-        <w:rPr>
-          <w:rFonts w:ascii="맑은 고딕" w:hAnsi="맑은 고딕" w:eastAsia="맑은 고딕"/>
-          <w:b/>
-          <w:color w:val="334155"/>
-          <w:sz w:val="21"/>
-        </w:rPr>
-        <w:t>[고난도 소프트웨어 공학(모바일 UI/UX, 클라우드 동기화, 상태 관리, 스토어 배포)]</w:t>
-      </w:r>
-      <w:r>
-        <w:rPr>
-          <w:rFonts w:ascii="맑은 고딕" w:hAnsi="맑은 고딕" w:eastAsia="맑은 고딕"/>
-          <w:color w:val="334155"/>
-          <w:sz w:val="21"/>
-        </w:rPr>
-        <w:t>이 동시에 요구되는 융합 프로젝트임.</w:t>
+        <w:t>복약 관리 모바일 앱을 개발하기 위해서는 약효 반감기, 치료역, 환자 복약 순응 심리와 같은 보건약학 지식과 함께, 모바일 UI/UX 디자인, 상태 관리, 모바일 앱 프로그래밍 지식이 동시에 요구됨.</w:t>
       </w:r>
     </w:p>
     <w:p>
@@ -178,24 +76,7 @@
           <w:color w:val="334155"/>
           <w:sz w:val="21"/>
         </w:rPr>
-        <w:t xml:space="preserve">약학 전공 학부생 팀으로서 코딩 지식의 한계를 극복하고 완성도 높은 실제 동작 앱을 제작하기 위해, AI를 단순한 질의응답기가 아닌 </w:t>
-      </w:r>
-      <w:r>
-        <w:rPr>
-          <w:rFonts w:ascii="맑은 고딕" w:hAnsi="맑은 고딕" w:eastAsia="맑은 고딕"/>
-          <w:b/>
-          <w:color w:val="334155"/>
-          <w:sz w:val="21"/>
-        </w:rPr>
-        <w:t>기획자, UI 디자이너, 소프트웨어 엔지니어 역할을 분담하는 '가상 팀원(AI Pair Programmer)'</w:t>
-      </w:r>
-      <w:r>
-        <w:rPr>
-          <w:rFonts w:ascii="맑은 고딕" w:hAnsi="맑은 고딕" w:eastAsia="맑은 고딕"/>
-          <w:color w:val="334155"/>
-          <w:sz w:val="21"/>
-        </w:rPr>
-        <w:t>으로 프로세스 전반에 투입함.</w:t>
+        <w:t>팀원 전원이 약학 전공자로 구성되어 프로그래밍 지식이 부족한 상황에서, 단순히 코드를 대신 짜주는 질의응답 도구로 쓰는 데 그치지 않고 개발 단계마다 역할을 분담하는 협업 파트너로 AI를 투입함. 아이디어 타당성 검토부터 화면 와이어프레임 설계, 로직 순서도 검증, 코딩 규칙 관리에 이르기까지 전 과정에 AI 도구를 연계하여 프로젝트를 진행함.</w:t>
       </w:r>
     </w:p>
     <w:p>
@@ -218,7 +99,7 @@
           <w:color w:val="2563EB"/>
           <w:sz w:val="24"/>
         </w:rPr>
-        <w:t>📋 5단계 AI 협업 파이프라인 한눈에 보기</w:t>
+        <w:t>개발 파이프라인 단계 요약</w:t>
       </w:r>
     </w:p>
     <w:tbl>
@@ -261,7 +142,7 @@
                 <w:color w:val="1E293B"/>
                 <w:sz w:val="18"/>
               </w:rPr>
-              <w:t>[1단계: 아이디어 &amp; 타당성] ➔ [2단계: Figma 디자인 자동화] ➔ [3단계: 가재코드·기획 &amp; 스킬] ➔ [4단계: Flutter 코드 전환] ➔ [5단계: 플레이스토어 배포]</w:t>
+              <w:t>[1단계: 아이디어 검증] ➔ [2단계: 디자인 자동화] ➔ [3단계: 순서도·하네스·스킬 표준화] ➔ [4단계: 코드 변환] ➔ [5단계: 스토어 출시]</w:t>
             </w:r>
           </w:p>
         </w:tc>
@@ -369,7 +250,7 @@
                 <w:color w:val="4338CA"/>
                 <w:sz w:val="20"/>
               </w:rPr>
-              <w:t>핵심 협업 활동</w:t>
+              <w:t>팀 주요 활동</w:t>
             </w:r>
           </w:p>
         </w:tc>
@@ -395,7 +276,7 @@
                 <w:color w:val="4338CA"/>
                 <w:sz w:val="20"/>
               </w:rPr>
-              <w:t>투입된 AI 및 도구</w:t>
+              <w:t>투입 도구</w:t>
             </w:r>
           </w:p>
         </w:tc>
@@ -473,7 +354,7 @@
                 <w:color w:val="334155"/>
                 <w:sz w:val="19"/>
               </w:rPr>
-              <w:t>아이디어 도출 &amp; 타당성 검증</w:t>
+              <w:t>아이디어 도출 및 검증</w:t>
             </w:r>
           </w:p>
         </w:tc>
@@ -521,7 +402,7 @@
                 <w:color w:val="334155"/>
                 <w:sz w:val="19"/>
               </w:rPr>
-              <w:t>AI 대화 모델 (사운딩 보드)</w:t>
+              <w:t>AI 대화 모델</w:t>
             </w:r>
           </w:p>
         </w:tc>
@@ -599,7 +480,7 @@
                 <w:color w:val="334155"/>
                 <w:sz w:val="19"/>
               </w:rPr>
-              <w:t>화면 설계 &amp; 디자인 자동화</w:t>
+              <w:t>화면 설계 및 디자인</w:t>
             </w:r>
           </w:p>
         </w:tc>
@@ -624,7 +505,7 @@
                 <w:color w:val="334155"/>
                 <w:sz w:val="19"/>
               </w:rPr>
-              <w:t>초기 와이어프레임 생성, A/B 시안 추천, Figma MCP 캔버스 제어</w:t>
+              <w:t>초기 와이어프레임 생성, 시안 비교 선택, 피그마 제어</w:t>
             </w:r>
           </w:p>
         </w:tc>
@@ -726,7 +607,7 @@
                 <w:color w:val="334155"/>
                 <w:sz w:val="19"/>
               </w:rPr>
-              <w:t>순서도·가재코드 &amp; 스킬 표준화</w:t>
+              <w:t>순서도·하네스 및 규칙 표준화</w:t>
             </w:r>
           </w:p>
         </w:tc>
@@ -750,7 +631,7 @@
                 <w:color w:val="334155"/>
                 <w:sz w:val="19"/>
               </w:rPr>
-              <w:t>로직 순서도 및 가재코드(의사코드) 도출, PRD 수립, AI 코딩 스킬 장착</w:t>
+              <w:t>기능 순서도와 의사코드 작성, 가재코드(gjc) 하네스 적용, 스킬 수집</w:t>
             </w:r>
           </w:p>
         </w:tc>
@@ -774,7 +655,7 @@
                 <w:color w:val="334155"/>
                 <w:sz w:val="19"/>
               </w:rPr>
-              <w:t>AI 의사코드 생성기, GitHub Skills, Antigravity</w:t>
+              <w:t>의사코드 생성기, 가재코드, GitHub Skills</w:t>
             </w:r>
           </w:p>
         </w:tc>
@@ -798,7 +679,7 @@
                 <w:color w:val="334155"/>
                 <w:sz w:val="19"/>
               </w:rPr>
-              <w:t xml:space="preserve">순서도, 가재코드, PRD 명세서, </w:t>
+              <w:t xml:space="preserve">순서도, 의사코드, PRD 명세서, </w:t>
             </w:r>
             <w:r>
               <w:rPr>
@@ -860,7 +741,7 @@
                 <w:color w:val="334155"/>
                 <w:sz w:val="19"/>
               </w:rPr>
-              <w:t>프로덕션 코드 전환</w:t>
+              <w:t>모바일 앱 코드 전환</w:t>
             </w:r>
           </w:p>
         </w:tc>
@@ -885,7 +766,7 @@
                 <w:color w:val="334155"/>
                 <w:sz w:val="19"/>
               </w:rPr>
-              <w:t>피그마 ➔ Flutter 1:1 변환, 클린 아키텍처(MVVM), 로컬 DB 연동</w:t>
+              <w:t>디자인을 Flutter 위젯으로 변환, 클린 아키텍처 및 로컬 DB 연동</w:t>
             </w:r>
           </w:p>
         </w:tc>
@@ -935,7 +816,7 @@
                 <w:color w:val="334155"/>
                 <w:sz w:val="19"/>
               </w:rPr>
-              <w:t>실제 구동 모바일 앱 코드</w:t>
+              <w:t>Flutter 모바일 앱 코드</w:t>
             </w:r>
           </w:p>
         </w:tc>
@@ -987,7 +868,7 @@
                 <w:color w:val="334155"/>
                 <w:sz w:val="19"/>
               </w:rPr>
-              <w:t>스토어 배포 &amp; 상용화</w:t>
+              <w:t>앱 빌드 및 스토어 출시</w:t>
             </w:r>
           </w:p>
         </w:tc>
@@ -1011,7 +892,7 @@
                 <w:color w:val="334155"/>
                 <w:sz w:val="19"/>
               </w:rPr>
-              <w:t>릴리스 빌드, 개인정보 처리방침 자동화, 구글 플레이스토어 심사</w:t>
+              <w:t>패키징, 개인정보 처리방침 작성, 구글 플레이스토어 심사 제출</w:t>
             </w:r>
           </w:p>
         </w:tc>
@@ -1035,7 +916,7 @@
                 <w:color w:val="334155"/>
                 <w:sz w:val="19"/>
               </w:rPr>
-              <w:t>Google Play Console, 스토어 등록 AI 지원</w:t>
+              <w:t>Google Play Console, AI 스토어 작성 보조</w:t>
             </w:r>
           </w:p>
         </w:tc>
@@ -1059,7 +940,7 @@
                 <w:color w:val="334155"/>
                 <w:sz w:val="19"/>
               </w:rPr>
-              <w:t>구글 플레이스토어 정식 출시 앱</w:t>
+              <w:t>구글 플레이스토어 출시 앱</w:t>
             </w:r>
           </w:p>
         </w:tc>
@@ -1090,7 +971,7 @@
           <w:color w:val="1E3A8A"/>
           <w:sz w:val="28"/>
         </w:rPr>
-        <w:t>2. 단계별 AI 협업 상세 프로세스</w:t>
+        <w:t>2. 단계별 세부 협업 과정</w:t>
       </w:r>
     </w:p>
     <w:p>
@@ -1105,7 +986,7 @@
           <w:color w:val="2563EB"/>
           <w:sz w:val="24"/>
         </w:rPr>
-        <w:t>[1단계] 아이디어 도출 및 기술적 타당성 검증 (Ideation &amp; Feasibility)</w:t>
+        <w:t>1단계: 아이디어 도출 및 기술적 타당성 검증</w:t>
       </w:r>
     </w:p>
     <w:p>
@@ -1129,7 +1010,7 @@
           <w:color w:val="334155"/>
           <w:sz w:val="20"/>
         </w:rPr>
-        <w:t>진행 방식</w:t>
+        <w:t>자유 브레인스토밍 및 실현 가능성 질의</w:t>
       </w:r>
       <w:r>
         <w:rPr>
@@ -1160,7 +1041,7 @@
           <w:color w:val="334155"/>
           <w:sz w:val="20"/>
         </w:rPr>
-        <w:t>팀원들이 모여 자유 브레인스토밍을 진행함 (ADHD/우울증 환자의 복약 타이트레이션, 뇌과학 기반 게이미피케이션, 마스코트 인터랙션 등).</w:t>
+        <w:t>팀원들이 모여 ADHD나 우울증 환자의 복약 패턴, 생활 습관 관리, 마스코트 상호작용에 대한 아이디어를 공유함.</w:t>
       </w:r>
     </w:p>
     <w:p>
@@ -1183,24 +1064,7 @@
           <w:color w:val="334155"/>
           <w:sz w:val="20"/>
         </w:rPr>
-        <w:t xml:space="preserve">도출된 아이디어가 실제로 기술적으로 구현 가능한지, 환자 경험에 부작용은 없는지를 AI에게 자문하는 </w:t>
-      </w:r>
-      <w:r>
-        <w:rPr>
-          <w:rFonts w:ascii="맑은 고딕" w:hAnsi="맑은 고딕" w:eastAsia="맑은 고딕"/>
-          <w:b/>
-          <w:color w:val="334155"/>
-          <w:sz w:val="20"/>
-        </w:rPr>
-        <w:t>사운딩 보드(Sounding Board)</w:t>
-      </w:r>
-      <w:r>
-        <w:rPr>
-          <w:rFonts w:ascii="맑은 고딕" w:hAnsi="맑은 고딕" w:eastAsia="맑은 고딕"/>
-          <w:color w:val="334155"/>
-          <w:sz w:val="20"/>
-        </w:rPr>
-        <w:t xml:space="preserve"> 방식으로 대화하며 현실적인 구현 방향을 좁혀나감.</w:t>
+        <w:t>아이디어가 모바일 환경에서 실제로 구현 가능한지, 환자에게 임상적 부작용은 없는지 AI에게 질문하며 구체적인 개발 범위를 좁힘.</w:t>
       </w:r>
     </w:p>
     <w:p>
@@ -1224,117 +1088,7 @@
           <w:color w:val="334155"/>
           <w:sz w:val="20"/>
         </w:rPr>
-        <w:t>AI의 역할</w:t>
-      </w:r>
-      <w:r>
-        <w:rPr>
-          <w:rFonts w:ascii="맑은 고딕" w:hAnsi="맑은 고딕" w:eastAsia="맑은 고딕"/>
-          <w:color w:val="334155"/>
-          <w:sz w:val="20"/>
-        </w:rPr>
-        <w:t>:</w:t>
-      </w:r>
-    </w:p>
-    <w:p>
-      <w:pPr>
-        <w:spacing w:before="30" w:after="30"/>
-        <w:ind w:left="720"/>
-      </w:pPr>
-      <w:r>
-        <w:rPr>
-          <w:rFonts w:ascii="맑은 고딕" w:hAnsi="맑은 고딕"/>
-          <w:b/>
-          <w:color w:val="6366F1"/>
-          <w:sz w:val="20"/>
-        </w:rPr>
-        <w:t xml:space="preserve">⁃ </w:t>
-      </w:r>
-      <w:r>
-        <w:rPr>
-          <w:rFonts w:ascii="맑은 고딕" w:hAnsi="맑은 고딕" w:eastAsia="맑은 고딕"/>
-          <w:i/>
-          <w:color w:val="334155"/>
-          <w:sz w:val="20"/>
-        </w:rPr>
-        <w:t>"ADHD 환자에게 실패 시 벌칙을 주는 게이미피케이션이 효과적인가?"</w:t>
-      </w:r>
-      <w:r>
-        <w:rPr>
-          <w:rFonts w:ascii="맑은 고딕" w:hAnsi="맑은 고딕" w:eastAsia="맑은 고딕"/>
-          <w:color w:val="334155"/>
-          <w:sz w:val="20"/>
-        </w:rPr>
-        <w:t xml:space="preserve"> ➔ AI 분석 결과: 실패 강박과 자책감을 심화시켜 앱 이탈(Churn)을 부르므로 '비처벌적 누적 보상 UX'가 학술적으로 적합함을 확인.</w:t>
-      </w:r>
-    </w:p>
-    <w:p>
-      <w:pPr>
-        <w:spacing w:before="30" w:after="30"/>
-        <w:ind w:left="720"/>
-      </w:pPr>
-      <w:r>
-        <w:rPr>
-          <w:rFonts w:ascii="맑은 고딕" w:hAnsi="맑은 고딕"/>
-          <w:b/>
-          <w:color w:val="6366F1"/>
-          <w:sz w:val="20"/>
-        </w:rPr>
-        <w:t xml:space="preserve">⁃ </w:t>
-      </w:r>
-      <w:r>
-        <w:rPr>
-          <w:rFonts w:ascii="맑은 고딕" w:hAnsi="맑은 고딕" w:eastAsia="맑은 고딕"/>
-          <w:color w:val="334155"/>
-          <w:sz w:val="20"/>
-        </w:rPr>
-        <w:t>지나간 과거 날짜의 수정 허용 여부에 대해 '당일 완결형 루틴 원칙'과 'XP 소모형 연속 보호권' 아이디어를 정립함.</w:t>
-      </w:r>
-    </w:p>
-    <w:p>
-      <w:pPr>
-        <w:spacing w:before="160" w:after="160"/>
-        <w:pBdr>
-          <w:bottom w:val="single" w:sz="6" w:space="1" w:color="E2E8F0"/>
-        </w:pBdr>
-      </w:pPr>
-    </w:p>
-    <w:p>
-      <w:pPr>
-        <w:keepNext/>
-        <w:spacing w:before="220" w:after="80"/>
-      </w:pPr>
-      <w:r>
-        <w:rPr>
-          <w:rFonts w:ascii="맑은 고딕" w:hAnsi="맑은 고딕" w:eastAsia="맑은 고딕"/>
-          <w:b/>
-          <w:color w:val="2563EB"/>
-          <w:sz w:val="24"/>
-        </w:rPr>
-        <w:t>[2단계] UI/UX 화면 설계 및 Figma AI 자동화 (Design Automation)</w:t>
-      </w:r>
-    </w:p>
-    <w:p>
-      <w:pPr>
-        <w:spacing w:before="30" w:after="30"/>
-        <w:ind w:left="360"/>
-      </w:pPr>
-      <w:r>
-        <w:rPr>
-          <w:rFonts w:ascii="맑은 고딕" w:hAnsi="맑은 고딕"/>
-          <w:b/>
-          <w:color w:val="6366F1"/>
-          <w:sz w:val="20"/>
-        </w:rPr>
-        <w:t xml:space="preserve">• </w:t>
-      </w:r>
-      <w:r>
-        <w:rPr>
-          <w:rFonts w:ascii="맑은 고딕" w:hAnsi="맑은 고딕" w:eastAsia="맑은 고딕"/>
-          <w:b/>
-          <w:color w:val="334155"/>
-          <w:sz w:val="20"/>
-        </w:rPr>
-        <w:t>Figma 내장 AI 활용</w:t>
+        <w:t>비처벌적 UX(Non-punitive UX) 방향 확립</w:t>
       </w:r>
       <w:r>
         <w:rPr>
@@ -1365,7 +1119,30 @@
           <w:color w:val="334155"/>
           <w:sz w:val="20"/>
         </w:rPr>
-        <w:t>초기 기획안을 바탕으로 Figma AI 프롬프트를 통해 주요 화면(복약, 습관, 달력, 마스코트)의 초기 와이어프레임 골격을 신속히 생성함.</w:t>
+        <w:t>복약을 놓친 사용자에게 페널티를 부여하는 기존 방식의 효과를 검토함.</w:t>
+      </w:r>
+    </w:p>
+    <w:p>
+      <w:pPr>
+        <w:spacing w:before="30" w:after="30"/>
+        <w:ind w:left="720"/>
+      </w:pPr>
+      <w:r>
+        <w:rPr>
+          <w:rFonts w:ascii="맑은 고딕" w:hAnsi="맑은 고딕"/>
+          <w:b/>
+          <w:color w:val="6366F1"/>
+          <w:sz w:val="20"/>
+        </w:rPr>
+        <w:t xml:space="preserve">⁃ </w:t>
+      </w:r>
+      <w:r>
+        <w:rPr>
+          <w:rFonts w:ascii="맑은 고딕" w:hAnsi="맑은 고딕" w:eastAsia="맑은 고딕"/>
+          <w:color w:val="334155"/>
+          <w:sz w:val="20"/>
+        </w:rPr>
+        <w:t>연속 기록 실패에 따른 경고 알림이나 스트릭(연속 일수) 리셋은 환자에게 죄책감을 주어 앱 이탈을 부른다는 점을 확인하고, 실패를 탓하지 않고 누적 실천 횟수를 칭찬하는 긍정 피드백 방식을 채택함.</w:t>
       </w:r>
     </w:p>
     <w:p>
@@ -1389,103 +1166,7 @@
           <w:color w:val="334155"/>
           <w:sz w:val="20"/>
         </w:rPr>
-        <w:t>사람과 AI의 협업 방식</w:t>
-      </w:r>
-      <w:r>
-        <w:rPr>
-          <w:rFonts w:ascii="맑은 고딕" w:hAnsi="맑은 고딕" w:eastAsia="맑은 고딕"/>
-          <w:color w:val="334155"/>
-          <w:sz w:val="20"/>
-        </w:rPr>
-        <w:t>:</w:t>
-      </w:r>
-    </w:p>
-    <w:p>
-      <w:pPr>
-        <w:spacing w:before="30" w:after="30"/>
-        <w:ind w:left="720"/>
-      </w:pPr>
-      <w:r>
-        <w:rPr>
-          <w:rFonts w:ascii="맑은 고딕" w:hAnsi="맑은 고딕"/>
-          <w:b/>
-          <w:color w:val="6366F1"/>
-          <w:sz w:val="20"/>
-        </w:rPr>
-        <w:t xml:space="preserve">⁃ </w:t>
-      </w:r>
-      <w:r>
-        <w:rPr>
-          <w:rFonts w:ascii="맑은 고딕" w:hAnsi="맑은 고딕" w:eastAsia="맑은 고딕"/>
-          <w:b/>
-          <w:color w:val="334155"/>
-          <w:sz w:val="20"/>
-        </w:rPr>
-        <w:t>직접 지시</w:t>
-      </w:r>
-      <w:r>
-        <w:rPr>
-          <w:rFonts w:ascii="맑은 고딕" w:hAnsi="맑은 고딕" w:eastAsia="맑은 고딕"/>
-          <w:color w:val="334155"/>
-          <w:sz w:val="20"/>
-        </w:rPr>
-        <w:t>: 명확한 방향이 정해진 요소는 구체적인 규격(36×36 dp 원형 아바타, 2×1 위젯)을 AI에게 직접 지시함.</w:t>
-      </w:r>
-    </w:p>
-    <w:p>
-      <w:pPr>
-        <w:spacing w:before="30" w:after="30"/>
-        <w:ind w:left="720"/>
-      </w:pPr>
-      <w:r>
-        <w:rPr>
-          <w:rFonts w:ascii="맑은 고딕" w:hAnsi="맑은 고딕"/>
-          <w:b/>
-          <w:color w:val="6366F1"/>
-          <w:sz w:val="20"/>
-        </w:rPr>
-        <w:t xml:space="preserve">⁃ </w:t>
-      </w:r>
-      <w:r>
-        <w:rPr>
-          <w:rFonts w:ascii="맑은 고딕" w:hAnsi="맑은 고딕" w:eastAsia="맑은 고딕"/>
-          <w:b/>
-          <w:color w:val="334155"/>
-          <w:sz w:val="20"/>
-        </w:rPr>
-        <w:t>시안 추천(A/B 테스트)</w:t>
-      </w:r>
-      <w:r>
-        <w:rPr>
-          <w:rFonts w:ascii="맑은 고딕" w:hAnsi="맑은 고딕" w:eastAsia="맑은 고딕"/>
-          <w:color w:val="334155"/>
-          <w:sz w:val="20"/>
-        </w:rPr>
-        <w:t>: 레이아웃이 고민될 때는 AI에게 5~6가지 대안 시안(1안: 도파민 연속 달성, 2안: 마스코트 응원 등)을 한 번에 추천받은 뒤 팀원 토론을 거쳐 최적의 안을 선별함.</w:t>
-      </w:r>
-    </w:p>
-    <w:p>
-      <w:pPr>
-        <w:spacing w:before="30" w:after="30"/>
-        <w:ind w:left="360"/>
-      </w:pPr>
-      <w:r>
-        <w:rPr>
-          <w:rFonts w:ascii="맑은 고딕" w:hAnsi="맑은 고딕"/>
-          <w:b/>
-          <w:color w:val="6366F1"/>
-          <w:sz w:val="20"/>
-        </w:rPr>
-        <w:t xml:space="preserve">• </w:t>
-      </w:r>
-      <w:r>
-        <w:rPr>
-          <w:rFonts w:ascii="맑은 고딕" w:hAnsi="맑은 고딕" w:eastAsia="맑은 고딕"/>
-          <w:b/>
-          <w:color w:val="334155"/>
-          <w:sz w:val="20"/>
-        </w:rPr>
-        <w:t>한계 극복: Figma MCP(Model Context Protocol) 도입</w:t>
+        <w:t>당일 완결 기록 원칙 수립</w:t>
       </w:r>
       <w:r>
         <w:rPr>
@@ -1516,7 +1197,62 @@
           <w:color w:val="334155"/>
           <w:sz w:val="20"/>
         </w:rPr>
-        <w:t>Figma 자체 AI의 월 사용 한도가 소진되는 문제가 발생함.</w:t>
+        <w:t>과거 날짜의 기록을 임의로 소급 수정하는 방식은 치료 지속성 평가를 왜곡할 수 있으므로, 당일 완결을 기본 원칙으로 두고 예외적인 경우에만 제한적으로 복구하도록 설정함.</w:t>
+      </w:r>
+    </w:p>
+    <w:p>
+      <w:pPr>
+        <w:spacing w:before="160" w:after="160"/>
+        <w:pBdr>
+          <w:bottom w:val="single" w:sz="6" w:space="1" w:color="E2E8F0"/>
+        </w:pBdr>
+      </w:pPr>
+    </w:p>
+    <w:p>
+      <w:pPr>
+        <w:keepNext/>
+        <w:spacing w:before="220" w:after="80"/>
+      </w:pPr>
+      <w:r>
+        <w:rPr>
+          <w:rFonts w:ascii="맑은 고딕" w:hAnsi="맑은 고딕" w:eastAsia="맑은 고딕"/>
+          <w:b/>
+          <w:color w:val="2563EB"/>
+          <w:sz w:val="24"/>
+        </w:rPr>
+        <w:t>2단계: 화면 설계 및 Figma AI 자동화</w:t>
+      </w:r>
+    </w:p>
+    <w:p>
+      <w:pPr>
+        <w:spacing w:before="30" w:after="30"/>
+        <w:ind w:left="360"/>
+      </w:pPr>
+      <w:r>
+        <w:rPr>
+          <w:rFonts w:ascii="맑은 고딕" w:hAnsi="맑은 고딕"/>
+          <w:b/>
+          <w:color w:val="6366F1"/>
+          <w:sz w:val="20"/>
+        </w:rPr>
+        <w:t xml:space="preserve">• </w:t>
+      </w:r>
+      <w:r>
+        <w:rPr>
+          <w:rFonts w:ascii="맑은 고딕" w:hAnsi="맑은 고딕" w:eastAsia="맑은 고딕"/>
+          <w:b/>
+          <w:color w:val="334155"/>
+          <w:sz w:val="20"/>
+        </w:rPr>
+        <w:t>피그마 내장 AI 활용</w:t>
+      </w:r>
+      <w:r>
+        <w:rPr>
+          <w:rFonts w:ascii="맑은 고딕" w:hAnsi="맑은 고딕" w:eastAsia="맑은 고딕"/>
+          <w:color w:val="334155"/>
+          <w:sz w:val="20"/>
+        </w:rPr>
+        <w:t>:</w:t>
       </w:r>
     </w:p>
     <w:p>
@@ -1539,7 +1275,22 @@
           <w:color w:val="334155"/>
           <w:sz w:val="20"/>
         </w:rPr>
-        <w:t xml:space="preserve">해결책으로 </w:t>
+        <w:t>기획안을 바탕으로 Figma의 AI 생성 기능을 활용해 복약 관리, 습관 관리, 달력, 마스코트 화면의 초기 와이어프레임 틀을 제작함.</w:t>
+      </w:r>
+    </w:p>
+    <w:p>
+      <w:pPr>
+        <w:spacing w:before="30" w:after="30"/>
+        <w:ind w:left="360"/>
+      </w:pPr>
+      <w:r>
+        <w:rPr>
+          <w:rFonts w:ascii="맑은 고딕" w:hAnsi="맑은 고딕"/>
+          <w:b/>
+          <w:color w:val="6366F1"/>
+          <w:sz w:val="20"/>
+        </w:rPr>
+        <w:t xml:space="preserve">• </w:t>
       </w:r>
       <w:r>
         <w:rPr>
@@ -1548,7 +1299,7 @@
           <w:color w:val="334155"/>
           <w:sz w:val="20"/>
         </w:rPr>
-        <w:t>Figma MCP</w:t>
+        <w:t>사람과 AI의 역할 분담</w:t>
       </w:r>
       <w:r>
         <w:rPr>
@@ -1556,7 +1307,131 @@
           <w:color w:val="334155"/>
           <w:sz w:val="20"/>
         </w:rPr>
-        <w:t>를 구축하여 외부 AI(Antigravity)와 Figma 캔버스를 직접 연결함.</w:t>
+        <w:t>:</w:t>
+      </w:r>
+    </w:p>
+    <w:p>
+      <w:pPr>
+        <w:spacing w:before="30" w:after="30"/>
+        <w:ind w:left="720"/>
+      </w:pPr>
+      <w:r>
+        <w:rPr>
+          <w:rFonts w:ascii="맑은 고딕" w:hAnsi="맑은 고딕"/>
+          <w:b/>
+          <w:color w:val="6366F1"/>
+          <w:sz w:val="20"/>
+        </w:rPr>
+        <w:t xml:space="preserve">⁃ </w:t>
+      </w:r>
+      <w:r>
+        <w:rPr>
+          <w:rFonts w:ascii="맑은 고딕" w:hAnsi="맑은 고딕" w:eastAsia="맑은 고딕"/>
+          <w:color w:val="334155"/>
+          <w:sz w:val="20"/>
+        </w:rPr>
+        <w:t>헤더 영역의 36×36 dp 원형 마스코트 버튼이나 2×1 위젯 규격처럼 수치가 확정된 요소는 AI에게 직접 지시하여 정확하게 배치함.</w:t>
+      </w:r>
+    </w:p>
+    <w:p>
+      <w:pPr>
+        <w:spacing w:before="30" w:after="30"/>
+        <w:ind w:left="720"/>
+      </w:pPr>
+      <w:r>
+        <w:rPr>
+          <w:rFonts w:ascii="맑은 고딕" w:hAnsi="맑은 고딕"/>
+          <w:b/>
+          <w:color w:val="6366F1"/>
+          <w:sz w:val="20"/>
+        </w:rPr>
+        <w:t xml:space="preserve">⁃ </w:t>
+      </w:r>
+      <w:r>
+        <w:rPr>
+          <w:rFonts w:ascii="맑은 고딕" w:hAnsi="맑은 고딕" w:eastAsia="맑은 고딕"/>
+          <w:color w:val="334155"/>
+          <w:sz w:val="20"/>
+        </w:rPr>
+        <w:t>레이아웃 구성이 모호한 영역은 AI에게 여러 시안을 생성하도록 요청한 뒤 팀원들이 비교 검토하여 가장 직관적인 형태를 선택함.</w:t>
+      </w:r>
+    </w:p>
+    <w:p>
+      <w:pPr>
+        <w:spacing w:before="30" w:after="30"/>
+        <w:ind w:left="360"/>
+      </w:pPr>
+      <w:r>
+        <w:rPr>
+          <w:rFonts w:ascii="맑은 고딕" w:hAnsi="맑은 고딕"/>
+          <w:b/>
+          <w:color w:val="6366F1"/>
+          <w:sz w:val="20"/>
+        </w:rPr>
+        <w:t xml:space="preserve">• </w:t>
+      </w:r>
+      <w:r>
+        <w:rPr>
+          <w:rFonts w:ascii="맑은 고딕" w:hAnsi="맑은 고딕" w:eastAsia="맑은 고딕"/>
+          <w:b/>
+          <w:color w:val="334155"/>
+          <w:sz w:val="20"/>
+        </w:rPr>
+        <w:t>Figma MCP(Model Context Protocol) 연동</w:t>
+      </w:r>
+      <w:r>
+        <w:rPr>
+          <w:rFonts w:ascii="맑은 고딕" w:hAnsi="맑은 고딕" w:eastAsia="맑은 고딕"/>
+          <w:color w:val="334155"/>
+          <w:sz w:val="20"/>
+        </w:rPr>
+        <w:t>:</w:t>
+      </w:r>
+    </w:p>
+    <w:p>
+      <w:pPr>
+        <w:spacing w:before="30" w:after="30"/>
+        <w:ind w:left="720"/>
+      </w:pPr>
+      <w:r>
+        <w:rPr>
+          <w:rFonts w:ascii="맑은 고딕" w:hAnsi="맑은 고딕"/>
+          <w:b/>
+          <w:color w:val="6366F1"/>
+          <w:sz w:val="20"/>
+        </w:rPr>
+        <w:t xml:space="preserve">⁃ </w:t>
+      </w:r>
+      <w:r>
+        <w:rPr>
+          <w:rFonts w:ascii="맑은 고딕" w:hAnsi="맑은 고딕" w:eastAsia="맑은 고딕"/>
+          <w:color w:val="334155"/>
+          <w:sz w:val="20"/>
+        </w:rPr>
+        <w:t>피그마 자체 AI의 월간 사용 한도가 소진되는 상황이 발생함.</w:t>
+      </w:r>
+    </w:p>
+    <w:p>
+      <w:pPr>
+        <w:spacing w:before="30" w:after="30"/>
+        <w:ind w:left="720"/>
+      </w:pPr>
+      <w:r>
+        <w:rPr>
+          <w:rFonts w:ascii="맑은 고딕" w:hAnsi="맑은 고딕"/>
+          <w:b/>
+          <w:color w:val="6366F1"/>
+          <w:sz w:val="20"/>
+        </w:rPr>
+        <w:t xml:space="preserve">⁃ </w:t>
+      </w:r>
+      <w:r>
+        <w:rPr>
+          <w:rFonts w:ascii="맑은 고딕" w:hAnsi="맑은 고딕" w:eastAsia="맑은 고딕"/>
+          <w:color w:val="334155"/>
+          <w:sz w:val="20"/>
+        </w:rPr>
+        <w:t>이를 해결하기 위해 외부 AI 에이전트가 피그마 화면 구조를 직접 읽고 수정할 수 있는 연결 통로인 Figma MCP를 설정함.</w:t>
       </w:r>
     </w:p>
     <w:tbl>
@@ -1610,7 +1485,7 @@
                 <w:color w:val="1E3A8A"/>
                 <w:sz w:val="20"/>
               </w:rPr>
-              <w:t>비전공자를 위한 개념 설명: MCP(Model Context Protocol)란?</w:t>
+              <w:t>참고: MCP(Model Context Protocol)란?</w:t>
             </w:r>
             <w:r>
               <w:rPr>
@@ -1620,26 +1495,7 @@
                 <w:sz w:val="20"/>
               </w:rPr>
               <w:br/>
-              <w:t xml:space="preserve">AI는 본래 텍스트 창 안에 갇혀 있는 존재임. MCP는 AI에게 피그마 프로그램의 내부를 들여다보고 직접 버튼을 누르고 화면을 그릴 수 있는 </w:t>
-            </w:r>
-            <w:r>
-              <w:rPr>
-                <w:rFonts w:ascii="맑은 고딕" w:hAnsi="맑은 고딕" w:eastAsia="맑은 고딕"/>
-                <w:b/>
-                <w:i/>
-                <w:color w:val="1E3A8A"/>
-                <w:sz w:val="20"/>
-              </w:rPr>
-              <w:t>'원격 조종 리모컨(전용 통신 파이프라인)'</w:t>
-            </w:r>
-            <w:r>
-              <w:rPr>
-                <w:rFonts w:ascii="맑은 고딕" w:hAnsi="맑은 고딕" w:eastAsia="맑은 고딕"/>
-                <w:i/>
-                <w:color w:val="1E3A8A"/>
-                <w:sz w:val="20"/>
-              </w:rPr>
-              <w:t>을 쥐어주는 최신 표준 기술임.</w:t>
+              <w:t>텍스트 대화창에 머물러 있는 AI가 피그마 같은 외부 소프트웨어의 내부 객체 트리에 접근하여 레이아웃, 텍스트, 색상 등을 직접 읽고 수정할 수 있도록 지원하는 표준 통신 규격임.</w:t>
             </w:r>
           </w:p>
         </w:tc>
@@ -1670,24 +1526,7 @@
           <w:color w:val="334155"/>
           <w:sz w:val="20"/>
         </w:rPr>
-        <w:t>AI가 Figma 스크립터(Scripter) 및 플러그인 전용 자바스크립트 코드(</w:t>
-      </w:r>
-      <w:r>
-        <w:rPr>
-          <w:rFonts w:ascii="맑은 고딕" w:hAnsi="맑은 고딕" w:eastAsia="맑은 고딕"/>
-          <w:color w:val="2563EB"/>
-          <w:sz w:val="20"/>
-          <w:u w:val="single"/>
-        </w:rPr>
-        <w:t>figma_scripter_companion.js</w:t>
-      </w:r>
-      <w:r>
-        <w:rPr>
-          <w:rFonts w:ascii="맑은 고딕" w:hAnsi="맑은 고딕" w:eastAsia="맑은 고딕"/>
-          <w:color w:val="334155"/>
-          <w:sz w:val="20"/>
-        </w:rPr>
-        <w:t>)를 직접 작성하여, 수백 개의 텍스트·색상·화면 전환 연결선(Flow Prototype)을 원클릭으로 캔버스에 일괄 자동 적용함.</w:t>
+        <w:t>AI가 스크립트를 작성하여 수십 개 화면의 텍스트와 색상 규격을 일괄 적용하고, 화면 간 이동 링크(프로토타입 인터랙션)를 피그마 캔버스에 직접 반영함.</w:t>
       </w:r>
     </w:p>
     <w:p>
@@ -1710,7 +1549,7 @@
           <w:color w:val="2563EB"/>
           <w:sz w:val="24"/>
         </w:rPr>
-        <w:t>[3단계] 순서도·가재코드(의사코드) 설계, 기획 명세화 및 AI 스킬 표준화 (Current Stage)</w:t>
+        <w:t>3단계: 순서도·의사코드 설계, 가재코드(gjc) 하네스 적용 및 코딩 지침 표준화</w:t>
       </w:r>
     </w:p>
     <w:p>
@@ -1734,7 +1573,7 @@
           <w:color w:val="334155"/>
           <w:sz w:val="20"/>
         </w:rPr>
-        <w:t>순서도(Flowchart) 및 가재코드(의사코드, Pseudocode) AI 사전 도출</w:t>
+        <w:t>순서도와 의사코드(Pseudocode) 사전 작성</w:t>
       </w:r>
       <w:r>
         <w:rPr>
@@ -1765,24 +1604,7 @@
           <w:color w:val="334155"/>
           <w:sz w:val="20"/>
         </w:rPr>
-        <w:t xml:space="preserve">본격적인 코딩에 들어가기 전, 앱이 어떤 논리 구조로 동작해야 하는지 명확히 하기 위해 </w:t>
-      </w:r>
-      <w:r>
-        <w:rPr>
-          <w:rFonts w:ascii="맑은 고딕" w:hAnsi="맑은 고딕" w:eastAsia="맑은 고딕"/>
-          <w:b/>
-          <w:color w:val="334155"/>
-          <w:sz w:val="20"/>
-        </w:rPr>
-        <w:t>AI를 활용하여 순서도와 가재코드(의사코드)를 먼저 작성</w:t>
-      </w:r>
-      <w:r>
-        <w:rPr>
-          <w:rFonts w:ascii="맑은 고딕" w:hAnsi="맑은 고딕" w:eastAsia="맑은 고딕"/>
-          <w:color w:val="334155"/>
-          <w:sz w:val="20"/>
-        </w:rPr>
-        <w:t>함.</w:t>
+        <w:t>실제 코딩에 들어가기 전, 기능 동작 논리를 사전에 검증하기 위해 순서도와 의사코드(자연어로 표현한 알고리즘)를 먼저 도출함.</w:t>
       </w:r>
     </w:p>
     <w:p>
@@ -1805,7 +1627,7 @@
           <w:color w:val="334155"/>
           <w:sz w:val="20"/>
         </w:rPr>
-        <w:t>복약 완료 체크 시 타임스탬프 기록 로직, 복용 시간 변경 및 건너뛰기 예외 처리, 1~3일 미접속 시 알림 분기 조건 등을 일반 언어에 가까운 가재코드로 정리함으로써 비전공 팀원들도 전체 비즈니스 로직을 한눈에 파악하고 결함을 사전에 방지함.</w:t>
+        <w:t>복약 버튼 탭 시 시각 기록 방식, 복용 시간 변경 및 건너뛰기 예외 처리, 며칠간 미접속 시의 알림 조건을 정리하여 팀원 간 기능 합의를 완료함.</w:t>
       </w:r>
     </w:p>
     <w:p>
@@ -1829,7 +1651,7 @@
           <w:color w:val="334155"/>
           <w:sz w:val="20"/>
         </w:rPr>
-        <w:t>기획 명세서(PRD) 수립</w:t>
+        <w:t>가재코드(Gajae-Code / gjc) 에이전트 하네스 적용</w:t>
       </w:r>
       <w:r>
         <w:rPr>
@@ -1860,16 +1682,15 @@
           <w:color w:val="334155"/>
           <w:sz w:val="20"/>
         </w:rPr>
-        <w:t xml:space="preserve">피그마 시안, 가재코드 및 팀원 논의 내역을 종합하여 </w:t>
+        <w:t>코딩 AI가 기존 코드를 충분히 파악하지 않고 성급하게 수정하여 전체 구조를 망가뜨리거나 API 비용을 낭비하는 문제를 방지하기 위해 오픈소스 도구인 가재코드(</w:t>
       </w:r>
       <w:r>
         <w:rPr>
-          <w:rFonts w:ascii="맑은 고딕" w:hAnsi="맑은 고딕" w:eastAsia="맑은 고딕"/>
-          <w:color w:val="2563EB"/>
-          <w:sz w:val="20"/>
-          <w:u w:val="single"/>
+          <w:rFonts w:ascii="Consolas" w:hAnsi="Consolas" w:eastAsia="맑은 고딕"/>
+          <w:color w:val="B42846"/>
+          <w:sz w:val="19"/>
         </w:rPr>
-        <w:t>엔지니어링 기획명세서(`PRD_기획명세서.md`)</w:t>
+        <w:t>gjc</w:t>
       </w:r>
       <w:r>
         <w:rPr>
@@ -1877,96 +1698,7 @@
           <w:color w:val="334155"/>
           <w:sz w:val="20"/>
         </w:rPr>
-        <w:t xml:space="preserve">와 </w:t>
-      </w:r>
-      <w:r>
-        <w:rPr>
-          <w:rFonts w:ascii="맑은 고딕" w:hAnsi="맑은 고딕" w:eastAsia="맑은 고딕"/>
-          <w:color w:val="2563EB"/>
-          <w:sz w:val="20"/>
-          <w:u w:val="single"/>
-        </w:rPr>
-        <w:t>보건약학적 배경 보고서</w:t>
-      </w:r>
-      <w:r>
-        <w:rPr>
-          <w:rFonts w:ascii="맑은 고딕" w:hAnsi="맑은 고딕" w:eastAsia="맑은 고딕"/>
-          <w:color w:val="334155"/>
-          <w:sz w:val="20"/>
-        </w:rPr>
-        <w:t>로 이원화 체계화함.</w:t>
-      </w:r>
-    </w:p>
-    <w:p>
-      <w:pPr>
-        <w:spacing w:before="30" w:after="30"/>
-        <w:ind w:left="360"/>
-      </w:pPr>
-      <w:r>
-        <w:rPr>
-          <w:rFonts w:ascii="맑은 고딕" w:hAnsi="맑은 고딕"/>
-          <w:b/>
-          <w:color w:val="6366F1"/>
-          <w:sz w:val="20"/>
-        </w:rPr>
-        <w:t xml:space="preserve">• </w:t>
-      </w:r>
-      <w:r>
-        <w:rPr>
-          <w:rFonts w:ascii="맑은 고딕" w:hAnsi="맑은 고딕" w:eastAsia="맑은 고딕"/>
-          <w:b/>
-          <w:color w:val="334155"/>
-          <w:sz w:val="20"/>
-        </w:rPr>
-        <w:t>AI 스킬(Agent Skills) 체계 구축</w:t>
-      </w:r>
-      <w:r>
-        <w:rPr>
-          <w:rFonts w:ascii="맑은 고딕" w:hAnsi="맑은 고딕" w:eastAsia="맑은 고딕"/>
-          <w:color w:val="334155"/>
-          <w:sz w:val="20"/>
-        </w:rPr>
-        <w:t>:</w:t>
-      </w:r>
-    </w:p>
-    <w:p>
-      <w:pPr>
-        <w:spacing w:before="30" w:after="30"/>
-        <w:ind w:left="720"/>
-      </w:pPr>
-      <w:r>
-        <w:rPr>
-          <w:rFonts w:ascii="맑은 고딕" w:hAnsi="맑은 고딕"/>
-          <w:b/>
-          <w:color w:val="6366F1"/>
-          <w:sz w:val="20"/>
-        </w:rPr>
-        <w:t xml:space="preserve">⁃ </w:t>
-      </w:r>
-      <w:r>
-        <w:rPr>
-          <w:rFonts w:ascii="맑은 고딕" w:hAnsi="맑은 고딕" w:eastAsia="맑은 고딕"/>
-          <w:color w:val="334155"/>
-          <w:sz w:val="20"/>
-        </w:rPr>
-        <w:t xml:space="preserve">단순 문서에 머무르지 않고, AI 에이전트가 코드를 작성할 때 언제든 꺼내볼 수 있는 </w:t>
-      </w:r>
-      <w:r>
-        <w:rPr>
-          <w:rFonts w:ascii="맑은 고딕" w:hAnsi="맑은 고딕" w:eastAsia="맑은 고딕"/>
-          <w:b/>
-          <w:color w:val="334155"/>
-          <w:sz w:val="20"/>
-        </w:rPr>
-        <w:t>지침서 패키지(`.agents/skills`)</w:t>
-      </w:r>
-      <w:r>
-        <w:rPr>
-          <w:rFonts w:ascii="맑은 고딕" w:hAnsi="맑은 고딕" w:eastAsia="맑은 고딕"/>
-          <w:color w:val="334155"/>
-          <w:sz w:val="20"/>
-        </w:rPr>
-        <w:t>를 프로젝트 내에 구성함.</w:t>
+        <w:t>)를 도입함.</w:t>
       </w:r>
     </w:p>
     <w:tbl>
@@ -2020,7 +1752,7 @@
                 <w:color w:val="1E3A8A"/>
                 <w:sz w:val="20"/>
               </w:rPr>
-              <w:t>비전공자를 위한 개념 설명: AI 스킬(Skills)이란?</w:t>
+              <w:t>참고: 에이전트 하네스(Harness)란?</w:t>
             </w:r>
             <w:r>
               <w:rPr>
@@ -2030,7 +1762,7 @@
                 <w:sz w:val="20"/>
               </w:rPr>
               <w:br/>
-              <w:t xml:space="preserve">AI에게 무작정 "앱 만들어줘"라고 하면 제각각으로 코드를 작성해 엉망이 됨. 스킬은 AI에게 </w:t>
+              <w:t xml:space="preserve">안전벨트처럼 코딩 AI가 임의로 코드를 수정하지 못하도록 </w:t>
             </w:r>
             <w:r>
               <w:rPr>
@@ -2040,7 +1772,7 @@
                 <w:color w:val="1E3A8A"/>
                 <w:sz w:val="20"/>
               </w:rPr>
-              <w:t>'Flutter 공식 코딩 표준', 'Riverpod 상태 관리 교본', '피그마 디자인 변환 가이드'</w:t>
+              <w:t>[질문 및 요구사항 확인 ➔ 작업 계획 수립 및 검토 ➔ 사용자 승인 후 코드 실행]</w:t>
             </w:r>
             <w:r>
               <w:rPr>
@@ -2049,7 +1781,7 @@
                 <w:color w:val="1E3A8A"/>
                 <w:sz w:val="20"/>
               </w:rPr>
-              <w:t xml:space="preserve"> 같은 전문 매뉴얼을 주입해, 경험 많은 수석 개발자처럼 일관되게 행동하도록 통제하는 맞춤형 지침 파일임.</w:t>
+              <w:t>의 통제 절차를 강제하는 도구임.</w:t>
             </w:r>
           </w:p>
         </w:tc>
@@ -2059,6 +1791,29 @@
       <w:pPr>
         <w:spacing w:before="0" w:after="60"/>
       </w:pPr>
+    </w:p>
+    <w:p>
+      <w:pPr>
+        <w:spacing w:before="30" w:after="30"/>
+        <w:ind w:left="720"/>
+      </w:pPr>
+      <w:r>
+        <w:rPr>
+          <w:rFonts w:ascii="맑은 고딕" w:hAnsi="맑은 고딕"/>
+          <w:b/>
+          <w:color w:val="6366F1"/>
+          <w:sz w:val="20"/>
+        </w:rPr>
+        <w:t xml:space="preserve">⁃ </w:t>
+      </w:r>
+      <w:r>
+        <w:rPr>
+          <w:rFonts w:ascii="맑은 고딕" w:hAnsi="맑은 고딕" w:eastAsia="맑은 고딕"/>
+          <w:color w:val="334155"/>
+          <w:sz w:val="20"/>
+        </w:rPr>
+        <w:t>터미널을 계속 주시하지 않아도 AI의 확인 질문을 디스코드나 텔레그램 메신저로 전송받아 모바일에서 답변하고 승인하는 원격 협업 환경을 구축함.</w:t>
+      </w:r>
     </w:p>
     <w:p>
       <w:pPr>
@@ -2081,7 +1836,7 @@
           <w:color w:val="334155"/>
           <w:sz w:val="20"/>
         </w:rPr>
-        <w:t>외부 검증 스킬 도입</w:t>
+        <w:t>기획명세서(PRD) 수립 및 AI 스킬(Skills) 장착</w:t>
       </w:r>
       <w:r>
         <w:rPr>
@@ -2112,13 +1867,71 @@
           <w:color w:val="334155"/>
           <w:sz w:val="20"/>
         </w:rPr>
-        <w:t>GitHub 글로벌 오픈소스에서 검증된 스킬셋(</w:t>
+        <w:t xml:space="preserve">피그마 디자인과 로직 설계를 취합하여 공식 엔지니어링 문서인 </w:t>
       </w:r>
       <w:r>
         <w:rPr>
-          <w:rFonts w:ascii="Consolas" w:hAnsi="Consolas" w:eastAsia="맑은 고딕"/>
-          <w:color w:val="B42846"/>
-          <w:sz w:val="19"/>
+          <w:rFonts w:ascii="맑은 고딕" w:hAnsi="맑은 고딕" w:eastAsia="맑은 고딕"/>
+          <w:color w:val="2563EB"/>
+          <w:sz w:val="20"/>
+          <w:u w:val="single"/>
+        </w:rPr>
+        <w:t>PRD_기획명세서.md</w:t>
+      </w:r>
+      <w:r>
+        <w:rPr>
+          <w:rFonts w:ascii="맑은 고딕" w:hAnsi="맑은 고딕" w:eastAsia="맑은 고딕"/>
+          <w:color w:val="334155"/>
+          <w:sz w:val="20"/>
+        </w:rPr>
+        <w:t>로 정리함.</w:t>
+      </w:r>
+    </w:p>
+    <w:p>
+      <w:pPr>
+        <w:spacing w:before="30" w:after="30"/>
+        <w:ind w:left="720"/>
+      </w:pPr>
+      <w:r>
+        <w:rPr>
+          <w:rFonts w:ascii="맑은 고딕" w:hAnsi="맑은 고딕"/>
+          <w:b/>
+          <w:color w:val="6366F1"/>
+          <w:sz w:val="20"/>
+        </w:rPr>
+        <w:t xml:space="preserve">⁃ </w:t>
+      </w:r>
+      <w:r>
+        <w:rPr>
+          <w:rFonts w:ascii="맑은 고딕" w:hAnsi="맑은 고딕" w:eastAsia="맑은 고딕"/>
+          <w:color w:val="334155"/>
+          <w:sz w:val="20"/>
+        </w:rPr>
+        <w:t>AI가 코드를 작성할 때 일관된 아키텍처 규칙을 따르도록 GitHub에서 검증된 스킬 파일들(</w:t>
+      </w:r>
+      <w:r>
+        <w:rPr>
+          <w:rFonts w:ascii="맑은 고딕" w:hAnsi="맑은 고딕" w:eastAsia="맑은 고딕"/>
+          <w:color w:val="2563EB"/>
+          <w:sz w:val="20"/>
+          <w:u w:val="single"/>
+        </w:rPr>
+        <w:t>.agents/skills/</w:t>
+      </w:r>
+      <w:r>
+        <w:rPr>
+          <w:rFonts w:ascii="맑은 고딕" w:hAnsi="맑은 고딕" w:eastAsia="맑은 고딕"/>
+          <w:color w:val="334155"/>
+          <w:sz w:val="20"/>
+        </w:rPr>
+        <w:t>)을 프로젝트에 배치함. 여기에는 피그마 위젯 변환 규칙(</w:t>
+      </w:r>
+      <w:r>
+        <w:rPr>
+          <w:rFonts w:ascii="맑은 고딕" w:hAnsi="맑은 고딕" w:eastAsia="맑은 고딕"/>
+          <w:color w:val="2563EB"/>
+          <w:sz w:val="20"/>
+          <w:u w:val="single"/>
         </w:rPr>
         <w:t>figma-to-flutter</w:t>
       </w:r>
@@ -2128,45 +1941,14 @@
           <w:color w:val="334155"/>
           <w:sz w:val="20"/>
         </w:rPr>
-        <w:t xml:space="preserve">, </w:t>
-      </w:r>
-      <w:r>
-        <w:rPr>
-          <w:rFonts w:ascii="Consolas" w:hAnsi="Consolas" w:eastAsia="맑은 고딕"/>
-          <w:color w:val="B42846"/>
-          <w:sz w:val="19"/>
-        </w:rPr>
-        <w:t>flutter-app-architecture</w:t>
+        <w:t>), 상태 관리 규칙(</w:t>
       </w:r>
       <w:r>
         <w:rPr>
           <w:rFonts w:ascii="맑은 고딕" w:hAnsi="맑은 고딕" w:eastAsia="맑은 고딕"/>
-          <w:color w:val="334155"/>
+          <w:color w:val="2563EB"/>
           <w:sz w:val="20"/>
-        </w:rPr>
-        <w:t xml:space="preserve">, </w:t>
-      </w:r>
-      <w:r>
-        <w:rPr>
-          <w:rFonts w:ascii="Consolas" w:hAnsi="Consolas" w:eastAsia="맑은 고딕"/>
-          <w:color w:val="B42846"/>
-          <w:sz w:val="19"/>
-        </w:rPr>
-        <w:t>flutter-best-practices</w:t>
-      </w:r>
-      <w:r>
-        <w:rPr>
-          <w:rFonts w:ascii="맑은 고딕" w:hAnsi="맑은 고딕" w:eastAsia="맑은 고딕"/>
-          <w:color w:val="334155"/>
-          <w:sz w:val="20"/>
-        </w:rPr>
-        <w:t xml:space="preserve">, </w:t>
-      </w:r>
-      <w:r>
-        <w:rPr>
-          <w:rFonts w:ascii="Consolas" w:hAnsi="Consolas" w:eastAsia="맑은 고딕"/>
-          <w:color w:val="B42846"/>
-          <w:sz w:val="19"/>
+          <w:u w:val="single"/>
         </w:rPr>
         <w:t>flutter-riverpod</w:t>
       </w:r>
@@ -2176,15 +1958,16 @@
           <w:color w:val="334155"/>
           <w:sz w:val="20"/>
         </w:rPr>
-        <w:t xml:space="preserve">, </w:t>
+        <w:t>), 모바일 접근성 표준(</w:t>
       </w:r>
       <w:r>
         <w:rPr>
-          <w:rFonts w:ascii="Consolas" w:hAnsi="Consolas" w:eastAsia="맑은 고딕"/>
-          <w:color w:val="B42846"/>
-          <w:sz w:val="19"/>
+          <w:rFonts w:ascii="맑은 고딕" w:hAnsi="맑은 고딕" w:eastAsia="맑은 고딕"/>
+          <w:color w:val="2563EB"/>
+          <w:sz w:val="20"/>
+          <w:u w:val="single"/>
         </w:rPr>
-        <w:t>flutter-testing</w:t>
+        <w:t>accessibility-as-code</w:t>
       </w:r>
       <w:r>
         <w:rPr>
@@ -2192,7 +1975,7 @@
           <w:color w:val="334155"/>
           <w:sz w:val="20"/>
         </w:rPr>
-        <w:t>)을 선별 다운로드하여 에이전트 환경에 장착함.</w:t>
+        <w:t>)이 포함됨.</w:t>
       </w:r>
     </w:p>
     <w:p>
@@ -2215,7 +1998,7 @@
           <w:color w:val="2563EB"/>
           <w:sz w:val="24"/>
         </w:rPr>
-        <w:t>[4단계] AI 에이전트 기반 프로덕션 코드 전환 (Upcoming Stage)</w:t>
+        <w:t>4단계: 모바일 앱 코드 전환 (Flutter)</w:t>
       </w:r>
     </w:p>
     <w:p>
@@ -2247,24 +2030,7 @@
           <w:color w:val="334155"/>
           <w:sz w:val="20"/>
         </w:rPr>
-        <w:t xml:space="preserve">: Figma 디자인, 가재코드 및 PRD 명세를 실제 스마트폰에서 터치되고 데이터가 저장되는 </w:t>
-      </w:r>
-      <w:r>
-        <w:rPr>
-          <w:rFonts w:ascii="맑은 고딕" w:hAnsi="맑은 고딕" w:eastAsia="맑은 고딕"/>
-          <w:b/>
-          <w:color w:val="334155"/>
-          <w:sz w:val="20"/>
-        </w:rPr>
-        <w:t>Flutter 모바일 앱 코드</w:t>
-      </w:r>
-      <w:r>
-        <w:rPr>
-          <w:rFonts w:ascii="맑은 고딕" w:hAnsi="맑은 고딕" w:eastAsia="맑은 고딕"/>
-          <w:color w:val="334155"/>
-          <w:sz w:val="20"/>
-        </w:rPr>
-        <w:t>로 100% 전환함.</w:t>
+        <w:t>: 확정된 기획명세서와 디자인 프로토타입을 실제 스마트폰에서 터치되고 데이터가 저장되는 Flutter 코드로 구현함.</w:t>
       </w:r>
     </w:p>
     <w:p>
@@ -2327,7 +2093,7 @@
           <w:color w:val="334155"/>
           <w:sz w:val="20"/>
         </w:rPr>
-        <w:t xml:space="preserve"> 스킬을 가동하여 Figma 노드의 색상·마진·패딩을 오차 없는 Flutter 위젯 트리로 1:1 변환함.</w:t>
+        <w:t xml:space="preserve"> 스킬을 사용하여 피그마 프레임의 배치와 스타일을 Flutter 위젯 코드로 변환함.</w:t>
       </w:r>
     </w:p>
     <w:p>
@@ -2346,51 +2112,11 @@
       </w:r>
       <w:r>
         <w:rPr>
-          <w:rFonts w:ascii="Consolas" w:hAnsi="Consolas" w:eastAsia="맑은 고딕"/>
-          <w:color w:val="B42846"/>
-          <w:sz w:val="19"/>
-        </w:rPr>
-        <w:t>flutter-app-architecture</w:t>
-      </w:r>
-      <w:r>
-        <w:rPr>
           <w:rFonts w:ascii="맑은 고딕" w:hAnsi="맑은 고딕" w:eastAsia="맑은 고딕"/>
           <w:color w:val="334155"/>
           <w:sz w:val="20"/>
         </w:rPr>
-        <w:t xml:space="preserve"> 스킬을 통해 화면(UI), 비즈니스 로직, 로컬 데이터베이스(</w:t>
-      </w:r>
-      <w:r>
-        <w:rPr>
-          <w:rFonts w:ascii="Consolas" w:hAnsi="Consolas" w:eastAsia="맑은 고딕"/>
-          <w:color w:val="B42846"/>
-          <w:sz w:val="19"/>
-        </w:rPr>
-        <w:t>SQLite</w:t>
-      </w:r>
-      <w:r>
-        <w:rPr>
-          <w:rFonts w:ascii="맑은 고딕" w:hAnsi="맑은 고딕" w:eastAsia="맑은 고딕"/>
-          <w:color w:val="334155"/>
-          <w:sz w:val="20"/>
-        </w:rPr>
-        <w:t>/</w:t>
-      </w:r>
-      <w:r>
-        <w:rPr>
-          <w:rFonts w:ascii="Consolas" w:hAnsi="Consolas" w:eastAsia="맑은 고딕"/>
-          <w:color w:val="B42846"/>
-          <w:sz w:val="19"/>
-        </w:rPr>
-        <w:t>Hive</w:t>
-      </w:r>
-      <w:r>
-        <w:rPr>
-          <w:rFonts w:ascii="맑은 고딕" w:hAnsi="맑은 고딕" w:eastAsia="맑은 고딕"/>
-          <w:color w:val="334155"/>
-          <w:sz w:val="20"/>
-        </w:rPr>
-        <w:t>)를 엄격히 분리하는 클린 아키텍처(MVVM)를 구축함.</w:t>
+        <w:t>화면 UI와 내부 데이터 처리 로직을 명확히 분리하기 위해 클린 아키텍처(Riverpod 상태 관리)를 적용함.</w:t>
       </w:r>
     </w:p>
     <w:p>
@@ -2413,7 +2139,7 @@
           <w:color w:val="334155"/>
           <w:sz w:val="20"/>
         </w:rPr>
-        <w:t>개발 담당 팀원들이 AI와 실시간 페어 프로그래밍을 진행하며 누락된 엣지 케이스를 보완하고 테스트 코드를 실행함.</w:t>
+        <w:t>개발 담당 팀원이 AI 에이전트와 페어 프로그래밍을 진행하며 누락된 예외 상황을 보완하고 로컬 데이터베이스 연동 및 단위 테스트를 수행함.</w:t>
       </w:r>
     </w:p>
     <w:p>
@@ -2436,7 +2162,7 @@
           <w:color w:val="2563EB"/>
           <w:sz w:val="24"/>
         </w:rPr>
-        <w:t>[5단계] 빌드, 검증 및 구글 플레이스토어 배포 (Final Stage)</w:t>
+        <w:t>5단계: 앱 빌드 및 구글 플레이스토어 배포</w:t>
       </w:r>
     </w:p>
     <w:p>
@@ -2468,24 +2194,7 @@
           <w:color w:val="334155"/>
           <w:sz w:val="20"/>
         </w:rPr>
-        <w:t xml:space="preserve">: 단순한 과제 제출용 프로토타입에 그치지 않고, 누구나 다운로드할 수 있는 </w:t>
-      </w:r>
-      <w:r>
-        <w:rPr>
-          <w:rFonts w:ascii="맑은 고딕" w:hAnsi="맑은 고딕" w:eastAsia="맑은 고딕"/>
-          <w:b/>
-          <w:color w:val="334155"/>
-          <w:sz w:val="20"/>
-        </w:rPr>
-        <w:t>상용 구글 플레이스토어 정식 출시</w:t>
-      </w:r>
-      <w:r>
-        <w:rPr>
-          <w:rFonts w:ascii="맑은 고딕" w:hAnsi="맑은 고딕" w:eastAsia="맑은 고딕"/>
-          <w:color w:val="334155"/>
-          <w:sz w:val="20"/>
-        </w:rPr>
-        <w:t>.</w:t>
+        <w:t>: 과제 발표용 화면 시연에 머무르지 않고 실제 기기에 설치 가능한 정식 앱으로 출시함.</w:t>
       </w:r>
     </w:p>
     <w:p>
@@ -2540,7 +2249,7 @@
           <w:color w:val="334155"/>
           <w:sz w:val="20"/>
         </w:rPr>
-        <w:t>학교 지원금(3만 원) 연계를 바탕으로 Google Play Console 개발자 계정 등록 (\$25).</w:t>
+        <w:t>학교 지원금(3만 원)을 활용하여 Google Play Console 개발자 계정 등록을 완료함.</w:t>
       </w:r>
     </w:p>
     <w:p>
@@ -2563,7 +2272,7 @@
           <w:color w:val="334155"/>
           <w:sz w:val="20"/>
         </w:rPr>
-        <w:t>Flutter 프로덕션 릴리스 빌드(AAB 파일 생성).</w:t>
+        <w:t>Flutter 앱 배포용 패키지(AAB 파일)를 빌드함.</w:t>
       </w:r>
     </w:p>
     <w:p>
@@ -2586,7 +2295,7 @@
           <w:color w:val="334155"/>
           <w:sz w:val="20"/>
         </w:rPr>
-        <w:t>AI를 통한 앱 권한 검토, 개인정보 처리방침 문서 자동 생성, 스토어 등록 정보(설명문, 스크린샷 컷) 완비 후 스토어 심사 제출.</w:t>
+        <w:t>AI를 활용하여 앱 권한 명세서와 개인정보 처리방침 문서를 작성한 뒤 스토어 심사를 제출함.</w:t>
       </w:r>
     </w:p>
     <w:p>
@@ -2609,7 +2318,7 @@
           <w:color w:val="1E3A8A"/>
           <w:sz w:val="28"/>
         </w:rPr>
-        <w:t>3. 개발에 투입된 AI &amp; 프로그래밍 도구 생태계</w:t>
+        <w:t>3. 활용 도구 정리</w:t>
       </w:r>
     </w:p>
     <w:tbl>
@@ -2707,7 +2416,7 @@
                 <w:color w:val="4338CA"/>
                 <w:sz w:val="20"/>
               </w:rPr>
-              <w:t>비전공자를 위한 쉬운 비유</w:t>
+              <w:t>비전공자를 위한 쉬운 설명</w:t>
             </w:r>
           </w:p>
         </w:tc>
@@ -2729,12 +2438,12 @@
             </w:pPr>
             <w:r>
               <w:rPr>
-                <w:rFonts w:ascii="Consolas" w:hAnsi="Consolas" w:eastAsia="맑은 고딕"/>
+                <w:rFonts w:ascii="맑은 고딕" w:hAnsi="맑은 고딕" w:eastAsia="맑은 고딕"/>
                 <w:b/>
-                <w:color w:val="A0283C"/>
-                <w:sz w:val="18"/>
+                <w:color w:val="334155"/>
+                <w:sz w:val="19"/>
               </w:rPr>
-              <w:t>Figma` &amp; `Figma AI</w:t>
+              <w:t>Figma &amp; Figma AI</w:t>
             </w:r>
           </w:p>
         </w:tc>
@@ -2758,7 +2467,7 @@
                 <w:color w:val="334155"/>
                 <w:sz w:val="19"/>
               </w:rPr>
-              <w:t>UI/UX 인터페이스 디자인 툴 및 초기 레이아웃 자동 생성</w:t>
+              <w:t>UI/UX 화면 디자인 및 초기 레이아웃 생성</w:t>
             </w:r>
           </w:p>
         </w:tc>
@@ -2782,16 +2491,7 @@
                 <w:color w:val="334155"/>
                 <w:sz w:val="19"/>
               </w:rPr>
-              <w:t xml:space="preserve">건물의 외관과 인테리어를 그리는 </w:t>
-            </w:r>
-            <w:r>
-              <w:rPr>
-                <w:rFonts w:ascii="맑은 고딕" w:hAnsi="맑은 고딕" w:eastAsia="맑은 고딕"/>
-                <w:b/>
-                <w:color w:val="334155"/>
-                <w:sz w:val="19"/>
-              </w:rPr>
-              <w:t>건축 3D 설계도</w:t>
+              <w:t>화면 형태와 버튼 배치를 그리는 설계도</w:t>
             </w:r>
           </w:p>
         </w:tc>
@@ -2814,10 +2514,10 @@
             </w:pPr>
             <w:r>
               <w:rPr>
-                <w:rFonts w:ascii="Consolas" w:hAnsi="Consolas" w:eastAsia="맑은 고딕"/>
+                <w:rFonts w:ascii="맑은 고딕" w:hAnsi="맑은 고딕" w:eastAsia="맑은 고딕"/>
                 <w:b/>
-                <w:color w:val="A0283C"/>
-                <w:sz w:val="18"/>
+                <w:color w:val="334155"/>
+                <w:sz w:val="19"/>
               </w:rPr>
               <w:t>Figma MCP</w:t>
             </w:r>
@@ -2844,7 +2544,7 @@
                 <w:color w:val="334155"/>
                 <w:sz w:val="19"/>
               </w:rPr>
-              <w:t>AI 에이전트가 피그마 캔버스를 직접 프로그래밍 제어하는 통신 브릿지</w:t>
+              <w:t>AI가 피그마 캔버스를 직접 제어하는 연결 통로</w:t>
             </w:r>
           </w:p>
         </w:tc>
@@ -2869,16 +2569,7 @@
                 <w:color w:val="334155"/>
                 <w:sz w:val="19"/>
               </w:rPr>
-              <w:t xml:space="preserve">AI의 손과 발이 되어 피그마를 조작하는 </w:t>
-            </w:r>
-            <w:r>
-              <w:rPr>
-                <w:rFonts w:ascii="맑은 고딕" w:hAnsi="맑은 고딕" w:eastAsia="맑은 고딕"/>
-                <w:b/>
-                <w:color w:val="334155"/>
-                <w:sz w:val="19"/>
-              </w:rPr>
-              <w:t>원격 로봇 팔</w:t>
+              <w:t>AI가 피그마 프로그램을 직접 조작할 수 있도록 돕는 도구</w:t>
             </w:r>
           </w:p>
         </w:tc>
@@ -2900,12 +2591,12 @@
             </w:pPr>
             <w:r>
               <w:rPr>
-                <w:rFonts w:ascii="Consolas" w:hAnsi="Consolas" w:eastAsia="맑은 고딕"/>
+                <w:rFonts w:ascii="맑은 고딕" w:hAnsi="맑은 고딕" w:eastAsia="맑은 고딕"/>
                 <w:b/>
-                <w:color w:val="A0283C"/>
-                <w:sz w:val="18"/>
+                <w:color w:val="334155"/>
+                <w:sz w:val="19"/>
               </w:rPr>
-              <w:t>Antigravity IDE / CLI</w:t>
+              <w:t>가재코드 (Gajae-Code / gjc)</w:t>
             </w:r>
           </w:p>
         </w:tc>
@@ -2929,7 +2620,7 @@
                 <w:color w:val="334155"/>
                 <w:sz w:val="19"/>
               </w:rPr>
-              <w:t>Google DeepMind 기반의 자율 에이전틱 코딩 개발 환경</w:t>
+              <w:t>AI 코딩 에이전트 안전 통제 하네스 및 실행기</w:t>
             </w:r>
           </w:p>
         </w:tc>
@@ -2953,16 +2644,7 @@
                 <w:color w:val="334155"/>
                 <w:sz w:val="19"/>
               </w:rPr>
-              <w:t xml:space="preserve">프로젝트 전체를 파악하고 지시를 수행하는 </w:t>
-            </w:r>
-            <w:r>
-              <w:rPr>
-                <w:rFonts w:ascii="맑은 고딕" w:hAnsi="맑은 고딕" w:eastAsia="맑은 고딕"/>
-                <w:b/>
-                <w:color w:val="334155"/>
-                <w:sz w:val="19"/>
-              </w:rPr>
-              <w:t>AI 수석 개발자</w:t>
+              <w:t>AI가 코드를 함부로 고치지 못하게 계획과 승인을 강제하는 안전벨트</w:t>
             </w:r>
           </w:p>
         </w:tc>
@@ -2985,12 +2667,12 @@
             </w:pPr>
             <w:r>
               <w:rPr>
-                <w:rFonts w:ascii="Consolas" w:hAnsi="Consolas" w:eastAsia="맑은 고딕"/>
+                <w:rFonts w:ascii="맑은 고딕" w:hAnsi="맑은 고딕" w:eastAsia="맑은 고딕"/>
                 <w:b/>
-                <w:color w:val="A0283C"/>
-                <w:sz w:val="18"/>
+                <w:color w:val="334155"/>
+                <w:sz w:val="19"/>
               </w:rPr>
-              <w:t>Codex CLI / GJC</w:t>
+              <w:t>Antigravity IDE / CLI</w:t>
             </w:r>
           </w:p>
         </w:tc>
@@ -3015,7 +2697,7 @@
                 <w:color w:val="334155"/>
                 <w:sz w:val="19"/>
               </w:rPr>
-              <w:t>코드 생성, 스크립트 실행 및 터미널 명령어 자동화 엔진</w:t>
+              <w:t>프로젝트 전체를 파악하고 지시를 수행하는 AI 코딩 환경</w:t>
             </w:r>
           </w:p>
         </w:tc>
@@ -3040,16 +2722,7 @@
                 <w:color w:val="334155"/>
                 <w:sz w:val="19"/>
               </w:rPr>
-              <w:t xml:space="preserve">복잡한 코드를 빠르게 번역하고 조립하는 </w:t>
-            </w:r>
-            <w:r>
-              <w:rPr>
-                <w:rFonts w:ascii="맑은 고딕" w:hAnsi="맑은 고딕" w:eastAsia="맑은 고딕"/>
-                <w:b/>
-                <w:color w:val="334155"/>
-                <w:sz w:val="19"/>
-              </w:rPr>
-              <w:t>고성능 엔진</w:t>
+              <w:t>프로젝트 구조를 파악하고 지시를 수행하는 AI 엔지니어</w:t>
             </w:r>
           </w:p>
         </w:tc>
@@ -3071,12 +2744,12 @@
             </w:pPr>
             <w:r>
               <w:rPr>
-                <w:rFonts w:ascii="Consolas" w:hAnsi="Consolas" w:eastAsia="맑은 고딕"/>
+                <w:rFonts w:ascii="맑은 고딕" w:hAnsi="맑은 고딕" w:eastAsia="맑은 고딕"/>
                 <w:b/>
-                <w:color w:val="A0283C"/>
-                <w:sz w:val="18"/>
+                <w:color w:val="334155"/>
+                <w:sz w:val="19"/>
               </w:rPr>
-              <w:t>GitHub` &amp; `Copilot</w:t>
+              <w:t>GitHub &amp; Copilot</w:t>
             </w:r>
           </w:p>
         </w:tc>
@@ -3100,7 +2773,7 @@
                 <w:color w:val="334155"/>
                 <w:sz w:val="19"/>
               </w:rPr>
-              <w:t>코드 버전 관리(VCS), 형상 관리 및 실시간 타이핑 자동완성</w:t>
+              <w:t>코드 버전 관리 및 실시간 코드 자동완성</w:t>
             </w:r>
           </w:p>
         </w:tc>
@@ -3124,16 +2797,7 @@
                 <w:color w:val="334155"/>
                 <w:sz w:val="19"/>
               </w:rPr>
-              <w:t xml:space="preserve">작업 내역을 잃어버리지 않게 기록하는 </w:t>
-            </w:r>
-            <w:r>
-              <w:rPr>
-                <w:rFonts w:ascii="맑은 고딕" w:hAnsi="맑은 고딕" w:eastAsia="맑은 고딕"/>
-                <w:b/>
-                <w:color w:val="334155"/>
-                <w:sz w:val="19"/>
-              </w:rPr>
-              <w:t>클라우드 타임머신</w:t>
+              <w:t>작업 내역을 저장하는 저장소와 타이핑 보조 도구</w:t>
             </w:r>
           </w:p>
         </w:tc>
@@ -3156,10 +2820,10 @@
             </w:pPr>
             <w:r>
               <w:rPr>
-                <w:rFonts w:ascii="Consolas" w:hAnsi="Consolas" w:eastAsia="맑은 고딕"/>
+                <w:rFonts w:ascii="맑은 고딕" w:hAnsi="맑은 고딕" w:eastAsia="맑은 고딕"/>
                 <w:b/>
-                <w:color w:val="A0283C"/>
-                <w:sz w:val="18"/>
+                <w:color w:val="334155"/>
+                <w:sz w:val="19"/>
               </w:rPr>
               <w:t>Flutter</w:t>
             </w:r>
@@ -3186,7 +2850,7 @@
                 <w:color w:val="334155"/>
                 <w:sz w:val="19"/>
               </w:rPr>
-              <w:t>하나의 코드로 Android와 iOS 모두에서 작동하는 크로스플랫폼 앱 프레임워크</w:t>
+              <w:t>Android와 iOS 앱을 동시에 제작하는 크로스플랫폼 프레임워크</w:t>
             </w:r>
           </w:p>
         </w:tc>
@@ -3211,100 +2875,7 @@
                 <w:color w:val="334155"/>
                 <w:sz w:val="19"/>
               </w:rPr>
-              <w:t xml:space="preserve">안드로이드와 아이폰 모두에서 달릴 수 있는 </w:t>
-            </w:r>
-            <w:r>
-              <w:rPr>
-                <w:rFonts w:ascii="맑은 고딕" w:hAnsi="맑은 고딕" w:eastAsia="맑은 고딕"/>
-                <w:b/>
-                <w:color w:val="334155"/>
-                <w:sz w:val="19"/>
-              </w:rPr>
-              <w:t>만능 엔진</w:t>
-            </w:r>
-          </w:p>
-        </w:tc>
-      </w:tr>
-      <w:tr>
-        <w:tc>
-          <w:tcPr>
-            <w:tcW w:type="dxa" w:w="3120"/>
-            <w:tcMar>
-              <w:top w:w="100" w:type="dxa"/>
-              <w:bottom w:w="100" w:type="dxa"/>
-              <w:left w:w="140" w:type="dxa"/>
-              <w:right w:w="140" w:type="dxa"/>
-            </w:tcMar>
-          </w:tcPr>
-          <w:p>
-            <w:pPr>
-              <w:spacing w:before="40" w:after="40"/>
-            </w:pPr>
-            <w:r>
-              <w:rPr>
-                <w:rFonts w:ascii="맑은 고딕" w:hAnsi="맑은 고딕" w:eastAsia="맑은 고딕"/>
-                <w:b/>
-                <w:color w:val="334155"/>
-                <w:sz w:val="19"/>
-              </w:rPr>
-              <w:t>`Cursor AI` (검토 중)</w:t>
-            </w:r>
-          </w:p>
-        </w:tc>
-        <w:tc>
-          <w:tcPr>
-            <w:tcW w:type="dxa" w:w="3120"/>
-            <w:tcMar>
-              <w:top w:w="100" w:type="dxa"/>
-              <w:bottom w:w="100" w:type="dxa"/>
-              <w:left w:w="140" w:type="dxa"/>
-              <w:right w:w="140" w:type="dxa"/>
-            </w:tcMar>
-          </w:tcPr>
-          <w:p>
-            <w:pPr>
-              <w:spacing w:before="40" w:after="40"/>
-            </w:pPr>
-            <w:r>
-              <w:rPr>
-                <w:rFonts w:ascii="맑은 고딕" w:hAnsi="맑은 고딕" w:eastAsia="맑은 고딕"/>
-                <w:color w:val="334155"/>
-                <w:sz w:val="19"/>
-              </w:rPr>
-              <w:t>에디터 전체에 AI가 깊게 통합된 지능형 코드 편집기</w:t>
-            </w:r>
-          </w:p>
-        </w:tc>
-        <w:tc>
-          <w:tcPr>
-            <w:tcW w:type="dxa" w:w="3120"/>
-            <w:tcMar>
-              <w:top w:w="100" w:type="dxa"/>
-              <w:bottom w:w="100" w:type="dxa"/>
-              <w:left w:w="140" w:type="dxa"/>
-              <w:right w:w="140" w:type="dxa"/>
-            </w:tcMar>
-          </w:tcPr>
-          <w:p>
-            <w:pPr>
-              <w:spacing w:before="40" w:after="40"/>
-            </w:pPr>
-            <w:r>
-              <w:rPr>
-                <w:rFonts w:ascii="맑은 고딕" w:hAnsi="맑은 고딕" w:eastAsia="맑은 고딕"/>
-                <w:color w:val="334155"/>
-                <w:sz w:val="19"/>
-              </w:rPr>
-              <w:t xml:space="preserve">코드를 작성할 때 옆에서 즉각 검토해 주는 </w:t>
-            </w:r>
-            <w:r>
-              <w:rPr>
-                <w:rFonts w:ascii="맑은 고딕" w:hAnsi="맑은 고딕" w:eastAsia="맑은 고딕"/>
-                <w:b/>
-                <w:color w:val="334155"/>
-                <w:sz w:val="19"/>
-              </w:rPr>
-              <w:t>전문 과외 선생님</w:t>
+              <w:t>하나의 코드로 스마트폰 앱을 만드는 도구</w:t>
             </w:r>
           </w:p>
         </w:tc>
@@ -3335,20 +2906,7 @@
           <w:color w:val="1E3A8A"/>
           <w:sz w:val="28"/>
         </w:rPr>
-        <w:t>4. 공학적 관점의 효율화 제언 (발표 가산점 포인트)</w:t>
-      </w:r>
-    </w:p>
-    <w:p>
-      <w:pPr>
-        <w:spacing w:before="50" w:after="70" w:line="300" w:lineRule="auto"/>
-      </w:pPr>
-      <w:r>
-        <w:rPr>
-          <w:rFonts w:ascii="맑은 고딕" w:hAnsi="맑은 고딕" w:eastAsia="맑은 고딕"/>
-          <w:color w:val="334155"/>
-          <w:sz w:val="21"/>
-        </w:rPr>
-        <w:t>발표 슬라이드 및 최종 보고서 작성 시 강조하면 완성도를 크게 높일 수 있는 엔지니어링 제언임:</w:t>
+        <w:t>4. 협업 과정에서 얻은 시사점</w:t>
       </w:r>
     </w:p>
     <w:p>
@@ -3372,7 +2930,7 @@
           <w:color w:val="334155"/>
           <w:sz w:val="20"/>
         </w:rPr>
-        <w:t>"프롬프트 만능주의" 탈피 ➔ "스킬 기반 시스템" 구축 강조</w:t>
+        <w:t>단순 프롬프트 대화 대신 체계적인 규칙 파일(스킬) 활용</w:t>
       </w:r>
       <w:r>
         <w:rPr>
@@ -3403,7 +2961,7 @@
           <w:color w:val="334155"/>
           <w:sz w:val="20"/>
         </w:rPr>
-        <w:t xml:space="preserve">단순히 AI에게 길게 말을 거는(프롬프트 엔지니어링) 수준을 넘어, 프로젝트 규격과 코딩 룰을 </w:t>
+        <w:t>대화창에서 매번 길게 설명하기보다 프로젝트 폴더에 코딩 규칙과 디자인 표준 파일(</w:t>
       </w:r>
       <w:r>
         <w:rPr>
@@ -3420,24 +2978,7 @@
           <w:color w:val="334155"/>
           <w:sz w:val="20"/>
         </w:rPr>
-        <w:t xml:space="preserve"> 형태로 모듈화해 장착함으로써 </w:t>
-      </w:r>
-      <w:r>
-        <w:rPr>
-          <w:rFonts w:ascii="맑은 고딕" w:hAnsi="맑은 고딕" w:eastAsia="맑은 고딕"/>
-          <w:b/>
-          <w:color w:val="334155"/>
-          <w:sz w:val="20"/>
-        </w:rPr>
-        <w:t>재현 가능하고 버그 없는 전문 소프트웨어 파이프라인</w:t>
-      </w:r>
-      <w:r>
-        <w:rPr>
-          <w:rFonts w:ascii="맑은 고딕" w:hAnsi="맑은 고딕" w:eastAsia="맑은 고딕"/>
-          <w:color w:val="334155"/>
-          <w:sz w:val="20"/>
-        </w:rPr>
-        <w:t>을 완성했음을 어필함.</w:t>
+        <w:t>)을 사전에 배치했을 때, AI가 일관된 코딩 컨벤션을 유지함.</w:t>
       </w:r>
     </w:p>
     <w:p>
@@ -3461,7 +3002,7 @@
           <w:color w:val="334155"/>
           <w:sz w:val="20"/>
         </w:rPr>
-        <w:t>점진적 토큰 관리 (Progressive Disclosure)</w:t>
+        <w:t>하네스 도구를 통한 코드 변조 방지 및 비용 절감</w:t>
       </w:r>
       <w:r>
         <w:rPr>
@@ -3492,7 +3033,23 @@
           <w:color w:val="334155"/>
           <w:sz w:val="20"/>
         </w:rPr>
-        <w:t>모든 요구사항을 한 번에 입력하면 AI가 혼란(환각)을 일으킴. '화면 디자인 ➔ 아키텍처 ➔ 세부 로직 ➔ 테스트'로 단계별 모듈화하여 토큰을 절약하고 정확도를 극대화함.</w:t>
+        <w:t>가재코드(</w:t>
+      </w:r>
+      <w:r>
+        <w:rPr>
+          <w:rFonts w:ascii="Consolas" w:hAnsi="Consolas" w:eastAsia="맑은 고딕"/>
+          <w:color w:val="B42846"/>
+          <w:sz w:val="19"/>
+        </w:rPr>
+        <w:t>gjc</w:t>
+      </w:r>
+      <w:r>
+        <w:rPr>
+          <w:rFonts w:ascii="맑은 고딕" w:hAnsi="맑은 고딕" w:eastAsia="맑은 고딕"/>
+          <w:color w:val="334155"/>
+          <w:sz w:val="20"/>
+        </w:rPr>
+        <w:t>)처럼 작업 계획을 먼저 승인받고 코드를 실행하는 절차를 두어, AI의 독단적인 코드 수정으로 인한 버그 발생과 불필요한 토큰 소모를 방지함.</w:t>
       </w:r>
     </w:p>
     <w:p>
@@ -3516,7 +3073,7 @@
           <w:color w:val="334155"/>
           <w:sz w:val="20"/>
         </w:rPr>
-        <w:t>약학 전문성과 IT 기술의 성공적 가교</w:t>
+        <w:t>약학 전문성과 기술 구현의 결합</w:t>
       </w:r>
       <w:r>
         <w:rPr>
@@ -3547,7 +3104,7 @@
           <w:color w:val="334155"/>
           <w:sz w:val="20"/>
         </w:rPr>
-        <w:t>약학적 치료역(Therapeutic Window)과 비처벌적 UX라는 도메인 지식을 코딩 에이전트에게 명확한 규칙(Locked ON 알림, 3단계 감정 톤)으로 주입해 성공적인 결과물을 도출했음을 결론으로 제시함.</w:t>
+        <w:t>복약 알림 비활성화 불가 원칙이나 비처벌적 누적 보상과 같은 보건약학적 이유를 명확한 규칙으로 전달함으로써, 단순한 기능 모음을 넘어 환자 중심의 실질적인 서비스로 완성할 수 있었음.</w:t>
       </w:r>
     </w:p>
     <w:sectPr>
@@ -3574,7 +3131,7 @@
         <w:color w:val="94A3B8"/>
         <w:sz w:val="17"/>
       </w:rPr>
-      <w:t>약품분석학실 | AI 협업 헬스케어 앱 개발 프로세스 보고서</w:t>
+      <w:t>약품분석학실 | 보건약학 헬스케어 앱 개발: AI 협업 프로세스 보고서</w:t>
     </w:r>
   </w:p>
 </w:ftr>

</xml_diff>

<commit_message>
docs: remove copilot, add AIMy integration with gjc, and remove school grant mention
</commit_message>
<xml_diff>
--- a/AI_활용_개발_프로세스_보고서.docx
+++ b/AI_활용_개발_프로세스_보고서.docx
@@ -631,7 +631,7 @@
                 <w:color w:val="334155"/>
                 <w:sz w:val="19"/>
               </w:rPr>
-              <w:t>기능 순서도와 의사코드 작성, 가재코드(gjc) 하네스 적용, 스킬 수집</w:t>
+              <w:t>기능 순서도와 의사코드 작성, 가재코드(gjc) 및 AIMy 연동, 스킬 수집</w:t>
             </w:r>
           </w:p>
         </w:tc>
@@ -655,7 +655,7 @@
                 <w:color w:val="334155"/>
                 <w:sz w:val="19"/>
               </w:rPr>
-              <w:t>의사코드 생성기, 가재코드, GitHub Skills</w:t>
+              <w:t>의사코드 생성기, 가재코드 &amp; AIMy, GitHub Skills</w:t>
             </w:r>
           </w:p>
         </w:tc>
@@ -791,7 +791,7 @@
                 <w:color w:val="334155"/>
                 <w:sz w:val="19"/>
               </w:rPr>
-              <w:t>figma-to-flutter, Riverpod, Copilot</w:t>
+              <w:t>figma-to-flutter, Riverpod, AI 에이전트</w:t>
             </w:r>
           </w:p>
         </w:tc>
@@ -1549,7 +1549,7 @@
           <w:color w:val="2563EB"/>
           <w:sz w:val="24"/>
         </w:rPr>
-        <w:t>3단계: 순서도·의사코드 설계, 가재코드(gjc) 하네스 적용 및 코딩 지침 표준화</w:t>
+        <w:t>3단계: 순서도·의사코드 설계, 가재코드(gjc) &amp; AIMy 하네스 적용 및 코딩 지침 표준화</w:t>
       </w:r>
     </w:p>
     <w:p>
@@ -1651,7 +1651,7 @@
           <w:color w:val="334155"/>
           <w:sz w:val="20"/>
         </w:rPr>
-        <w:t>가재코드(Gajae-Code / gjc) 에이전트 하네스 적용</w:t>
+        <w:t>가재코드(Gajae-Code / gjc) 에이전트 하네스 &amp; AIMy 다중 모델 연동</w:t>
       </w:r>
       <w:r>
         <w:rPr>
@@ -1699,6 +1699,46 @@
           <w:sz w:val="20"/>
         </w:rPr>
         <w:t>)를 도입함.</w:t>
+      </w:r>
+    </w:p>
+    <w:p>
+      <w:pPr>
+        <w:spacing w:before="30" w:after="30"/>
+        <w:ind w:left="720"/>
+      </w:pPr>
+      <w:r>
+        <w:rPr>
+          <w:rFonts w:ascii="맑은 고딕" w:hAnsi="맑은 고딕"/>
+          <w:b/>
+          <w:color w:val="6366F1"/>
+          <w:sz w:val="20"/>
+        </w:rPr>
+        <w:t xml:space="preserve">⁃ </w:t>
+      </w:r>
+      <w:r>
+        <w:rPr>
+          <w:rFonts w:ascii="맑은 고딕" w:hAnsi="맑은 고딕" w:eastAsia="맑은 고딕"/>
+          <w:color w:val="334155"/>
+          <w:sz w:val="20"/>
+        </w:rPr>
+        <w:t xml:space="preserve">다중 모델 라우팅 서비스인 </w:t>
+      </w:r>
+      <w:r>
+        <w:rPr>
+          <w:rFonts w:ascii="맑은 고딕" w:hAnsi="맑은 고딕" w:eastAsia="맑은 고딕"/>
+          <w:b/>
+          <w:color w:val="334155"/>
+          <w:sz w:val="20"/>
+        </w:rPr>
+        <w:t>AIMy</w:t>
+      </w:r>
+      <w:r>
+        <w:rPr>
+          <w:rFonts w:ascii="맑은 고딕" w:hAnsi="맑은 고딕" w:eastAsia="맑은 고딕"/>
+          <w:color w:val="334155"/>
+          <w:sz w:val="20"/>
+        </w:rPr>
+        <w:t>를 통해 작업 성격(요구사항 인터뷰, 계획 수립, 아키텍처 검토, 코드 실행)에 맞춰 각 역할(Agent)마다 최적의 AI 모델을 맞춤 연결하여 구동함.</w:t>
       </w:r>
     </w:p>
     <w:tbl>
@@ -1812,7 +1852,7 @@
           <w:color w:val="334155"/>
           <w:sz w:val="20"/>
         </w:rPr>
-        <w:t>터미널을 계속 주시하지 않아도 AI의 확인 질문을 디스코드나 텔레그램 메신저로 전송받아 모바일에서 답변하고 승인하는 원격 협업 환경을 구축함.</w:t>
+        <w:t>터미널을 계속 주시하지 않아도 AI의 확인 질문을 디스코드나 텔레그램 메신저로 전송받아 모바일에서 원격으로 답변하고 승인하는 협업 환경을 구축함.</w:t>
       </w:r>
     </w:p>
     <w:p>
@@ -2249,7 +2289,7 @@
           <w:color w:val="334155"/>
           <w:sz w:val="20"/>
         </w:rPr>
-        <w:t>학교 지원금(3만 원)을 활용하여 Google Play Console 개발자 계정 등록을 완료함.</w:t>
+        <w:t>Google Play Console 개발자 계정 등록을 완료함.</w:t>
       </w:r>
     </w:p>
     <w:p>
@@ -2596,7 +2636,7 @@
                 <w:color w:val="334155"/>
                 <w:sz w:val="19"/>
               </w:rPr>
-              <w:t>가재코드 (Gajae-Code / gjc)</w:t>
+              <w:t>가재코드 (gjc) &amp; AIMy</w:t>
             </w:r>
           </w:p>
         </w:tc>
@@ -2620,7 +2660,7 @@
                 <w:color w:val="334155"/>
                 <w:sz w:val="19"/>
               </w:rPr>
-              <w:t>AI 코딩 에이전트 안전 통제 하네스 및 실행기</w:t>
+              <w:t>AI 코딩 에이전트 안전 통제 하네스 및 다중 모델 라우팅 허브</w:t>
             </w:r>
           </w:p>
         </w:tc>
@@ -2644,7 +2684,7 @@
                 <w:color w:val="334155"/>
                 <w:sz w:val="19"/>
               </w:rPr>
-              <w:t>AI가 코드를 함부로 고치지 못하게 계획과 승인을 강제하는 안전벨트</w:t>
+              <w:t>AIMy로 다양한 AI 모델을 연결하고, 코드 수정 전 계획과 승인을 강제하는 안전 통제 시스템</w:t>
             </w:r>
           </w:p>
         </w:tc>
@@ -2749,7 +2789,7 @@
                 <w:color w:val="334155"/>
                 <w:sz w:val="19"/>
               </w:rPr>
-              <w:t>GitHub &amp; Copilot</w:t>
+              <w:t>GitHub</w:t>
             </w:r>
           </w:p>
         </w:tc>
@@ -2773,7 +2813,7 @@
                 <w:color w:val="334155"/>
                 <w:sz w:val="19"/>
               </w:rPr>
-              <w:t>코드 버전 관리 및 실시간 코드 자동완성</w:t>
+              <w:t>소스 코드 버전 관리(VCS) 및 협업 저장소</w:t>
             </w:r>
           </w:p>
         </w:tc>
@@ -2797,7 +2837,7 @@
                 <w:color w:val="334155"/>
                 <w:sz w:val="19"/>
               </w:rPr>
-              <w:t>작업 내역을 저장하는 저장소와 타이핑 보조 도구</w:t>
+              <w:t>작업 내역과 스킬 표준 파일을 안전하게 보관·동기화하는 클라우드 저장소</w:t>
             </w:r>
           </w:p>
         </w:tc>
@@ -3002,7 +3042,7 @@
           <w:color w:val="334155"/>
           <w:sz w:val="20"/>
         </w:rPr>
-        <w:t>하네스 도구를 통한 코드 변조 방지 및 비용 절감</w:t>
+        <w:t>하네스 도구와 다중 모델 연동을 통한 통제 및 비용 절감</w:t>
       </w:r>
       <w:r>
         <w:rPr>
@@ -3049,7 +3089,7 @@
           <w:color w:val="334155"/>
           <w:sz w:val="20"/>
         </w:rPr>
-        <w:t>)처럼 작업 계획을 먼저 승인받고 코드를 실행하는 절차를 두어, AI의 독단적인 코드 수정으로 인한 버그 발생과 불필요한 토큰 소모를 방지함.</w:t>
+        <w:t>)와 AIMy 연동을 통해 작업 단계별로 적합한 AI 모델을 배치하고, 작업 계획을 먼저 승인받고 코드를 실행하도록 하여 AI의 독단적인 코드 수정으로 인한 버그 발생과 불필요한 비용 소모를 방지함.</w:t>
       </w:r>
     </w:p>
     <w:p>

</xml_diff>

<commit_message>
docs: clarify project progress status (1-2 completed, 3 in progress, 4-5 planned) and update play console registration as future milestone
</commit_message>
<xml_diff>
--- a/AI_활용_개발_프로세스_보고서.docx
+++ b/AI_활용_개발_프로세스_보고서.docx
@@ -142,7 +142,7 @@
                 <w:color w:val="1E293B"/>
                 <w:sz w:val="18"/>
               </w:rPr>
-              <w:t>[1단계: 아이디어 검증] ➔ [2단계: 디자인 자동화] ➔ [3단계: 순서도·하네스·스킬 표준화] ➔ [4단계: 코드 변환] ➔ [5단계: 스토어 출시]</w:t>
+              <w:t>[1단계: 아이디어 검증(완료)] ➔ [2단계: 디자인 자동화(완료)] ➔ [3단계: 순서도·하네스·스킬(진행중)] ➔ [4단계: 코드 변환(예정)] ➔ [5단계: 스토어 출시(예정)]</w:t>
             </w:r>
           </w:p>
         </w:tc>
@@ -169,16 +169,17 @@
         </w:tblBorders>
       </w:tblPr>
       <w:tblGrid>
-        <w:gridCol w:w="1872"/>
-        <w:gridCol w:w="1872"/>
-        <w:gridCol w:w="1872"/>
-        <w:gridCol w:w="1872"/>
-        <w:gridCol w:w="1872"/>
+        <w:gridCol w:w="1560"/>
+        <w:gridCol w:w="1560"/>
+        <w:gridCol w:w="1560"/>
+        <w:gridCol w:w="1560"/>
+        <w:gridCol w:w="1560"/>
+        <w:gridCol w:w="1560"/>
       </w:tblGrid>
       <w:tr>
         <w:tc>
           <w:tcPr>
-            <w:tcW w:type="dxa" w:w="1872"/>
+            <w:tcW w:type="dxa" w:w="1560"/>
             <w:shd w:fill="EDE9FE"/>
             <w:tcMar>
               <w:top w:w="140" w:type="dxa"/>
@@ -204,7 +205,7 @@
         </w:tc>
         <w:tc>
           <w:tcPr>
-            <w:tcW w:type="dxa" w:w="1872"/>
+            <w:tcW w:type="dxa" w:w="1560"/>
             <w:shd w:fill="EDE9FE"/>
             <w:tcMar>
               <w:top w:w="140" w:type="dxa"/>
@@ -230,7 +231,33 @@
         </w:tc>
         <w:tc>
           <w:tcPr>
-            <w:tcW w:type="dxa" w:w="1872"/>
+            <w:tcW w:type="dxa" w:w="1560"/>
+            <w:shd w:fill="EDE9FE"/>
+            <w:tcMar>
+              <w:top w:w="140" w:type="dxa"/>
+              <w:bottom w:w="140" w:type="dxa"/>
+              <w:left w:w="160" w:type="dxa"/>
+              <w:right w:w="160" w:type="dxa"/>
+            </w:tcMar>
+          </w:tcPr>
+          <w:p>
+            <w:pPr>
+              <w:spacing w:before="40" w:after="40"/>
+            </w:pPr>
+            <w:r>
+              <w:rPr>
+                <w:rFonts w:ascii="맑은 고딕" w:hAnsi="맑은 고딕" w:eastAsia="맑은 고딕"/>
+                <w:b/>
+                <w:color w:val="4338CA"/>
+                <w:sz w:val="20"/>
+              </w:rPr>
+              <w:t>진행 상태</w:t>
+            </w:r>
+          </w:p>
+        </w:tc>
+        <w:tc>
+          <w:tcPr>
+            <w:tcW w:type="dxa" w:w="1560"/>
             <w:shd w:fill="EDE9FE"/>
             <w:tcMar>
               <w:top w:w="140" w:type="dxa"/>
@@ -256,7 +283,7 @@
         </w:tc>
         <w:tc>
           <w:tcPr>
-            <w:tcW w:type="dxa" w:w="1872"/>
+            <w:tcW w:type="dxa" w:w="1560"/>
             <w:shd w:fill="EDE9FE"/>
             <w:tcMar>
               <w:top w:w="140" w:type="dxa"/>
@@ -282,7 +309,7 @@
         </w:tc>
         <w:tc>
           <w:tcPr>
-            <w:tcW w:type="dxa" w:w="1872"/>
+            <w:tcW w:type="dxa" w:w="1560"/>
             <w:shd w:fill="EDE9FE"/>
             <w:tcMar>
               <w:top w:w="140" w:type="dxa"/>
@@ -310,7 +337,7 @@
       <w:tr>
         <w:tc>
           <w:tcPr>
-            <w:tcW w:type="dxa" w:w="1872"/>
+            <w:tcW w:type="dxa" w:w="1560"/>
             <w:tcMar>
               <w:top w:w="100" w:type="dxa"/>
               <w:bottom w:w="100" w:type="dxa"/>
@@ -335,7 +362,7 @@
         </w:tc>
         <w:tc>
           <w:tcPr>
-            <w:tcW w:type="dxa" w:w="1872"/>
+            <w:tcW w:type="dxa" w:w="1560"/>
             <w:tcMar>
               <w:top w:w="100" w:type="dxa"/>
               <w:bottom w:w="100" w:type="dxa"/>
@@ -360,7 +387,32 @@
         </w:tc>
         <w:tc>
           <w:tcPr>
-            <w:tcW w:type="dxa" w:w="1872"/>
+            <w:tcW w:type="dxa" w:w="1560"/>
+            <w:tcMar>
+              <w:top w:w="100" w:type="dxa"/>
+              <w:bottom w:w="100" w:type="dxa"/>
+              <w:left w:w="140" w:type="dxa"/>
+              <w:right w:w="140" w:type="dxa"/>
+            </w:tcMar>
+          </w:tcPr>
+          <w:p>
+            <w:pPr>
+              <w:spacing w:before="40" w:after="40"/>
+            </w:pPr>
+            <w:r>
+              <w:rPr>
+                <w:rFonts w:ascii="맑은 고딕" w:hAnsi="맑은 고딕" w:eastAsia="맑은 고딕"/>
+                <w:b/>
+                <w:color w:val="334155"/>
+                <w:sz w:val="19"/>
+              </w:rPr>
+              <w:t>완료</w:t>
+            </w:r>
+          </w:p>
+        </w:tc>
+        <w:tc>
+          <w:tcPr>
+            <w:tcW w:type="dxa" w:w="1560"/>
             <w:tcMar>
               <w:top w:w="100" w:type="dxa"/>
               <w:bottom w:w="100" w:type="dxa"/>
@@ -384,7 +436,7 @@
         </w:tc>
         <w:tc>
           <w:tcPr>
-            <w:tcW w:type="dxa" w:w="1872"/>
+            <w:tcW w:type="dxa" w:w="1560"/>
             <w:tcMar>
               <w:top w:w="100" w:type="dxa"/>
               <w:bottom w:w="100" w:type="dxa"/>
@@ -408,7 +460,7 @@
         </w:tc>
         <w:tc>
           <w:tcPr>
-            <w:tcW w:type="dxa" w:w="1872"/>
+            <w:tcW w:type="dxa" w:w="1560"/>
             <w:tcMar>
               <w:top w:w="100" w:type="dxa"/>
               <w:bottom w:w="100" w:type="dxa"/>
@@ -434,7 +486,7 @@
       <w:tr>
         <w:tc>
           <w:tcPr>
-            <w:tcW w:type="dxa" w:w="1872"/>
+            <w:tcW w:type="dxa" w:w="1560"/>
             <w:shd w:fill="F8FAFC"/>
             <w:tcMar>
               <w:top w:w="100" w:type="dxa"/>
@@ -460,7 +512,7 @@
         </w:tc>
         <w:tc>
           <w:tcPr>
-            <w:tcW w:type="dxa" w:w="1872"/>
+            <w:tcW w:type="dxa" w:w="1560"/>
             <w:shd w:fill="F8FAFC"/>
             <w:tcMar>
               <w:top w:w="100" w:type="dxa"/>
@@ -486,7 +538,33 @@
         </w:tc>
         <w:tc>
           <w:tcPr>
-            <w:tcW w:type="dxa" w:w="1872"/>
+            <w:tcW w:type="dxa" w:w="1560"/>
+            <w:shd w:fill="F8FAFC"/>
+            <w:tcMar>
+              <w:top w:w="100" w:type="dxa"/>
+              <w:bottom w:w="100" w:type="dxa"/>
+              <w:left w:w="140" w:type="dxa"/>
+              <w:right w:w="140" w:type="dxa"/>
+            </w:tcMar>
+          </w:tcPr>
+          <w:p>
+            <w:pPr>
+              <w:spacing w:before="40" w:after="40"/>
+            </w:pPr>
+            <w:r>
+              <w:rPr>
+                <w:rFonts w:ascii="맑은 고딕" w:hAnsi="맑은 고딕" w:eastAsia="맑은 고딕"/>
+                <w:b/>
+                <w:color w:val="334155"/>
+                <w:sz w:val="19"/>
+              </w:rPr>
+              <w:t>완료</w:t>
+            </w:r>
+          </w:p>
+        </w:tc>
+        <w:tc>
+          <w:tcPr>
+            <w:tcW w:type="dxa" w:w="1560"/>
             <w:shd w:fill="F8FAFC"/>
             <w:tcMar>
               <w:top w:w="100" w:type="dxa"/>
@@ -511,7 +589,7 @@
         </w:tc>
         <w:tc>
           <w:tcPr>
-            <w:tcW w:type="dxa" w:w="1872"/>
+            <w:tcW w:type="dxa" w:w="1560"/>
             <w:shd w:fill="F8FAFC"/>
             <w:tcMar>
               <w:top w:w="100" w:type="dxa"/>
@@ -536,7 +614,7 @@
         </w:tc>
         <w:tc>
           <w:tcPr>
-            <w:tcW w:type="dxa" w:w="1872"/>
+            <w:tcW w:type="dxa" w:w="1560"/>
             <w:shd w:fill="F8FAFC"/>
             <w:tcMar>
               <w:top w:w="100" w:type="dxa"/>
@@ -563,7 +641,7 @@
       <w:tr>
         <w:tc>
           <w:tcPr>
-            <w:tcW w:type="dxa" w:w="1872"/>
+            <w:tcW w:type="dxa" w:w="1560"/>
             <w:tcMar>
               <w:top w:w="100" w:type="dxa"/>
               <w:bottom w:w="100" w:type="dxa"/>
@@ -588,7 +666,7 @@
         </w:tc>
         <w:tc>
           <w:tcPr>
-            <w:tcW w:type="dxa" w:w="1872"/>
+            <w:tcW w:type="dxa" w:w="1560"/>
             <w:tcMar>
               <w:top w:w="100" w:type="dxa"/>
               <w:bottom w:w="100" w:type="dxa"/>
@@ -613,7 +691,32 @@
         </w:tc>
         <w:tc>
           <w:tcPr>
-            <w:tcW w:type="dxa" w:w="1872"/>
+            <w:tcW w:type="dxa" w:w="1560"/>
+            <w:tcMar>
+              <w:top w:w="100" w:type="dxa"/>
+              <w:bottom w:w="100" w:type="dxa"/>
+              <w:left w:w="140" w:type="dxa"/>
+              <w:right w:w="140" w:type="dxa"/>
+            </w:tcMar>
+          </w:tcPr>
+          <w:p>
+            <w:pPr>
+              <w:spacing w:before="40" w:after="40"/>
+            </w:pPr>
+            <w:r>
+              <w:rPr>
+                <w:rFonts w:ascii="맑은 고딕" w:hAnsi="맑은 고딕" w:eastAsia="맑은 고딕"/>
+                <w:b/>
+                <w:color w:val="334155"/>
+                <w:sz w:val="19"/>
+              </w:rPr>
+              <w:t>진행 중</w:t>
+            </w:r>
+          </w:p>
+        </w:tc>
+        <w:tc>
+          <w:tcPr>
+            <w:tcW w:type="dxa" w:w="1560"/>
             <w:tcMar>
               <w:top w:w="100" w:type="dxa"/>
               <w:bottom w:w="100" w:type="dxa"/>
@@ -637,7 +740,7 @@
         </w:tc>
         <w:tc>
           <w:tcPr>
-            <w:tcW w:type="dxa" w:w="1872"/>
+            <w:tcW w:type="dxa" w:w="1560"/>
             <w:tcMar>
               <w:top w:w="100" w:type="dxa"/>
               <w:bottom w:w="100" w:type="dxa"/>
@@ -661,7 +764,7 @@
         </w:tc>
         <w:tc>
           <w:tcPr>
-            <w:tcW w:type="dxa" w:w="1872"/>
+            <w:tcW w:type="dxa" w:w="1560"/>
             <w:tcMar>
               <w:top w:w="100" w:type="dxa"/>
               <w:bottom w:w="100" w:type="dxa"/>
@@ -695,7 +798,7 @@
       <w:tr>
         <w:tc>
           <w:tcPr>
-            <w:tcW w:type="dxa" w:w="1872"/>
+            <w:tcW w:type="dxa" w:w="1560"/>
             <w:shd w:fill="F8FAFC"/>
             <w:tcMar>
               <w:top w:w="100" w:type="dxa"/>
@@ -721,7 +824,7 @@
         </w:tc>
         <w:tc>
           <w:tcPr>
-            <w:tcW w:type="dxa" w:w="1872"/>
+            <w:tcW w:type="dxa" w:w="1560"/>
             <w:shd w:fill="F8FAFC"/>
             <w:tcMar>
               <w:top w:w="100" w:type="dxa"/>
@@ -747,7 +850,33 @@
         </w:tc>
         <w:tc>
           <w:tcPr>
-            <w:tcW w:type="dxa" w:w="1872"/>
+            <w:tcW w:type="dxa" w:w="1560"/>
+            <w:shd w:fill="F8FAFC"/>
+            <w:tcMar>
+              <w:top w:w="100" w:type="dxa"/>
+              <w:bottom w:w="100" w:type="dxa"/>
+              <w:left w:w="140" w:type="dxa"/>
+              <w:right w:w="140" w:type="dxa"/>
+            </w:tcMar>
+          </w:tcPr>
+          <w:p>
+            <w:pPr>
+              <w:spacing w:before="40" w:after="40"/>
+            </w:pPr>
+            <w:r>
+              <w:rPr>
+                <w:rFonts w:ascii="맑은 고딕" w:hAnsi="맑은 고딕" w:eastAsia="맑은 고딕"/>
+                <w:b/>
+                <w:color w:val="334155"/>
+                <w:sz w:val="19"/>
+              </w:rPr>
+              <w:t>예정</w:t>
+            </w:r>
+          </w:p>
+        </w:tc>
+        <w:tc>
+          <w:tcPr>
+            <w:tcW w:type="dxa" w:w="1560"/>
             <w:shd w:fill="F8FAFC"/>
             <w:tcMar>
               <w:top w:w="100" w:type="dxa"/>
@@ -772,7 +901,7 @@
         </w:tc>
         <w:tc>
           <w:tcPr>
-            <w:tcW w:type="dxa" w:w="1872"/>
+            <w:tcW w:type="dxa" w:w="1560"/>
             <w:shd w:fill="F8FAFC"/>
             <w:tcMar>
               <w:top w:w="100" w:type="dxa"/>
@@ -797,7 +926,7 @@
         </w:tc>
         <w:tc>
           <w:tcPr>
-            <w:tcW w:type="dxa" w:w="1872"/>
+            <w:tcW w:type="dxa" w:w="1560"/>
             <w:shd w:fill="F8FAFC"/>
             <w:tcMar>
               <w:top w:w="100" w:type="dxa"/>
@@ -824,7 +953,7 @@
       <w:tr>
         <w:tc>
           <w:tcPr>
-            <w:tcW w:type="dxa" w:w="1872"/>
+            <w:tcW w:type="dxa" w:w="1560"/>
             <w:tcMar>
               <w:top w:w="100" w:type="dxa"/>
               <w:bottom w:w="100" w:type="dxa"/>
@@ -849,7 +978,7 @@
         </w:tc>
         <w:tc>
           <w:tcPr>
-            <w:tcW w:type="dxa" w:w="1872"/>
+            <w:tcW w:type="dxa" w:w="1560"/>
             <w:tcMar>
               <w:top w:w="100" w:type="dxa"/>
               <w:bottom w:w="100" w:type="dxa"/>
@@ -874,7 +1003,32 @@
         </w:tc>
         <w:tc>
           <w:tcPr>
-            <w:tcW w:type="dxa" w:w="1872"/>
+            <w:tcW w:type="dxa" w:w="1560"/>
+            <w:tcMar>
+              <w:top w:w="100" w:type="dxa"/>
+              <w:bottom w:w="100" w:type="dxa"/>
+              <w:left w:w="140" w:type="dxa"/>
+              <w:right w:w="140" w:type="dxa"/>
+            </w:tcMar>
+          </w:tcPr>
+          <w:p>
+            <w:pPr>
+              <w:spacing w:before="40" w:after="40"/>
+            </w:pPr>
+            <w:r>
+              <w:rPr>
+                <w:rFonts w:ascii="맑은 고딕" w:hAnsi="맑은 고딕" w:eastAsia="맑은 고딕"/>
+                <w:b/>
+                <w:color w:val="334155"/>
+                <w:sz w:val="19"/>
+              </w:rPr>
+              <w:t>예정</w:t>
+            </w:r>
+          </w:p>
+        </w:tc>
+        <w:tc>
+          <w:tcPr>
+            <w:tcW w:type="dxa" w:w="1560"/>
             <w:tcMar>
               <w:top w:w="100" w:type="dxa"/>
               <w:bottom w:w="100" w:type="dxa"/>
@@ -892,13 +1046,13 @@
                 <w:color w:val="334155"/>
                 <w:sz w:val="19"/>
               </w:rPr>
-              <w:t>패키징, 개인정보 처리방침 작성, 구글 플레이스토어 심사 제출</w:t>
+              <w:t>개발자 등록, 패키징, 개인정보 처리방침 작성, 심사 제출</w:t>
             </w:r>
           </w:p>
         </w:tc>
         <w:tc>
           <w:tcPr>
-            <w:tcW w:type="dxa" w:w="1872"/>
+            <w:tcW w:type="dxa" w:w="1560"/>
             <w:tcMar>
               <w:top w:w="100" w:type="dxa"/>
               <w:bottom w:w="100" w:type="dxa"/>
@@ -922,7 +1076,7 @@
         </w:tc>
         <w:tc>
           <w:tcPr>
-            <w:tcW w:type="dxa" w:w="1872"/>
+            <w:tcW w:type="dxa" w:w="1560"/>
             <w:tcMar>
               <w:top w:w="100" w:type="dxa"/>
               <w:bottom w:w="100" w:type="dxa"/>
@@ -986,7 +1140,7 @@
           <w:color w:val="2563EB"/>
           <w:sz w:val="24"/>
         </w:rPr>
-        <w:t>1단계: 아이디어 도출 및 기술적 타당성 검증</w:t>
+        <w:t>1단계: 아이디어 도출 및 기술적 타당성 검증 (완료)</w:t>
       </w:r>
     </w:p>
     <w:p>
@@ -1220,7 +1374,7 @@
           <w:color w:val="2563EB"/>
           <w:sz w:val="24"/>
         </w:rPr>
-        <w:t>2단계: 화면 설계 및 Figma AI 자동화</w:t>
+        <w:t>2단계: 화면 설계 및 Figma AI 자동화 (완료)</w:t>
       </w:r>
     </w:p>
     <w:p>
@@ -1549,7 +1703,7 @@
           <w:color w:val="2563EB"/>
           <w:sz w:val="24"/>
         </w:rPr>
-        <w:t>3단계: 순서도·의사코드 설계, 가재코드(gjc) &amp; AIMy 하네스 적용 및 코딩 지침 표준화</w:t>
+        <w:t>3단계: 순서도·의사코드 설계, 가재코드(gjc) &amp; AIMy 하네스 적용 및 코딩 지침 표준화 (진행 중)</w:t>
       </w:r>
     </w:p>
     <w:p>
@@ -2038,7 +2192,7 @@
           <w:color w:val="2563EB"/>
           <w:sz w:val="24"/>
         </w:rPr>
-        <w:t>4단계: 모바일 앱 코드 전환 (Flutter)</w:t>
+        <w:t>4단계: 모바일 앱 코드 전환 (Flutter, 향후 진행 예정)</w:t>
       </w:r>
     </w:p>
     <w:p>
@@ -2094,7 +2248,7 @@
           <w:color w:val="334155"/>
           <w:sz w:val="20"/>
         </w:rPr>
-        <w:t>진행 방식</w:t>
+        <w:t>진행 계획</w:t>
       </w:r>
       <w:r>
         <w:rPr>
@@ -2202,7 +2356,7 @@
           <w:color w:val="2563EB"/>
           <w:sz w:val="24"/>
         </w:rPr>
-        <w:t>5단계: 앱 빌드 및 구글 플레이스토어 배포</w:t>
+        <w:t>5단계: 앱 빌드 및 구글 플레이스토어 배포 (향후 진행 예정)</w:t>
       </w:r>
     </w:p>
     <w:p>
@@ -2258,7 +2412,7 @@
           <w:color w:val="334155"/>
           <w:sz w:val="20"/>
         </w:rPr>
-        <w:t>진행 절차</w:t>
+        <w:t>진행 계획</w:t>
       </w:r>
       <w:r>
         <w:rPr>
@@ -2289,7 +2443,7 @@
           <w:color w:val="334155"/>
           <w:sz w:val="20"/>
         </w:rPr>
-        <w:t>Google Play Console 개발자 계정 등록을 완료함.</w:t>
+        <w:t>앱 핵심 기능 및 프로토타입 구현이 일정 수준 완성된 후 Google Play Console 개발자 계정 등록을 진행할 예정임.</w:t>
       </w:r>
     </w:p>
     <w:p>
@@ -2335,7 +2489,7 @@
           <w:color w:val="334155"/>
           <w:sz w:val="20"/>
         </w:rPr>
-        <w:t>AI를 활용하여 앱 권한 명세서와 개인정보 처리방침 문서를 작성한 뒤 스토어 심사를 제출함.</w:t>
+        <w:t>AI를 활용하여 앱 권한 명세서와 개인정보 처리방침 문서를 작성한 뒤 스토어 심사를 제출할 계획임.</w:t>
       </w:r>
     </w:p>
     <w:p>

</xml_diff>

<commit_message>
docs: clarify role division in stage 3 (gjc rules vs Antigravity drafting), move AIMy to stage 4, and list AI chat models
</commit_message>
<xml_diff>
--- a/AI_활용_개발_프로세스_보고서.docx
+++ b/AI_활용_개발_프로세스_보고서.docx
@@ -27,7 +27,7 @@
           <w:color w:val="334155"/>
           <w:sz w:val="21"/>
         </w:rPr>
-        <w:t>약학 전공 학부생 팀이 기획 아이디어 발굴부터 피그마(Figma) 화면 디자인, 순서도 및 로직 설계, 가재코드(gjc) 하네스 적용, Flutter 코드 변환 및 구글 플레이스토어 출시 계획까지 진행하며 AI를 활용한 실무 협업 프로세스를 정리한 보고서임. 비전공자 및 청중이 쉽게 이해할 수 있도록 실제 협업 흐름과 도구별 역할을 중심으로 기술함.</w:t>
+        <w:t>약학 전공 학부생 팀이 기획 아이디어 발굴부터 피그마(Figma) 화면 디자인, 순서도 및 로직 설계, 가재코드(gjc) 하네스 적용, Antigravity 기반 실무 제작, Flutter 코드 변환 및 구글 플레이스토어 출시 계획까지 진행하며 AI를 활용한 실무 협업 프로세스를 정리한 보고서임. 비전공자 및 청중이 쉽게 이해할 수 있도록 실제 협업 흐름과 도구별 역할을 중심으로 기술함.</w:t>
       </w:r>
     </w:p>
     <w:p>
@@ -142,7 +142,7 @@
                 <w:color w:val="1E293B"/>
                 <w:sz w:val="18"/>
               </w:rPr>
-              <w:t>[1단계: 아이디어 검증(완료)] ➔ [2단계: 디자인 자동화(완료)] ➔ [3단계: 순서도·하네스·스킬(진행중)] ➔ [4단계: 코드 변환(예정)] ➔ [5단계: 스토어 출시(예정)]</w:t>
+              <w:t>[1단계: 아이디어 검증(완료)] ➔ [2단계: 디자인 자동화(완료)] ➔ [3단계: 순서도·하네스·문서화(진행중)] ➔ [4단계: 코드 변환(예정)] ➔ [5단계: 스토어 출시(예정)]</w:t>
             </w:r>
           </w:p>
         </w:tc>
@@ -454,7 +454,7 @@
                 <w:color w:val="334155"/>
                 <w:sz w:val="19"/>
               </w:rPr>
-              <w:t>AI 대화 모델</w:t>
+              <w:t>AI 대화 모델 (ChatGPT, Gemini, Claude, Copilot)</w:t>
             </w:r>
           </w:p>
         </w:tc>
@@ -685,7 +685,7 @@
                 <w:color w:val="334155"/>
                 <w:sz w:val="19"/>
               </w:rPr>
-              <w:t>순서도·하네스 및 규칙 표준화</w:t>
+              <w:t>순서도·하네스 및 PRD 문서화</w:t>
             </w:r>
           </w:p>
         </w:tc>
@@ -734,7 +734,7 @@
                 <w:color w:val="334155"/>
                 <w:sz w:val="19"/>
               </w:rPr>
-              <w:t>기능 순서도와 의사코드 작성, 가재코드(gjc) 및 AIMy 연동, 스킬 수집</w:t>
+              <w:t>순서도 및 의사코드 작성, gjc 하네스 규칙 수립, Antigravity 실무 문서화</w:t>
             </w:r>
           </w:p>
         </w:tc>
@@ -758,7 +758,7 @@
                 <w:color w:val="334155"/>
                 <w:sz w:val="19"/>
               </w:rPr>
-              <w:t>의사코드 생성기, 가재코드 &amp; AIMy, GitHub Skills</w:t>
+              <w:t>가재코드(gjc), Antigravity, GitHub Skills</w:t>
             </w:r>
           </w:p>
         </w:tc>
@@ -895,7 +895,7 @@
                 <w:color w:val="334155"/>
                 <w:sz w:val="19"/>
               </w:rPr>
-              <w:t>디자인을 Flutter 위젯으로 변환, 클린 아키텍처 및 로컬 DB 연동</w:t>
+              <w:t>디자인을 Flutter 위젯으로 변환, gjc &amp; AIMy 다중 모델 연동, 클린 아키텍처 구축</w:t>
             </w:r>
           </w:p>
         </w:tc>
@@ -920,7 +920,7 @@
                 <w:color w:val="334155"/>
                 <w:sz w:val="19"/>
               </w:rPr>
-              <w:t>figma-to-flutter, Riverpod, AI 에이전트</w:t>
+              <w:t>figma-to-flutter, Riverpod, 가재코드 &amp; AIMy</w:t>
             </w:r>
           </w:p>
         </w:tc>
@@ -1218,7 +1218,24 @@
           <w:color w:val="334155"/>
           <w:sz w:val="20"/>
         </w:rPr>
-        <w:t>아이디어가 모바일 환경에서 실제로 구현 가능한지, 환자에게 임상적 부작용은 없는지 AI에게 질문하며 구체적인 개발 범위를 좁힘.</w:t>
+        <w:t xml:space="preserve">아이디어가 모바일 환경에서 실제로 구현 가능한지, 환자에게 임상적 부작용은 없는지 </w:t>
+      </w:r>
+      <w:r>
+        <w:rPr>
+          <w:rFonts w:ascii="맑은 고딕" w:hAnsi="맑은 고딕" w:eastAsia="맑은 고딕"/>
+          <w:b/>
+          <w:color w:val="334155"/>
+          <w:sz w:val="20"/>
+        </w:rPr>
+        <w:t>ChatGPT, Gemini, Claude, Copilot</w:t>
+      </w:r>
+      <w:r>
+        <w:rPr>
+          <w:rFonts w:ascii="맑은 고딕" w:hAnsi="맑은 고딕" w:eastAsia="맑은 고딕"/>
+          <w:color w:val="334155"/>
+          <w:sz w:val="20"/>
+        </w:rPr>
+        <w:t xml:space="preserve"> 등 다양한 생성형 AI 대화 모델을 사운딩 보드로 활용해 질문하며 구체적인 개발 범위를 좁힘.</w:t>
       </w:r>
     </w:p>
     <w:p>
@@ -1585,7 +1602,7 @@
           <w:color w:val="334155"/>
           <w:sz w:val="20"/>
         </w:rPr>
-        <w:t>이를 해결하기 위해 외부 AI 에이전트가 피그마 화면 구조를 직접 읽고 수정할 수 있는 연결 통로인 Figma MCP를 설정함.</w:t>
+        <w:t>이를 해결하기 위해 외부 AI 에이전트(Antigravity)가 피그마 화면 구조를 직접 읽고 수정할 수 있는 연결 통로인 Figma MCP를 설정함.</w:t>
       </w:r>
     </w:p>
     <w:tbl>
@@ -1703,7 +1720,7 @@
           <w:color w:val="2563EB"/>
           <w:sz w:val="24"/>
         </w:rPr>
-        <w:t>3단계: 순서도·의사코드 설계, 가재코드(gjc) &amp; AIMy 하네스 적용 및 코딩 지침 표준화 (진행 중)</w:t>
+        <w:t>3단계: 순서도·의사코드 설계, 하네스 안전 규칙 수립 및 PRD 문서화 (진행 중)</w:t>
       </w:r>
     </w:p>
     <w:p>
@@ -1805,7 +1822,154 @@
           <w:color w:val="334155"/>
           <w:sz w:val="20"/>
         </w:rPr>
-        <w:t>가재코드(Gajae-Code / gjc) 에이전트 하네스 &amp; AIMy 다중 모델 연동</w:t>
+        <w:t>가재코드(gjc)와 Antigravity의 역할 분담</w:t>
+      </w:r>
+      <w:r>
+        <w:rPr>
+          <w:rFonts w:ascii="맑은 고딕" w:hAnsi="맑은 고딕" w:eastAsia="맑은 고딕"/>
+          <w:color w:val="334155"/>
+          <w:sz w:val="20"/>
+        </w:rPr>
+        <w:t>:</w:t>
+      </w:r>
+    </w:p>
+    <w:p>
+      <w:pPr>
+        <w:spacing w:before="30" w:after="30"/>
+        <w:ind w:left="720"/>
+      </w:pPr>
+      <w:r>
+        <w:rPr>
+          <w:rFonts w:ascii="맑은 고딕" w:hAnsi="맑은 고딕"/>
+          <w:b/>
+          <w:color w:val="6366F1"/>
+          <w:sz w:val="20"/>
+        </w:rPr>
+        <w:t xml:space="preserve">⁃ </w:t>
+      </w:r>
+      <w:r>
+        <w:rPr>
+          <w:rFonts w:ascii="맑은 고딕" w:hAnsi="맑은 고딕" w:eastAsia="맑은 고딕"/>
+          <w:b/>
+          <w:color w:val="334155"/>
+          <w:sz w:val="20"/>
+        </w:rPr>
+        <w:t>가재코드(Gajae-Code / gjc)</w:t>
+      </w:r>
+      <w:r>
+        <w:rPr>
+          <w:rFonts w:ascii="맑은 고딕" w:hAnsi="맑은 고딕" w:eastAsia="맑은 고딕"/>
+          <w:color w:val="334155"/>
+          <w:sz w:val="20"/>
+        </w:rPr>
+        <w:t xml:space="preserve">: 코딩 AI가 기존 코드를 충분히 파악하지 않고 성급하게 수정하여 전체 구조를 망가뜨리는 문제를 방지하기 위해 </w:t>
+      </w:r>
+      <w:r>
+        <w:rPr>
+          <w:rFonts w:ascii="맑은 고딕" w:hAnsi="맑은 고딕" w:eastAsia="맑은 고딕"/>
+          <w:b/>
+          <w:color w:val="334155"/>
+          <w:sz w:val="20"/>
+        </w:rPr>
+        <w:t>안전 규칙과 작업 통제 절차</w:t>
+      </w:r>
+      <w:r>
+        <w:rPr>
+          <w:rFonts w:ascii="맑은 고딕" w:hAnsi="맑은 고딕" w:eastAsia="맑은 고딕"/>
+          <w:color w:val="334155"/>
+          <w:sz w:val="20"/>
+        </w:rPr>
+        <w:t>를 수립함. [질문 및 요구사항 확인 ➔ 작업 계획 수립 및 검토 ➔ 사용자 승인 후 코드 실행]이라는 하네스 절차를 강제하고, 모바일 메신저(디스코드/텔레그램) 원격 승인 환경을 구축함.</w:t>
+      </w:r>
+    </w:p>
+    <w:p>
+      <w:pPr>
+        <w:spacing w:before="30" w:after="30"/>
+        <w:ind w:left="720"/>
+      </w:pPr>
+      <w:r>
+        <w:rPr>
+          <w:rFonts w:ascii="맑은 고딕" w:hAnsi="맑은 고딕"/>
+          <w:b/>
+          <w:color w:val="6366F1"/>
+          <w:sz w:val="20"/>
+        </w:rPr>
+        <w:t xml:space="preserve">⁃ </w:t>
+      </w:r>
+      <w:r>
+        <w:rPr>
+          <w:rFonts w:ascii="맑은 고딕" w:hAnsi="맑은 고딕" w:eastAsia="맑은 고딕"/>
+          <w:b/>
+          <w:color w:val="334155"/>
+          <w:sz w:val="20"/>
+        </w:rPr>
+        <w:t>Antigravity (AI 실무 파트너)</w:t>
+      </w:r>
+      <w:r>
+        <w:rPr>
+          <w:rFonts w:ascii="맑은 고딕" w:hAnsi="맑은 고딕" w:eastAsia="맑은 고딕"/>
+          <w:color w:val="334155"/>
+          <w:sz w:val="20"/>
+        </w:rPr>
+        <w:t xml:space="preserve">: 공식 엔지니어링 문서인 </w:t>
+      </w:r>
+      <w:r>
+        <w:rPr>
+          <w:rFonts w:ascii="맑은 고딕" w:hAnsi="맑은 고딕" w:eastAsia="맑은 고딕"/>
+          <w:color w:val="2563EB"/>
+          <w:sz w:val="20"/>
+          <w:u w:val="single"/>
+        </w:rPr>
+        <w:t>PRD_기획명세서.md</w:t>
+      </w:r>
+      <w:r>
+        <w:rPr>
+          <w:rFonts w:ascii="맑은 고딕" w:hAnsi="맑은 고딕" w:eastAsia="맑은 고딕"/>
+          <w:color w:val="334155"/>
+          <w:sz w:val="20"/>
+        </w:rPr>
+        <w:t xml:space="preserve"> 및 Word 문서 변환, 학술적 배경 보고서 작성, 순서도 및 의사코드 실체화, Figma 스크립트 실행, Git 형상 관리 등 </w:t>
+      </w:r>
+      <w:r>
+        <w:rPr>
+          <w:rFonts w:ascii="맑은 고딕" w:hAnsi="맑은 고딕" w:eastAsia="맑은 고딕"/>
+          <w:b/>
+          <w:color w:val="334155"/>
+          <w:sz w:val="20"/>
+        </w:rPr>
+        <w:t>실제 프로젝트 산출물을 직접 제작하고 구체화</w:t>
+      </w:r>
+      <w:r>
+        <w:rPr>
+          <w:rFonts w:ascii="맑은 고딕" w:hAnsi="맑은 고딕" w:eastAsia="맑은 고딕"/>
+          <w:color w:val="334155"/>
+          <w:sz w:val="20"/>
+        </w:rPr>
+        <w:t>함.</w:t>
+      </w:r>
+    </w:p>
+    <w:p>
+      <w:pPr>
+        <w:spacing w:before="30" w:after="30"/>
+        <w:ind w:left="360"/>
+      </w:pPr>
+      <w:r>
+        <w:rPr>
+          <w:rFonts w:ascii="맑은 고딕" w:hAnsi="맑은 고딕"/>
+          <w:b/>
+          <w:color w:val="6366F1"/>
+          <w:sz w:val="20"/>
+        </w:rPr>
+        <w:t xml:space="preserve">• </w:t>
+      </w:r>
+      <w:r>
+        <w:rPr>
+          <w:rFonts w:ascii="맑은 고딕" w:hAnsi="맑은 고딕" w:eastAsia="맑은 고딕"/>
+          <w:b/>
+          <w:color w:val="334155"/>
+          <w:sz w:val="20"/>
+        </w:rPr>
+        <w:t>AI 스킬(Skills) 표준화</w:t>
       </w:r>
       <w:r>
         <w:rPr>
@@ -1836,272 +2000,7 @@
           <w:color w:val="334155"/>
           <w:sz w:val="20"/>
         </w:rPr>
-        <w:t>코딩 AI가 기존 코드를 충분히 파악하지 않고 성급하게 수정하여 전체 구조를 망가뜨리거나 API 비용을 낭비하는 문제를 방지하기 위해 오픈소스 도구인 가재코드(</w:t>
-      </w:r>
-      <w:r>
-        <w:rPr>
-          <w:rFonts w:ascii="Consolas" w:hAnsi="Consolas" w:eastAsia="맑은 고딕"/>
-          <w:color w:val="B42846"/>
-          <w:sz w:val="19"/>
-        </w:rPr>
-        <w:t>gjc</w:t>
-      </w:r>
-      <w:r>
-        <w:rPr>
-          <w:rFonts w:ascii="맑은 고딕" w:hAnsi="맑은 고딕" w:eastAsia="맑은 고딕"/>
-          <w:color w:val="334155"/>
-          <w:sz w:val="20"/>
-        </w:rPr>
-        <w:t>)를 도입함.</w:t>
-      </w:r>
-    </w:p>
-    <w:p>
-      <w:pPr>
-        <w:spacing w:before="30" w:after="30"/>
-        <w:ind w:left="720"/>
-      </w:pPr>
-      <w:r>
-        <w:rPr>
-          <w:rFonts w:ascii="맑은 고딕" w:hAnsi="맑은 고딕"/>
-          <w:b/>
-          <w:color w:val="6366F1"/>
-          <w:sz w:val="20"/>
-        </w:rPr>
-        <w:t xml:space="preserve">⁃ </w:t>
-      </w:r>
-      <w:r>
-        <w:rPr>
-          <w:rFonts w:ascii="맑은 고딕" w:hAnsi="맑은 고딕" w:eastAsia="맑은 고딕"/>
-          <w:color w:val="334155"/>
-          <w:sz w:val="20"/>
-        </w:rPr>
-        <w:t xml:space="preserve">다중 모델 라우팅 서비스인 </w:t>
-      </w:r>
-      <w:r>
-        <w:rPr>
-          <w:rFonts w:ascii="맑은 고딕" w:hAnsi="맑은 고딕" w:eastAsia="맑은 고딕"/>
-          <w:b/>
-          <w:color w:val="334155"/>
-          <w:sz w:val="20"/>
-        </w:rPr>
-        <w:t>AIMy</w:t>
-      </w:r>
-      <w:r>
-        <w:rPr>
-          <w:rFonts w:ascii="맑은 고딕" w:hAnsi="맑은 고딕" w:eastAsia="맑은 고딕"/>
-          <w:color w:val="334155"/>
-          <w:sz w:val="20"/>
-        </w:rPr>
-        <w:t>를 통해 작업 성격(요구사항 인터뷰, 계획 수립, 아키텍처 검토, 코드 실행)에 맞춰 각 역할(Agent)마다 최적의 AI 모델을 맞춤 연결하여 구동함.</w:t>
-      </w:r>
-    </w:p>
-    <w:tbl>
-      <w:tblPr>
-        <w:tblW w:type="auto" w:w="0"/>
-        <w:jc w:val="center"/>
-        <w:tblLayout w:type="fixed"/>
-        <w:tblLook w:firstColumn="1" w:firstRow="1" w:lastColumn="0" w:lastRow="0" w:noHBand="0" w:noVBand="1" w:val="04A0"/>
-        <w:tblBorders>
-          <w:top w:val="none"/>
-          <w:bottom w:val="none"/>
-          <w:left w:val="single" w:sz="24" w:space="0" w:color="3B82F6"/>
-          <w:right w:val="none"/>
-          <w:insideH w:val="none"/>
-          <w:insideV w:val="none"/>
-        </w:tblBorders>
-      </w:tblPr>
-      <w:tblGrid>
-        <w:gridCol w:w="9360"/>
-      </w:tblGrid>
-      <w:tr>
-        <w:tc>
-          <w:tcPr>
-            <w:tcW w:type="dxa" w:w="9360"/>
-            <w:shd w:fill="EFF6FF"/>
-            <w:tcMar>
-              <w:top w:w="140" w:type="dxa"/>
-              <w:bottom w:w="140" w:type="dxa"/>
-              <w:left w:w="200" w:type="dxa"/>
-              <w:right w:w="140" w:type="dxa"/>
-            </w:tcMar>
-          </w:tcPr>
-          <w:p>
-            <w:pPr>
-              <w:spacing w:before="60" w:after="60"/>
-            </w:pPr>
-            <w:r>
-              <w:rPr>
-                <w:rFonts w:ascii="맑은 고딕" w:hAnsi="맑은 고딕" w:eastAsia="맑은 고딕"/>
-                <w:i/>
-                <w:color w:val="1E3A8A"/>
-                <w:sz w:val="20"/>
-              </w:rPr>
-              <w:t xml:space="preserve">💡 </w:t>
-            </w:r>
-            <w:r>
-              <w:rPr>
-                <w:rFonts w:ascii="맑은 고딕" w:hAnsi="맑은 고딕" w:eastAsia="맑은 고딕"/>
-                <w:b/>
-                <w:i/>
-                <w:color w:val="1E3A8A"/>
-                <w:sz w:val="20"/>
-              </w:rPr>
-              <w:t>참고: 에이전트 하네스(Harness)란?</w:t>
-            </w:r>
-            <w:r>
-              <w:rPr>
-                <w:rFonts w:ascii="맑은 고딕" w:hAnsi="맑은 고딕" w:eastAsia="맑은 고딕"/>
-                <w:i/>
-                <w:color w:val="1E3A8A"/>
-                <w:sz w:val="20"/>
-              </w:rPr>
-              <w:br/>
-              <w:t xml:space="preserve">안전벨트처럼 코딩 AI가 임의로 코드를 수정하지 못하도록 </w:t>
-            </w:r>
-            <w:r>
-              <w:rPr>
-                <w:rFonts w:ascii="맑은 고딕" w:hAnsi="맑은 고딕" w:eastAsia="맑은 고딕"/>
-                <w:b/>
-                <w:i/>
-                <w:color w:val="1E3A8A"/>
-                <w:sz w:val="20"/>
-              </w:rPr>
-              <w:t>[질문 및 요구사항 확인 ➔ 작업 계획 수립 및 검토 ➔ 사용자 승인 후 코드 실행]</w:t>
-            </w:r>
-            <w:r>
-              <w:rPr>
-                <w:rFonts w:ascii="맑은 고딕" w:hAnsi="맑은 고딕" w:eastAsia="맑은 고딕"/>
-                <w:i/>
-                <w:color w:val="1E3A8A"/>
-                <w:sz w:val="20"/>
-              </w:rPr>
-              <w:t>의 통제 절차를 강제하는 도구임.</w:t>
-            </w:r>
-          </w:p>
-        </w:tc>
-      </w:tr>
-    </w:tbl>
-    <w:p>
-      <w:pPr>
-        <w:spacing w:before="0" w:after="60"/>
-      </w:pPr>
-    </w:p>
-    <w:p>
-      <w:pPr>
-        <w:spacing w:before="30" w:after="30"/>
-        <w:ind w:left="720"/>
-      </w:pPr>
-      <w:r>
-        <w:rPr>
-          <w:rFonts w:ascii="맑은 고딕" w:hAnsi="맑은 고딕"/>
-          <w:b/>
-          <w:color w:val="6366F1"/>
-          <w:sz w:val="20"/>
-        </w:rPr>
-        <w:t xml:space="preserve">⁃ </w:t>
-      </w:r>
-      <w:r>
-        <w:rPr>
-          <w:rFonts w:ascii="맑은 고딕" w:hAnsi="맑은 고딕" w:eastAsia="맑은 고딕"/>
-          <w:color w:val="334155"/>
-          <w:sz w:val="20"/>
-        </w:rPr>
-        <w:t>터미널을 계속 주시하지 않아도 AI의 확인 질문을 디스코드나 텔레그램 메신저로 전송받아 모바일에서 원격으로 답변하고 승인하는 협업 환경을 구축함.</w:t>
-      </w:r>
-    </w:p>
-    <w:p>
-      <w:pPr>
-        <w:spacing w:before="30" w:after="30"/>
-        <w:ind w:left="360"/>
-      </w:pPr>
-      <w:r>
-        <w:rPr>
-          <w:rFonts w:ascii="맑은 고딕" w:hAnsi="맑은 고딕"/>
-          <w:b/>
-          <w:color w:val="6366F1"/>
-          <w:sz w:val="20"/>
-        </w:rPr>
-        <w:t xml:space="preserve">• </w:t>
-      </w:r>
-      <w:r>
-        <w:rPr>
-          <w:rFonts w:ascii="맑은 고딕" w:hAnsi="맑은 고딕" w:eastAsia="맑은 고딕"/>
-          <w:b/>
-          <w:color w:val="334155"/>
-          <w:sz w:val="20"/>
-        </w:rPr>
-        <w:t>기획명세서(PRD) 수립 및 AI 스킬(Skills) 장착</w:t>
-      </w:r>
-      <w:r>
-        <w:rPr>
-          <w:rFonts w:ascii="맑은 고딕" w:hAnsi="맑은 고딕" w:eastAsia="맑은 고딕"/>
-          <w:color w:val="334155"/>
-          <w:sz w:val="20"/>
-        </w:rPr>
-        <w:t>:</w:t>
-      </w:r>
-    </w:p>
-    <w:p>
-      <w:pPr>
-        <w:spacing w:before="30" w:after="30"/>
-        <w:ind w:left="720"/>
-      </w:pPr>
-      <w:r>
-        <w:rPr>
-          <w:rFonts w:ascii="맑은 고딕" w:hAnsi="맑은 고딕"/>
-          <w:b/>
-          <w:color w:val="6366F1"/>
-          <w:sz w:val="20"/>
-        </w:rPr>
-        <w:t xml:space="preserve">⁃ </w:t>
-      </w:r>
-      <w:r>
-        <w:rPr>
-          <w:rFonts w:ascii="맑은 고딕" w:hAnsi="맑은 고딕" w:eastAsia="맑은 고딕"/>
-          <w:color w:val="334155"/>
-          <w:sz w:val="20"/>
-        </w:rPr>
-        <w:t xml:space="preserve">피그마 디자인과 로직 설계를 취합하여 공식 엔지니어링 문서인 </w:t>
-      </w:r>
-      <w:r>
-        <w:rPr>
-          <w:rFonts w:ascii="맑은 고딕" w:hAnsi="맑은 고딕" w:eastAsia="맑은 고딕"/>
-          <w:color w:val="2563EB"/>
-          <w:sz w:val="20"/>
-          <w:u w:val="single"/>
-        </w:rPr>
-        <w:t>PRD_기획명세서.md</w:t>
-      </w:r>
-      <w:r>
-        <w:rPr>
-          <w:rFonts w:ascii="맑은 고딕" w:hAnsi="맑은 고딕" w:eastAsia="맑은 고딕"/>
-          <w:color w:val="334155"/>
-          <w:sz w:val="20"/>
-        </w:rPr>
-        <w:t>로 정리함.</w:t>
-      </w:r>
-    </w:p>
-    <w:p>
-      <w:pPr>
-        <w:spacing w:before="30" w:after="30"/>
-        <w:ind w:left="720"/>
-      </w:pPr>
-      <w:r>
-        <w:rPr>
-          <w:rFonts w:ascii="맑은 고딕" w:hAnsi="맑은 고딕"/>
-          <w:b/>
-          <w:color w:val="6366F1"/>
-          <w:sz w:val="20"/>
-        </w:rPr>
-        <w:t xml:space="preserve">⁃ </w:t>
-      </w:r>
-      <w:r>
-        <w:rPr>
-          <w:rFonts w:ascii="맑은 고딕" w:hAnsi="맑은 고딕" w:eastAsia="맑은 고딕"/>
-          <w:color w:val="334155"/>
-          <w:sz w:val="20"/>
-        </w:rPr>
-        <w:t>AI가 코드를 작성할 때 일관된 아키텍처 규칙을 따르도록 GitHub에서 검증된 스킬 파일들(</w:t>
+        <w:t>AI가 향후 코드를 작성할 때 일관된 아키텍처 규칙을 따르도록 GitHub에서 검증된 스킬 파일들(</w:t>
       </w:r>
       <w:r>
         <w:rPr>
@@ -2310,7 +2209,24 @@
           <w:color w:val="334155"/>
           <w:sz w:val="20"/>
         </w:rPr>
-        <w:t>화면 UI와 내부 데이터 처리 로직을 명확히 분리하기 위해 클린 아키텍처(Riverpod 상태 관리)를 적용함.</w:t>
+        <w:t xml:space="preserve">실제 코드 작성 시 </w:t>
+      </w:r>
+      <w:r>
+        <w:rPr>
+          <w:rFonts w:ascii="맑은 고딕" w:hAnsi="맑은 고딕" w:eastAsia="맑은 고딕"/>
+          <w:b/>
+          <w:color w:val="334155"/>
+          <w:sz w:val="20"/>
+        </w:rPr>
+        <w:t>가재코드(`gjc`)와 다중 모델 라우팅 허브인 `AIMy`를 본격적으로 연동</w:t>
+      </w:r>
+      <w:r>
+        <w:rPr>
+          <w:rFonts w:ascii="맑은 고딕" w:hAnsi="맑은 고딕" w:eastAsia="맑은 고딕"/>
+          <w:color w:val="334155"/>
+          <w:sz w:val="20"/>
+        </w:rPr>
+        <w:t>하여 활용함. 작업 성격(아키텍처 검토, 위젯 UI 생성, 로직 작성, 단위 테스트)에 맞춰 각 역할(Agent)마다 서로 다른 최적의 AI 모델(Claude, GPT, Gemini 등)을 AIMy로 연결하여 투입하고, 가재코드의 승인 절차를 거쳐 안전하게 구현함.</w:t>
       </w:r>
     </w:p>
     <w:p>
@@ -2333,7 +2249,7 @@
           <w:color w:val="334155"/>
           <w:sz w:val="20"/>
         </w:rPr>
-        <w:t>개발 담당 팀원이 AI 에이전트와 페어 프로그래밍을 진행하며 누락된 예외 상황을 보완하고 로컬 데이터베이스 연동 및 단위 테스트를 수행함.</w:t>
+        <w:t>화면 UI와 내부 데이터 처리 로직을 명확히 분리하기 위해 클린 아키텍처(Riverpod 상태 관리)를 적용하고 로컬 데이터베이스 연동 및 단위 테스트를 수행함.</w:t>
       </w:r>
     </w:p>
     <w:p>
@@ -2637,7 +2553,7 @@
                 <w:color w:val="334155"/>
                 <w:sz w:val="19"/>
               </w:rPr>
-              <w:t>Figma &amp; Figma AI</w:t>
+              <w:t>AI 대화 모델 (ChatGPT, Gemini, Claude, Copilot)</w:t>
             </w:r>
           </w:p>
         </w:tc>
@@ -2661,7 +2577,7 @@
                 <w:color w:val="334155"/>
                 <w:sz w:val="19"/>
               </w:rPr>
-              <w:t>UI/UX 화면 디자인 및 초기 레이아웃 생성</w:t>
+              <w:t>아이디어 발굴, 브레인스토밍 및 실현 가능성 질의</w:t>
             </w:r>
           </w:p>
         </w:tc>
@@ -2685,7 +2601,7 @@
                 <w:color w:val="334155"/>
                 <w:sz w:val="19"/>
               </w:rPr>
-              <w:t>화면 형태와 버튼 배치를 그리는 설계도</w:t>
+              <w:t>아이디어를 검토하고 타당성을 확인하는 대화형 보조 도구</w:t>
             </w:r>
           </w:p>
         </w:tc>
@@ -2713,7 +2629,7 @@
                 <w:color w:val="334155"/>
                 <w:sz w:val="19"/>
               </w:rPr>
-              <w:t>Figma MCP</w:t>
+              <w:t>Figma &amp; Figma AI</w:t>
             </w:r>
           </w:p>
         </w:tc>
@@ -2738,7 +2654,7 @@
                 <w:color w:val="334155"/>
                 <w:sz w:val="19"/>
               </w:rPr>
-              <w:t>AI가 피그마 캔버스를 직접 제어하는 연결 통로</w:t>
+              <w:t>UI/UX 화면 디자인 및 초기 레이아웃 생성</w:t>
             </w:r>
           </w:p>
         </w:tc>
@@ -2763,7 +2679,7 @@
                 <w:color w:val="334155"/>
                 <w:sz w:val="19"/>
               </w:rPr>
-              <w:t>AI가 피그마 프로그램을 직접 조작할 수 있도록 돕는 도구</w:t>
+              <w:t>화면 형태와 버튼 배치를 그리는 설계도</w:t>
             </w:r>
           </w:p>
         </w:tc>
@@ -2790,7 +2706,7 @@
                 <w:color w:val="334155"/>
                 <w:sz w:val="19"/>
               </w:rPr>
-              <w:t>가재코드 (gjc) &amp; AIMy</w:t>
+              <w:t>Figma MCP</w:t>
             </w:r>
           </w:p>
         </w:tc>
@@ -2814,7 +2730,7 @@
                 <w:color w:val="334155"/>
                 <w:sz w:val="19"/>
               </w:rPr>
-              <w:t>AI 코딩 에이전트 안전 통제 하네스 및 다중 모델 라우팅 허브</w:t>
+              <w:t>AI가 피그마 캔버스를 직접 제어하는 연결 통로</w:t>
             </w:r>
           </w:p>
         </w:tc>
@@ -2838,7 +2754,7 @@
                 <w:color w:val="334155"/>
                 <w:sz w:val="19"/>
               </w:rPr>
-              <w:t>AIMy로 다양한 AI 모델을 연결하고, 코드 수정 전 계획과 승인을 강제하는 안전 통제 시스템</w:t>
+              <w:t>AI가 피그마 프로그램을 직접 조작할 수 있도록 돕는 도구</w:t>
             </w:r>
           </w:p>
         </w:tc>
@@ -2866,7 +2782,7 @@
                 <w:color w:val="334155"/>
                 <w:sz w:val="19"/>
               </w:rPr>
-              <w:t>Antigravity IDE / CLI</w:t>
+              <w:t>가재코드 (gjc)</w:t>
             </w:r>
           </w:p>
         </w:tc>
@@ -2891,7 +2807,7 @@
                 <w:color w:val="334155"/>
                 <w:sz w:val="19"/>
               </w:rPr>
-              <w:t>프로젝트 전체를 파악하고 지시를 수행하는 AI 코딩 환경</w:t>
+              <w:t>AI 코딩 에이전트 안전 통제 하네스</w:t>
             </w:r>
           </w:p>
         </w:tc>
@@ -2916,7 +2832,160 @@
                 <w:color w:val="334155"/>
                 <w:sz w:val="19"/>
               </w:rPr>
-              <w:t>프로젝트 구조를 파악하고 지시를 수행하는 AI 엔지니어</w:t>
+              <w:t>코드 수정 전 계획과 사용자 승인을 강제하는 안전 통제 시스템</w:t>
+            </w:r>
+          </w:p>
+        </w:tc>
+      </w:tr>
+      <w:tr>
+        <w:tc>
+          <w:tcPr>
+            <w:tcW w:type="dxa" w:w="3120"/>
+            <w:tcMar>
+              <w:top w:w="100" w:type="dxa"/>
+              <w:bottom w:w="100" w:type="dxa"/>
+              <w:left w:w="140" w:type="dxa"/>
+              <w:right w:w="140" w:type="dxa"/>
+            </w:tcMar>
+          </w:tcPr>
+          <w:p>
+            <w:pPr>
+              <w:spacing w:before="40" w:after="40"/>
+            </w:pPr>
+            <w:r>
+              <w:rPr>
+                <w:rFonts w:ascii="맑은 고딕" w:hAnsi="맑은 고딕" w:eastAsia="맑은 고딕"/>
+                <w:b/>
+                <w:color w:val="334155"/>
+                <w:sz w:val="19"/>
+              </w:rPr>
+              <w:t>Antigravity IDE / CLI</w:t>
+            </w:r>
+          </w:p>
+        </w:tc>
+        <w:tc>
+          <w:tcPr>
+            <w:tcW w:type="dxa" w:w="3120"/>
+            <w:tcMar>
+              <w:top w:w="100" w:type="dxa"/>
+              <w:bottom w:w="100" w:type="dxa"/>
+              <w:left w:w="140" w:type="dxa"/>
+              <w:right w:w="140" w:type="dxa"/>
+            </w:tcMar>
+          </w:tcPr>
+          <w:p>
+            <w:pPr>
+              <w:spacing w:before="40" w:after="40"/>
+            </w:pPr>
+            <w:r>
+              <w:rPr>
+                <w:rFonts w:ascii="맑은 고딕" w:hAnsi="맑은 고딕" w:eastAsia="맑은 고딕"/>
+                <w:color w:val="334155"/>
+                <w:sz w:val="19"/>
+              </w:rPr>
+              <w:t>기획 문서 작성, 도구 실행, 산출물 실체화를 전담하는 통합 코딩 환경</w:t>
+            </w:r>
+          </w:p>
+        </w:tc>
+        <w:tc>
+          <w:tcPr>
+            <w:tcW w:type="dxa" w:w="3120"/>
+            <w:tcMar>
+              <w:top w:w="100" w:type="dxa"/>
+              <w:bottom w:w="100" w:type="dxa"/>
+              <w:left w:w="140" w:type="dxa"/>
+              <w:right w:w="140" w:type="dxa"/>
+            </w:tcMar>
+          </w:tcPr>
+          <w:p>
+            <w:pPr>
+              <w:spacing w:before="40" w:after="40"/>
+            </w:pPr>
+            <w:r>
+              <w:rPr>
+                <w:rFonts w:ascii="맑은 고딕" w:hAnsi="맑은 고딕" w:eastAsia="맑은 고딕"/>
+                <w:color w:val="334155"/>
+                <w:sz w:val="19"/>
+              </w:rPr>
+              <w:t>프로젝트 전체를 파악하고 실무 산출물을 직접 만드는 AI 실무 파트너</w:t>
+            </w:r>
+          </w:p>
+        </w:tc>
+      </w:tr>
+      <w:tr>
+        <w:tc>
+          <w:tcPr>
+            <w:tcW w:type="dxa" w:w="3120"/>
+            <w:shd w:fill="F8FAFC"/>
+            <w:tcMar>
+              <w:top w:w="100" w:type="dxa"/>
+              <w:bottom w:w="100" w:type="dxa"/>
+              <w:left w:w="140" w:type="dxa"/>
+              <w:right w:w="140" w:type="dxa"/>
+            </w:tcMar>
+          </w:tcPr>
+          <w:p>
+            <w:pPr>
+              <w:spacing w:before="40" w:after="40"/>
+            </w:pPr>
+            <w:r>
+              <w:rPr>
+                <w:rFonts w:ascii="맑은 고딕" w:hAnsi="맑은 고딕" w:eastAsia="맑은 고딕"/>
+                <w:b/>
+                <w:color w:val="334155"/>
+                <w:sz w:val="19"/>
+              </w:rPr>
+              <w:t>AIMy (4단계 도입 예정)</w:t>
+            </w:r>
+          </w:p>
+        </w:tc>
+        <w:tc>
+          <w:tcPr>
+            <w:tcW w:type="dxa" w:w="3120"/>
+            <w:shd w:fill="F8FAFC"/>
+            <w:tcMar>
+              <w:top w:w="100" w:type="dxa"/>
+              <w:bottom w:w="100" w:type="dxa"/>
+              <w:left w:w="140" w:type="dxa"/>
+              <w:right w:w="140" w:type="dxa"/>
+            </w:tcMar>
+          </w:tcPr>
+          <w:p>
+            <w:pPr>
+              <w:spacing w:before="40" w:after="40"/>
+            </w:pPr>
+            <w:r>
+              <w:rPr>
+                <w:rFonts w:ascii="맑은 고딕" w:hAnsi="맑은 고딕" w:eastAsia="맑은 고딕"/>
+                <w:color w:val="334155"/>
+                <w:sz w:val="19"/>
+              </w:rPr>
+              <w:t>다중 LLM API 라우팅 및 허브</w:t>
+            </w:r>
+          </w:p>
+        </w:tc>
+        <w:tc>
+          <w:tcPr>
+            <w:tcW w:type="dxa" w:w="3120"/>
+            <w:shd w:fill="F8FAFC"/>
+            <w:tcMar>
+              <w:top w:w="100" w:type="dxa"/>
+              <w:bottom w:w="100" w:type="dxa"/>
+              <w:left w:w="140" w:type="dxa"/>
+              <w:right w:w="140" w:type="dxa"/>
+            </w:tcMar>
+          </w:tcPr>
+          <w:p>
+            <w:pPr>
+              <w:spacing w:before="40" w:after="40"/>
+            </w:pPr>
+            <w:r>
+              <w:rPr>
+                <w:rFonts w:ascii="맑은 고딕" w:hAnsi="맑은 고딕" w:eastAsia="맑은 고딕"/>
+                <w:color w:val="334155"/>
+                <w:sz w:val="19"/>
+              </w:rPr>
+              <w:t>코드 작성 시 작업 역할(설계, 코딩, 검증)에 따라 서로 다른 최적의 AI 모델을 연결하는 라우터</w:t>
             </w:r>
           </w:p>
         </w:tc>
@@ -3196,7 +3265,7 @@
           <w:color w:val="334155"/>
           <w:sz w:val="20"/>
         </w:rPr>
-        <w:t>하네스 도구와 다중 모델 연동을 통한 통제 및 비용 절감</w:t>
+        <w:t>역할 분담 기반 오케스트레이션(Orchestration)의 공학적 효율성</w:t>
       </w:r>
       <w:r>
         <w:rPr>
@@ -3227,15 +3296,22 @@
           <w:color w:val="334155"/>
           <w:sz w:val="20"/>
         </w:rPr>
-        <w:t>가재코드(</w:t>
+        <w:t>단일 AI에게 모든 작업을 통째로 맡기면 문맥 혼선과 코드 훼손(환각)이 발생하기 쉬움.</w:t>
       </w:r>
+    </w:p>
+    <w:p>
+      <w:pPr>
+        <w:spacing w:before="30" w:after="30"/>
+        <w:ind w:left="720"/>
+      </w:pPr>
       <w:r>
         <w:rPr>
-          <w:rFonts w:ascii="Consolas" w:hAnsi="Consolas" w:eastAsia="맑은 고딕"/>
-          <w:color w:val="B42846"/>
-          <w:sz w:val="19"/>
+          <w:rFonts w:ascii="맑은 고딕" w:hAnsi="맑은 고딕"/>
+          <w:b/>
+          <w:color w:val="6366F1"/>
+          <w:sz w:val="20"/>
         </w:rPr>
-        <w:t>gjc</w:t>
+        <w:t xml:space="preserve">⁃ </w:t>
       </w:r>
       <w:r>
         <w:rPr>
@@ -3243,7 +3319,7 @@
           <w:color w:val="334155"/>
           <w:sz w:val="20"/>
         </w:rPr>
-        <w:t>)와 AIMy 연동을 통해 작업 단계별로 적합한 AI 모델을 배치하고, 작업 계획을 먼저 승인받고 코드를 실행하도록 하여 AI의 독단적인 코드 수정으로 인한 버그 발생과 불필요한 비용 소모를 방지함.</w:t>
+        <w:t>[가재코드의 안전 규칙 통제] + [Antigravity의 실무 산출물 제작] + [AIMy 기반의 역할별 다중 모델 분담]으로 역할을 명확히 분리함으로써, 버그 발생을 사전에 차단하고 불필요한 API 비용을 획기적으로 절감하는 고효율 파이프라인을 구축함.</w:t>
       </w:r>
     </w:p>
     <w:p>

</xml_diff>

<commit_message>
docs: reflect iterative development loop where non-punitive UX emerged during Figma design stage
</commit_message>
<xml_diff>
--- a/AI_활용_개발_프로세스_보고서.docx
+++ b/AI_활용_개발_프로세스_보고서.docx
@@ -142,7 +142,7 @@
                 <w:color w:val="1E293B"/>
                 <w:sz w:val="18"/>
               </w:rPr>
-              <w:t>[1단계: 아이디어 검증(완료)] ➔ [2단계: 디자인 자동화(완료)] ➔ [3단계: 순서도·하네스·문서화(진행중)] ➔ [4단계: 코드 변환(예정)] ➔ [5단계: 스토어 출시(예정)]</w:t>
+              <w:t>[1단계: 아이디어 탐색(완료)] ➔ [2단계: 디자인·아이디어 구체화(완료)] ➔ [3단계: 순서도·하네스·문서화(진행중)] ➔ [4단계: 코드 변환(예정)] ➔ [5단계: 스토어 출시(예정)]</w:t>
             </w:r>
           </w:p>
         </w:tc>
@@ -381,7 +381,7 @@
                 <w:color w:val="334155"/>
                 <w:sz w:val="19"/>
               </w:rPr>
-              <w:t>아이디어 도출 및 검증</w:t>
+              <w:t>아이디어 도출 및 기초 탐색</w:t>
             </w:r>
           </w:p>
         </w:tc>
@@ -430,7 +430,7 @@
                 <w:color w:val="334155"/>
                 <w:sz w:val="19"/>
               </w:rPr>
-              <w:t>브레인스토밍, 실현 가능성 질의, 비처벌적 UX 방향 확립</w:t>
+              <w:t>브레인스토밍, 기초 타당성 질의, 핵심 컨셉 수립</w:t>
             </w:r>
           </w:p>
         </w:tc>
@@ -532,7 +532,7 @@
                 <w:color w:val="334155"/>
                 <w:sz w:val="19"/>
               </w:rPr>
-              <w:t>화면 설계 및 디자인</w:t>
+              <w:t>화면 설계 및 아이디어 구체화</w:t>
             </w:r>
           </w:p>
         </w:tc>
@@ -583,7 +583,7 @@
                 <w:color w:val="334155"/>
                 <w:sz w:val="19"/>
               </w:rPr>
-              <w:t>초기 와이어프레임 생성, 시안 비교 선택, 피그마 제어</w:t>
+              <w:t>피그마 와이어프레임 생성, 비처벌적 UX 도출, Figma MCP 제어</w:t>
             </w:r>
           </w:p>
         </w:tc>
@@ -1128,6 +1128,97 @@
         <w:t>2. 단계별 세부 협업 과정</w:t>
       </w:r>
     </w:p>
+    <w:tbl>
+      <w:tblPr>
+        <w:tblW w:type="auto" w:w="0"/>
+        <w:jc w:val="center"/>
+        <w:tblLayout w:type="fixed"/>
+        <w:tblLook w:firstColumn="1" w:firstRow="1" w:lastColumn="0" w:lastRow="0" w:noHBand="0" w:noVBand="1" w:val="04A0"/>
+        <w:tblBorders>
+          <w:top w:val="none"/>
+          <w:bottom w:val="none"/>
+          <w:left w:val="single" w:sz="24" w:space="0" w:color="3B82F6"/>
+          <w:right w:val="none"/>
+          <w:insideH w:val="none"/>
+          <w:insideV w:val="none"/>
+        </w:tblBorders>
+      </w:tblPr>
+      <w:tblGrid>
+        <w:gridCol w:w="9360"/>
+      </w:tblGrid>
+      <w:tr>
+        <w:tc>
+          <w:tcPr>
+            <w:tcW w:type="dxa" w:w="9360"/>
+            <w:shd w:fill="EFF6FF"/>
+            <w:tcMar>
+              <w:top w:w="140" w:type="dxa"/>
+              <w:bottom w:w="140" w:type="dxa"/>
+              <w:left w:w="200" w:type="dxa"/>
+              <w:right w:w="140" w:type="dxa"/>
+            </w:tcMar>
+          </w:tcPr>
+          <w:p>
+            <w:pPr>
+              <w:spacing w:before="60" w:after="60"/>
+            </w:pPr>
+            <w:r>
+              <w:rPr>
+                <w:rFonts w:ascii="맑은 고딕" w:hAnsi="맑은 고딕" w:eastAsia="맑은 고딕"/>
+                <w:i/>
+                <w:color w:val="1E3A8A"/>
+                <w:sz w:val="20"/>
+              </w:rPr>
+              <w:t xml:space="preserve">💡 </w:t>
+            </w:r>
+            <w:r>
+              <w:rPr>
+                <w:rFonts w:ascii="맑은 고딕" w:hAnsi="맑은 고딕" w:eastAsia="맑은 고딕"/>
+                <w:b/>
+                <w:i/>
+                <w:color w:val="1E3A8A"/>
+                <w:sz w:val="20"/>
+              </w:rPr>
+              <w:t>참고: 개발 프로세스의 순환적 특성 (Iterative Feedback Loop)</w:t>
+            </w:r>
+            <w:r>
+              <w:rPr>
+                <w:rFonts w:ascii="맑은 고딕" w:hAnsi="맑은 고딕" w:eastAsia="맑은 고딕"/>
+                <w:i/>
+                <w:color w:val="1E3A8A"/>
+                <w:sz w:val="20"/>
+              </w:rPr>
+              <w:br/>
+              <w:t xml:space="preserve">본 보고서의 단계 구분은 편의상 구조화한 것이며, 실제 개발에서는 </w:t>
+            </w:r>
+            <w:r>
+              <w:rPr>
+                <w:rFonts w:ascii="맑은 고딕" w:hAnsi="맑은 고딕" w:eastAsia="맑은 고딕"/>
+                <w:b/>
+                <w:i/>
+                <w:color w:val="1E3A8A"/>
+                <w:sz w:val="20"/>
+              </w:rPr>
+              <w:t>기획 아이디어 발굴과 피그마 화면 디자인, 기술적 실현 가능성 검증이 일방향(Waterfall)으로 끝나지 않고 지속적으로 상호 피드백을 주고받는 순환적 과정</w:t>
+            </w:r>
+            <w:r>
+              <w:rPr>
+                <w:rFonts w:ascii="맑은 고딕" w:hAnsi="맑은 고딕" w:eastAsia="맑은 고딕"/>
+                <w:i/>
+                <w:color w:val="1E3A8A"/>
+                <w:sz w:val="20"/>
+              </w:rPr>
+              <w:t>으로 진행됨.</w:t>
+            </w:r>
+          </w:p>
+        </w:tc>
+      </w:tr>
+    </w:tbl>
+    <w:p>
+      <w:pPr>
+        <w:spacing w:before="0" w:after="60"/>
+      </w:pPr>
+    </w:p>
     <w:p>
       <w:pPr>
         <w:keepNext/>
@@ -1140,7 +1231,7 @@
           <w:color w:val="2563EB"/>
           <w:sz w:val="24"/>
         </w:rPr>
-        <w:t>1단계: 아이디어 도출 및 기술적 타당성 검증 (완료)</w:t>
+        <w:t>1단계: 초기 아이디어 도출 및 기초 타당성 탐색 (완료)</w:t>
       </w:r>
     </w:p>
     <w:p>
@@ -1164,7 +1255,7 @@
           <w:color w:val="334155"/>
           <w:sz w:val="20"/>
         </w:rPr>
-        <w:t>자유 브레인스토밍 및 실현 가능성 질의</w:t>
+        <w:t>초기 브레인스토밍 및 질의</w:t>
       </w:r>
       <w:r>
         <w:rPr>
@@ -1195,7 +1286,7 @@
           <w:color w:val="334155"/>
           <w:sz w:val="20"/>
         </w:rPr>
-        <w:t>팀원들이 모여 ADHD나 우울증 환자의 복약 패턴, 생활 습관 관리, 마스코트 상호작용에 대한 아이디어를 공유함.</w:t>
+        <w:t>팀원들이 모여 ADHD나 우울증 환자의 복약 순응도 문제, 일상 루틴(수면, 식사) 관리, 캐릭터 상호작용에 대한 기초 아이디어를 발굴함.</w:t>
       </w:r>
     </w:p>
     <w:p>
@@ -1218,7 +1309,7 @@
           <w:color w:val="334155"/>
           <w:sz w:val="20"/>
         </w:rPr>
-        <w:t xml:space="preserve">아이디어가 모바일 환경에서 실제로 구현 가능한지, 환자에게 임상적 부작용은 없는지 </w:t>
+        <w:t xml:space="preserve">떠오른 아이디어가 모바일 환경에서 실제로 구현 가능한지, 환자에게 임상적 부작용은 없는지 </w:t>
       </w:r>
       <w:r>
         <w:rPr>
@@ -1235,7 +1326,30 @@
           <w:color w:val="334155"/>
           <w:sz w:val="20"/>
         </w:rPr>
-        <w:t xml:space="preserve"> 등 다양한 생성형 AI 대화 모델을 사운딩 보드로 활용해 질문하며 구체적인 개발 범위를 좁힘.</w:t>
+        <w:t xml:space="preserve"> 등 다양한 생성형 AI 대화 모델을 사운딩 보드로 활용해 질문하며 기본 프로젝트 골격을 잡음.</w:t>
+      </w:r>
+    </w:p>
+    <w:p>
+      <w:pPr>
+        <w:spacing w:before="160" w:after="160"/>
+        <w:pBdr>
+          <w:bottom w:val="single" w:sz="6" w:space="1" w:color="E2E8F0"/>
+        </w:pBdr>
+      </w:pPr>
+    </w:p>
+    <w:p>
+      <w:pPr>
+        <w:keepNext/>
+        <w:spacing w:before="220" w:after="80"/>
+      </w:pPr>
+      <w:r>
+        <w:rPr>
+          <w:rFonts w:ascii="맑은 고딕" w:hAnsi="맑은 고딕" w:eastAsia="맑은 고딕"/>
+          <w:b/>
+          <w:color w:val="2563EB"/>
+          <w:sz w:val="24"/>
+        </w:rPr>
+        <w:t>2단계: 화면 설계 및 디자인 기반의 아이디어 구체화 (Figma &amp; Figma MCP) (완료)</w:t>
       </w:r>
     </w:p>
     <w:p>
@@ -1259,7 +1373,7 @@
           <w:color w:val="334155"/>
           <w:sz w:val="20"/>
         </w:rPr>
-        <w:t>비처벌적 UX(Non-punitive UX) 방향 확립</w:t>
+        <w:t>디자인 과정에서 심화된 핵심 아이디어 (비처벌적 UX &amp; 당일 완결 원칙)</w:t>
       </w:r>
       <w:r>
         <w:rPr>
@@ -1290,7 +1404,7 @@
           <w:color w:val="334155"/>
           <w:sz w:val="20"/>
         </w:rPr>
-        <w:t>복약을 놓친 사용자에게 페널티를 부여하는 기존 방식의 효과를 검토함.</w:t>
+        <w:t>기획 단계의 추상적인 아이디어는 피그마에서 실제 버튼, 알림 팝업, 달력 화면을 시각적으로 배치하면서 본격적으로 구체화됨.</w:t>
       </w:r>
     </w:p>
     <w:p>
@@ -1313,7 +1427,47 @@
           <w:color w:val="334155"/>
           <w:sz w:val="20"/>
         </w:rPr>
-        <w:t>연속 기록 실패에 따른 경고 알림이나 스트릭(연속 일수) 리셋은 환자에게 죄책감을 주어 앱 이탈을 부른다는 점을 확인하고, 실패를 탓하지 않고 누적 실천 횟수를 칭찬하는 긍정 피드백 방식을 채택함.</w:t>
+        <w:t xml:space="preserve">약 복용을 놓쳤을 때 빨간색 경고나 스트릭(연속 일수) 단절을 표시하는 기존 방식을 시각화해 본 결과, 이것이 정신질환 환자에게 심한 죄책감과 자기비하를 주어 앱 이탈을 유발한다는 점을 확인함. 이에 따라 AI와 논의하여 실패를 자책하지 않고 "이번 달에 15번이나 복약하셨어요!"와 같이 누적 실천 횟수를 칭찬하는 </w:t>
+      </w:r>
+      <w:r>
+        <w:rPr>
+          <w:rFonts w:ascii="맑은 고딕" w:hAnsi="맑은 고딕" w:eastAsia="맑은 고딕"/>
+          <w:b/>
+          <w:color w:val="334155"/>
+          <w:sz w:val="20"/>
+        </w:rPr>
+        <w:t>'비처벌적 UX(Non-punitive UX)'</w:t>
+      </w:r>
+      <w:r>
+        <w:rPr>
+          <w:rFonts w:ascii="맑은 고딕" w:hAnsi="맑은 고딕" w:eastAsia="맑은 고딕"/>
+          <w:color w:val="334155"/>
+          <w:sz w:val="20"/>
+        </w:rPr>
+        <w:t xml:space="preserve"> 방침을 디자인 과정에서 확립함.</w:t>
+      </w:r>
+    </w:p>
+    <w:p>
+      <w:pPr>
+        <w:spacing w:before="30" w:after="30"/>
+        <w:ind w:left="720"/>
+      </w:pPr>
+      <w:r>
+        <w:rPr>
+          <w:rFonts w:ascii="맑은 고딕" w:hAnsi="맑은 고딕"/>
+          <w:b/>
+          <w:color w:val="6366F1"/>
+          <w:sz w:val="20"/>
+        </w:rPr>
+        <w:t xml:space="preserve">⁃ </w:t>
+      </w:r>
+      <w:r>
+        <w:rPr>
+          <w:rFonts w:ascii="맑은 고딕" w:hAnsi="맑은 고딕" w:eastAsia="맑은 고딕"/>
+          <w:color w:val="334155"/>
+          <w:sz w:val="20"/>
+        </w:rPr>
+        <w:t>또한 달력 탭에서 과거 날짜를 임의로 소급 수정하는 UI를 검토하던 중, 소급 입력이 치료 지속성 평가를 왜곡할 수 있음을 확인하고 '당일 완결 기록 원칙'을 시각 디자인 규칙으로 구체화함.</w:t>
       </w:r>
     </w:p>
     <w:p>
@@ -1337,7 +1491,7 @@
           <w:color w:val="334155"/>
           <w:sz w:val="20"/>
         </w:rPr>
-        <w:t>당일 완결 기록 원칙 수립</w:t>
+        <w:t>피그마 내장 AI 및 세부 배치 분담</w:t>
       </w:r>
       <w:r>
         <w:rPr>
@@ -1368,117 +1522,7 @@
           <w:color w:val="334155"/>
           <w:sz w:val="20"/>
         </w:rPr>
-        <w:t>과거 날짜의 기록을 임의로 소급 수정하는 방식은 치료 지속성 평가를 왜곡할 수 있으므로, 당일 완결을 기본 원칙으로 두고 예외적인 경우에만 제한적으로 복구하도록 설정함.</w:t>
-      </w:r>
-    </w:p>
-    <w:p>
-      <w:pPr>
-        <w:spacing w:before="160" w:after="160"/>
-        <w:pBdr>
-          <w:bottom w:val="single" w:sz="6" w:space="1" w:color="E2E8F0"/>
-        </w:pBdr>
-      </w:pPr>
-    </w:p>
-    <w:p>
-      <w:pPr>
-        <w:keepNext/>
-        <w:spacing w:before="220" w:after="80"/>
-      </w:pPr>
-      <w:r>
-        <w:rPr>
-          <w:rFonts w:ascii="맑은 고딕" w:hAnsi="맑은 고딕" w:eastAsia="맑은 고딕"/>
-          <w:b/>
-          <w:color w:val="2563EB"/>
-          <w:sz w:val="24"/>
-        </w:rPr>
-        <w:t>2단계: 화면 설계 및 Figma AI 자동화 (완료)</w:t>
-      </w:r>
-    </w:p>
-    <w:p>
-      <w:pPr>
-        <w:spacing w:before="30" w:after="30"/>
-        <w:ind w:left="360"/>
-      </w:pPr>
-      <w:r>
-        <w:rPr>
-          <w:rFonts w:ascii="맑은 고딕" w:hAnsi="맑은 고딕"/>
-          <w:b/>
-          <w:color w:val="6366F1"/>
-          <w:sz w:val="20"/>
-        </w:rPr>
-        <w:t xml:space="preserve">• </w:t>
-      </w:r>
-      <w:r>
-        <w:rPr>
-          <w:rFonts w:ascii="맑은 고딕" w:hAnsi="맑은 고딕" w:eastAsia="맑은 고딕"/>
-          <w:b/>
-          <w:color w:val="334155"/>
-          <w:sz w:val="20"/>
-        </w:rPr>
-        <w:t>피그마 내장 AI 활용</w:t>
-      </w:r>
-      <w:r>
-        <w:rPr>
-          <w:rFonts w:ascii="맑은 고딕" w:hAnsi="맑은 고딕" w:eastAsia="맑은 고딕"/>
-          <w:color w:val="334155"/>
-          <w:sz w:val="20"/>
-        </w:rPr>
-        <w:t>:</w:t>
-      </w:r>
-    </w:p>
-    <w:p>
-      <w:pPr>
-        <w:spacing w:before="30" w:after="30"/>
-        <w:ind w:left="720"/>
-      </w:pPr>
-      <w:r>
-        <w:rPr>
-          <w:rFonts w:ascii="맑은 고딕" w:hAnsi="맑은 고딕"/>
-          <w:b/>
-          <w:color w:val="6366F1"/>
-          <w:sz w:val="20"/>
-        </w:rPr>
-        <w:t xml:space="preserve">⁃ </w:t>
-      </w:r>
-      <w:r>
-        <w:rPr>
-          <w:rFonts w:ascii="맑은 고딕" w:hAnsi="맑은 고딕" w:eastAsia="맑은 고딕"/>
-          <w:color w:val="334155"/>
-          <w:sz w:val="20"/>
-        </w:rPr>
-        <w:t>기획안을 바탕으로 Figma의 AI 생성 기능을 활용해 복약 관리, 습관 관리, 달력, 마스코트 화면의 초기 와이어프레임 틀을 제작함.</w:t>
-      </w:r>
-    </w:p>
-    <w:p>
-      <w:pPr>
-        <w:spacing w:before="30" w:after="30"/>
-        <w:ind w:left="360"/>
-      </w:pPr>
-      <w:r>
-        <w:rPr>
-          <w:rFonts w:ascii="맑은 고딕" w:hAnsi="맑은 고딕"/>
-          <w:b/>
-          <w:color w:val="6366F1"/>
-          <w:sz w:val="20"/>
-        </w:rPr>
-        <w:t xml:space="preserve">• </w:t>
-      </w:r>
-      <w:r>
-        <w:rPr>
-          <w:rFonts w:ascii="맑은 고딕" w:hAnsi="맑은 고딕" w:eastAsia="맑은 고딕"/>
-          <w:b/>
-          <w:color w:val="334155"/>
-          <w:sz w:val="20"/>
-        </w:rPr>
-        <w:t>사람과 AI의 역할 분담</w:t>
-      </w:r>
-      <w:r>
-        <w:rPr>
-          <w:rFonts w:ascii="맑은 고딕" w:hAnsi="맑은 고딕" w:eastAsia="맑은 고딕"/>
-          <w:color w:val="334155"/>
-          <w:sz w:val="20"/>
-        </w:rPr>
-        <w:t>:</w:t>
+        <w:t>Figma의 AI 생성 기능을 활용해 복약 관리, 습관 관리, 달력, 마스코트 화면의 초기 와이어프레임 틀을 빠르게 제작함.</w:t>
       </w:r>
     </w:p>
     <w:p>
@@ -1548,7 +1592,7 @@
           <w:color w:val="334155"/>
           <w:sz w:val="20"/>
         </w:rPr>
-        <w:t>Figma MCP(Model Context Protocol) 연동</w:t>
+        <w:t>Figma MCP(Model Context Protocol) 연동을 통한 대량 일괄 자동화</w:t>
       </w:r>
       <w:r>
         <w:rPr>
@@ -3193,6 +3237,61 @@
           <w:color w:val="334155"/>
           <w:sz w:val="20"/>
         </w:rPr>
+        <w:t>아이디어 도출과 시각 디자인의 지속적인 순환 피드백 (Iterative Loop)</w:t>
+      </w:r>
+      <w:r>
+        <w:rPr>
+          <w:rFonts w:ascii="맑은 고딕" w:hAnsi="맑은 고딕" w:eastAsia="맑은 고딕"/>
+          <w:color w:val="334155"/>
+          <w:sz w:val="20"/>
+        </w:rPr>
+        <w:t>:</w:t>
+      </w:r>
+    </w:p>
+    <w:p>
+      <w:pPr>
+        <w:spacing w:before="30" w:after="30"/>
+        <w:ind w:left="720"/>
+      </w:pPr>
+      <w:r>
+        <w:rPr>
+          <w:rFonts w:ascii="맑은 고딕" w:hAnsi="맑은 고딕"/>
+          <w:b/>
+          <w:color w:val="6366F1"/>
+          <w:sz w:val="20"/>
+        </w:rPr>
+        <w:t xml:space="preserve">⁃ </w:t>
+      </w:r>
+      <w:r>
+        <w:rPr>
+          <w:rFonts w:ascii="맑은 고딕" w:hAnsi="맑은 고딕" w:eastAsia="맑은 고딕"/>
+          <w:color w:val="334155"/>
+          <w:sz w:val="20"/>
+        </w:rPr>
+        <w:t>기획서 작성을 끝내고 디자인으로 넘어가는 일방향(Waterfall) 방식이 아니라, 피그마에서 화면을 직접 만져보고 시각화하면서 비처벌적 UX나 당일 완결 원칙 같은 실질적인 아이디어가 계속 도출됨. 시각화 ➔ AI와의 기술적 실현 가능성 검토 ➔ 기획 구체화가 전 과정에 걸쳐 유기적으로 순환함.</w:t>
+      </w:r>
+    </w:p>
+    <w:p>
+      <w:pPr>
+        <w:spacing w:before="30" w:after="30"/>
+        <w:ind w:left="360"/>
+      </w:pPr>
+      <w:r>
+        <w:rPr>
+          <w:rFonts w:ascii="맑은 고딕" w:hAnsi="맑은 고딕"/>
+          <w:b/>
+          <w:color w:val="2563EB"/>
+          <w:sz w:val="20"/>
+        </w:rPr>
+        <w:t xml:space="preserve">2. </w:t>
+      </w:r>
+      <w:r>
+        <w:rPr>
+          <w:rFonts w:ascii="맑은 고딕" w:hAnsi="맑은 고딕" w:eastAsia="맑은 고딕"/>
+          <w:b/>
+          <w:color w:val="334155"/>
+          <w:sz w:val="20"/>
+        </w:rPr>
         <w:t>단순 프롬프트 대화 대신 체계적인 규칙 파일(스킬) 활용</w:t>
       </w:r>
       <w:r>
@@ -3256,7 +3355,7 @@
           <w:color w:val="2563EB"/>
           <w:sz w:val="20"/>
         </w:rPr>
-        <w:t xml:space="preserve">2. </w:t>
+        <w:t xml:space="preserve">3. </w:t>
       </w:r>
       <w:r>
         <w:rPr>
@@ -3334,7 +3433,7 @@
           <w:color w:val="2563EB"/>
           <w:sz w:val="20"/>
         </w:rPr>
-        <w:t xml:space="preserve">3. </w:t>
+        <w:t xml:space="preserve">4. </w:t>
       </w:r>
       <w:r>
         <w:rPr>

</xml_diff>

<commit_message>
docs: align AI development process report with finalized team chat summary and prototyping workflow
</commit_message>
<xml_diff>
--- a/AI_활용_개발_프로세스_보고서.docx
+++ b/AI_활용_개발_프로세스_보고서.docx
@@ -27,7 +27,7 @@
           <w:color w:val="334155"/>
           <w:sz w:val="21"/>
         </w:rPr>
-        <w:t>약학 전공 학부생 팀이 기획 아이디어 발굴부터 피그마(Figma) 화면 디자인, 순서도 및 로직 설계, 가재코드(gjc) 하네스 적용, Antigravity 기반 실무 제작, Flutter 코드 변환 및 구글 플레이스토어 출시 계획까지 진행하며 AI를 활용한 실무 협업 프로세스를 정리한 보고서임. 비전공자 및 청중이 쉽게 이해할 수 있도록 실제 협업 흐름과 도구별 역할을 중심으로 기술함.</w:t>
+        <w:t>약학 전공 학부생 팀이 기획 아이디어 발굴부터 피그마(Figma) 화면 디자인, 기획명세서(PRD) 작성, 가재코드(gajae-code) 하네스 적용, Antigravity 기반 실무 제작, Flutter 코드 프로토타입 전환 및 스토어 출시 계획까지 진행하며 AI를 활용한 실무 협업 프로세스를 정리한 보고서임. 비전공자 및 청중이 쉽게 이해할 수 있도록 실제 협업 흐름과 도구별 역할을 중심으로 기술함.</w:t>
       </w:r>
     </w:p>
     <w:p>
@@ -142,7 +142,7 @@
                 <w:color w:val="1E293B"/>
                 <w:sz w:val="18"/>
               </w:rPr>
-              <w:t>[1단계: 아이디어 탐색(완료)] ➔ [2단계: 디자인·아이디어 구체화(완료)] ➔ [3단계: 순서도·하네스·문서화(진행중)] ➔ [4단계: 코드 변환(예정)] ➔ [5단계: 스토어 출시(예정)]</w:t>
+              <w:t>[1단계: 아이디어 탐색(완료)] ➔ [2단계: 디자인·아이디어 구체화(완료)] ➔ [3단계: 기획명세서·규칙 세팅(진행중)] ➔ [4단계: 코드 프로토타입 전환(예정)] ➔ [5단계: 스토어 출시 검토(예정)]</w:t>
             </w:r>
           </w:p>
         </w:tc>
@@ -430,7 +430,7 @@
                 <w:color w:val="334155"/>
                 <w:sz w:val="19"/>
               </w:rPr>
-              <w:t>브레인스토밍, 기초 타당성 질의, 핵심 컨셉 수립</w:t>
+              <w:t>브레인스토밍, 실현 가능성 질의, 대략적인 방향 수립</w:t>
             </w:r>
           </w:p>
         </w:tc>
@@ -454,7 +454,7 @@
                 <w:color w:val="334155"/>
                 <w:sz w:val="19"/>
               </w:rPr>
-              <w:t>AI 대화 모델 (ChatGPT, Gemini, Claude, Copilot)</w:t>
+              <w:t>copilot, gemini</w:t>
             </w:r>
           </w:p>
         </w:tc>
@@ -583,7 +583,7 @@
                 <w:color w:val="334155"/>
                 <w:sz w:val="19"/>
               </w:rPr>
-              <w:t>피그마 와이어프레임 생성, 비처벌적 UX 도출, Figma MCP 제어</w:t>
+              <w:t>초기 와이어프레임 생성, 비처벌적 UX 도출, figma MCP 화면 제어</w:t>
             </w:r>
           </w:p>
         </w:tc>
@@ -608,7 +608,7 @@
                 <w:color w:val="334155"/>
                 <w:sz w:val="19"/>
               </w:rPr>
-              <w:t>Figma AI, Figma MCP, Antigravity</w:t>
+              <w:t>figma, figma AI, figma MCP, antigravity</w:t>
             </w:r>
           </w:p>
         </w:tc>
@@ -685,7 +685,7 @@
                 <w:color w:val="334155"/>
                 <w:sz w:val="19"/>
               </w:rPr>
-              <w:t>순서도·하네스 및 PRD 문서화</w:t>
+              <w:t>기획명세서(PRD) 및 스킬 세팅</w:t>
             </w:r>
           </w:p>
         </w:tc>
@@ -734,7 +734,7 @@
                 <w:color w:val="334155"/>
                 <w:sz w:val="19"/>
               </w:rPr>
-              <w:t>순서도 및 의사코드 작성, gjc 하네스 규칙 수립, Antigravity 실무 문서화</w:t>
+              <w:t>기획명세서 정리, 코딩 스킬 규칙 세팅, gajae-code 안전 통제 정의</w:t>
             </w:r>
           </w:p>
         </w:tc>
@@ -758,7 +758,7 @@
                 <w:color w:val="334155"/>
                 <w:sz w:val="19"/>
               </w:rPr>
-              <w:t>가재코드(gjc), Antigravity, GitHub Skills</w:t>
+              <w:t>antigravity, github, gajae-code</w:t>
             </w:r>
           </w:p>
         </w:tc>
@@ -782,7 +782,7 @@
                 <w:color w:val="334155"/>
                 <w:sz w:val="19"/>
               </w:rPr>
-              <w:t xml:space="preserve">순서도, 의사코드, PRD 명세서, </w:t>
+              <w:t xml:space="preserve">PRD 기획명세서, </w:t>
             </w:r>
             <w:r>
               <w:rPr>
@@ -844,7 +844,7 @@
                 <w:color w:val="334155"/>
                 <w:sz w:val="19"/>
               </w:rPr>
-              <w:t>모바일 앱 코드 전환</w:t>
+              <w:t>모바일 앱 코드 프로토타입 전환</w:t>
             </w:r>
           </w:p>
         </w:tc>
@@ -895,7 +895,7 @@
                 <w:color w:val="334155"/>
                 <w:sz w:val="19"/>
               </w:rPr>
-              <w:t>디자인을 Flutter 위젯으로 변환, gjc &amp; AIMy 다중 모델 연동, 클린 아키텍처 구축</w:t>
+              <w:t>디자인과 기획서를 바탕으로 코드 전환 시도, gajae-code &amp; AIMy 다중 모델 연동</w:t>
             </w:r>
           </w:p>
         </w:tc>
@@ -920,7 +920,7 @@
                 <w:color w:val="334155"/>
                 <w:sz w:val="19"/>
               </w:rPr>
-              <w:t>figma-to-flutter, Riverpod, 가재코드 &amp; AIMy</w:t>
+              <w:t>flutter, gajae-code, AIMy</w:t>
             </w:r>
           </w:p>
         </w:tc>
@@ -997,7 +997,7 @@
                 <w:color w:val="334155"/>
                 <w:sz w:val="19"/>
               </w:rPr>
-              <w:t>앱 빌드 및 스토어 출시</w:t>
+              <w:t>앱 완성 및 스토어 출시 검토</w:t>
             </w:r>
           </w:p>
         </w:tc>
@@ -1046,7 +1046,7 @@
                 <w:color w:val="334155"/>
                 <w:sz w:val="19"/>
               </w:rPr>
-              <w:t>개발자 등록, 패키징, 개인정보 처리방침 작성, 심사 제출</w:t>
+              <w:t>앱 완성도 검증 후 개발자 등록, AI 기반 개인정보 처리방침 및 권한 서류 작성</w:t>
             </w:r>
           </w:p>
         </w:tc>
@@ -1070,7 +1070,7 @@
                 <w:color w:val="334155"/>
                 <w:sz w:val="19"/>
               </w:rPr>
-              <w:t>Google Play Console, AI 스토어 작성 보조</w:t>
+              <w:t>Google Play Console, AI 문서 작성</w:t>
             </w:r>
           </w:p>
         </w:tc>
@@ -1094,7 +1094,7 @@
                 <w:color w:val="334155"/>
                 <w:sz w:val="19"/>
               </w:rPr>
-              <w:t>구글 플레이스토어 출시 앱</w:t>
+              <w:t>구글 플레이스토어 등록 앱</w:t>
             </w:r>
           </w:p>
         </w:tc>
@@ -1255,7 +1255,7 @@
           <w:color w:val="334155"/>
           <w:sz w:val="20"/>
         </w:rPr>
-        <w:t>초기 브레인스토밍 및 질의</w:t>
+        <w:t>초기 브레인스토밍 및 실현 가능성 질의</w:t>
       </w:r>
       <w:r>
         <w:rPr>
@@ -1309,7 +1309,7 @@
           <w:color w:val="334155"/>
           <w:sz w:val="20"/>
         </w:rPr>
-        <w:t xml:space="preserve">떠오른 아이디어가 모바일 환경에서 실제로 구현 가능한지, 환자에게 임상적 부작용은 없는지 </w:t>
+        <w:t xml:space="preserve">떠오른 아이디어가 모바일 앱 환경에서 실제로 구현 가능한지, 어떤 방식이 적합할지 </w:t>
       </w:r>
       <w:r>
         <w:rPr>
@@ -1318,7 +1318,7 @@
           <w:color w:val="334155"/>
           <w:sz w:val="20"/>
         </w:rPr>
-        <w:t>ChatGPT, Gemini, Claude, Copilot</w:t>
+        <w:t>copilot</w:t>
       </w:r>
       <w:r>
         <w:rPr>
@@ -1326,7 +1326,24 @@
           <w:color w:val="334155"/>
           <w:sz w:val="20"/>
         </w:rPr>
-        <w:t xml:space="preserve"> 등 다양한 생성형 AI 대화 모델을 사운딩 보드로 활용해 질문하며 기본 프로젝트 골격을 잡음.</w:t>
+        <w:t xml:space="preserve">이나 </w:t>
+      </w:r>
+      <w:r>
+        <w:rPr>
+          <w:rFonts w:ascii="맑은 고딕" w:hAnsi="맑은 고딕" w:eastAsia="맑은 고딕"/>
+          <w:b/>
+          <w:color w:val="334155"/>
+          <w:sz w:val="20"/>
+        </w:rPr>
+        <w:t>gemini</w:t>
+      </w:r>
+      <w:r>
+        <w:rPr>
+          <w:rFonts w:ascii="맑은 고딕" w:hAnsi="맑은 고딕" w:eastAsia="맑은 고딕"/>
+          <w:color w:val="334155"/>
+          <w:sz w:val="20"/>
+        </w:rPr>
+        <w:t xml:space="preserve"> 같은 AI에게 질의하며 대략적인 개발 방향을 확립함.</w:t>
       </w:r>
     </w:p>
     <w:p>
@@ -1349,7 +1366,85 @@
           <w:color w:val="2563EB"/>
           <w:sz w:val="24"/>
         </w:rPr>
-        <w:t>2단계: 화면 설계 및 디자인 기반의 아이디어 구체화 (Figma &amp; Figma MCP) (완료)</w:t>
+        <w:t>2단계: 화면 설계 및 디자인 기반의 아이디어 구체화 (figma &amp; figma MCP) (완료)</w:t>
+      </w:r>
+    </w:p>
+    <w:p>
+      <w:pPr>
+        <w:spacing w:before="30" w:after="30"/>
+        <w:ind w:left="360"/>
+      </w:pPr>
+      <w:r>
+        <w:rPr>
+          <w:rFonts w:ascii="맑은 고딕" w:hAnsi="맑은 고딕"/>
+          <w:b/>
+          <w:color w:val="6366F1"/>
+          <w:sz w:val="20"/>
+        </w:rPr>
+        <w:t xml:space="preserve">• </w:t>
+      </w:r>
+      <w:r>
+        <w:rPr>
+          <w:rFonts w:ascii="맑은 고딕" w:hAnsi="맑은 고딕" w:eastAsia="맑은 고딕"/>
+          <w:b/>
+          <w:color w:val="334155"/>
+          <w:sz w:val="20"/>
+        </w:rPr>
+        <w:t>figma 내장 AI 활용 및 시안 비교 선택</w:t>
+      </w:r>
+      <w:r>
+        <w:rPr>
+          <w:rFonts w:ascii="맑은 고딕" w:hAnsi="맑은 고딕" w:eastAsia="맑은 고딕"/>
+          <w:color w:val="334155"/>
+          <w:sz w:val="20"/>
+        </w:rPr>
+        <w:t>:</w:t>
+      </w:r>
+    </w:p>
+    <w:p>
+      <w:pPr>
+        <w:spacing w:before="30" w:after="30"/>
+        <w:ind w:left="720"/>
+      </w:pPr>
+      <w:r>
+        <w:rPr>
+          <w:rFonts w:ascii="맑은 고딕" w:hAnsi="맑은 고딕"/>
+          <w:b/>
+          <w:color w:val="6366F1"/>
+          <w:sz w:val="20"/>
+        </w:rPr>
+        <w:t xml:space="preserve">⁃ </w:t>
+      </w:r>
+      <w:r>
+        <w:rPr>
+          <w:rFonts w:ascii="맑은 고딕" w:hAnsi="맑은 고딕" w:eastAsia="맑은 고딕"/>
+          <w:color w:val="334155"/>
+          <w:sz w:val="20"/>
+        </w:rPr>
+        <w:t>figma의 AI 생성 기능을 활용해 복약 관리, 습관 관리, 달력, 마스코트 화면의 초기 와이어프레임 틀을 제작함.</w:t>
+      </w:r>
+    </w:p>
+    <w:p>
+      <w:pPr>
+        <w:spacing w:before="30" w:after="30"/>
+        <w:ind w:left="720"/>
+      </w:pPr>
+      <w:r>
+        <w:rPr>
+          <w:rFonts w:ascii="맑은 고딕" w:hAnsi="맑은 고딕"/>
+          <w:b/>
+          <w:color w:val="6366F1"/>
+          <w:sz w:val="20"/>
+        </w:rPr>
+        <w:t xml:space="preserve">⁃ </w:t>
+      </w:r>
+      <w:r>
+        <w:rPr>
+          <w:rFonts w:ascii="맑은 고딕" w:hAnsi="맑은 고딕" w:eastAsia="맑은 고딕"/>
+          <w:color w:val="334155"/>
+          <w:sz w:val="20"/>
+        </w:rPr>
+        <w:t>헤더 영역의 36×36 dp 원형 마스코트 버튼처럼 규격이 명확한 요소는 AI에게 직접 지시하여 배치하고, 배치가 애매한 영역은 AI에게 여러 시안을 추천받아 비교 검토한 뒤 최적의 안을 선택함.</w:t>
       </w:r>
     </w:p>
     <w:p>
@@ -1427,7 +1522,7 @@
           <w:color w:val="334155"/>
           <w:sz w:val="20"/>
         </w:rPr>
-        <w:t xml:space="preserve">약 복용을 놓쳤을 때 빨간색 경고나 스트릭(연속 일수) 단절을 표시하는 기존 방식을 시각화해 본 결과, 이것이 정신질환 환자에게 심한 죄책감과 자기비하를 주어 앱 이탈을 유발한다는 점을 확인함. 이에 따라 AI와 논의하여 실패를 자책하지 않고 "이번 달에 15번이나 복약하셨어요!"와 같이 누적 실천 횟수를 칭찬하는 </w:t>
+        <w:t xml:space="preserve">약 복용을 놓쳤을 때 빨간색 경고나 연속 기록 리셋을 표시하는 기존 방식을 시각화해 본 결과, 이것이 정신질환 환자에게 심한 죄책감과 자기비하를 주어 앱 이탈을 유발한다는 점을 확인함. 이에 따라 AI와 논의하여 실패를 자책하지 않고 "이번 달에 15번이나 복약하셨어요!"와 같이 누적 실천 횟수를 칭찬하는 </w:t>
       </w:r>
       <w:r>
         <w:rPr>
@@ -1491,108 +1586,7 @@
           <w:color w:val="334155"/>
           <w:sz w:val="20"/>
         </w:rPr>
-        <w:t>피그마 내장 AI 및 세부 배치 분담</w:t>
-      </w:r>
-      <w:r>
-        <w:rPr>
-          <w:rFonts w:ascii="맑은 고딕" w:hAnsi="맑은 고딕" w:eastAsia="맑은 고딕"/>
-          <w:color w:val="334155"/>
-          <w:sz w:val="20"/>
-        </w:rPr>
-        <w:t>:</w:t>
-      </w:r>
-    </w:p>
-    <w:p>
-      <w:pPr>
-        <w:spacing w:before="30" w:after="30"/>
-        <w:ind w:left="720"/>
-      </w:pPr>
-      <w:r>
-        <w:rPr>
-          <w:rFonts w:ascii="맑은 고딕" w:hAnsi="맑은 고딕"/>
-          <w:b/>
-          <w:color w:val="6366F1"/>
-          <w:sz w:val="20"/>
-        </w:rPr>
-        <w:t xml:space="preserve">⁃ </w:t>
-      </w:r>
-      <w:r>
-        <w:rPr>
-          <w:rFonts w:ascii="맑은 고딕" w:hAnsi="맑은 고딕" w:eastAsia="맑은 고딕"/>
-          <w:color w:val="334155"/>
-          <w:sz w:val="20"/>
-        </w:rPr>
-        <w:t>Figma의 AI 생성 기능을 활용해 복약 관리, 습관 관리, 달력, 마스코트 화면의 초기 와이어프레임 틀을 빠르게 제작함.</w:t>
-      </w:r>
-    </w:p>
-    <w:p>
-      <w:pPr>
-        <w:spacing w:before="30" w:after="30"/>
-        <w:ind w:left="720"/>
-      </w:pPr>
-      <w:r>
-        <w:rPr>
-          <w:rFonts w:ascii="맑은 고딕" w:hAnsi="맑은 고딕"/>
-          <w:b/>
-          <w:color w:val="6366F1"/>
-          <w:sz w:val="20"/>
-        </w:rPr>
-        <w:t xml:space="preserve">⁃ </w:t>
-      </w:r>
-      <w:r>
-        <w:rPr>
-          <w:rFonts w:ascii="맑은 고딕" w:hAnsi="맑은 고딕" w:eastAsia="맑은 고딕"/>
-          <w:color w:val="334155"/>
-          <w:sz w:val="20"/>
-        </w:rPr>
-        <w:t>헤더 영역의 36×36 dp 원형 마스코트 버튼이나 2×1 위젯 규격처럼 수치가 확정된 요소는 AI에게 직접 지시하여 정확하게 배치함.</w:t>
-      </w:r>
-    </w:p>
-    <w:p>
-      <w:pPr>
-        <w:spacing w:before="30" w:after="30"/>
-        <w:ind w:left="720"/>
-      </w:pPr>
-      <w:r>
-        <w:rPr>
-          <w:rFonts w:ascii="맑은 고딕" w:hAnsi="맑은 고딕"/>
-          <w:b/>
-          <w:color w:val="6366F1"/>
-          <w:sz w:val="20"/>
-        </w:rPr>
-        <w:t xml:space="preserve">⁃ </w:t>
-      </w:r>
-      <w:r>
-        <w:rPr>
-          <w:rFonts w:ascii="맑은 고딕" w:hAnsi="맑은 고딕" w:eastAsia="맑은 고딕"/>
-          <w:color w:val="334155"/>
-          <w:sz w:val="20"/>
-        </w:rPr>
-        <w:t>레이아웃 구성이 모호한 영역은 AI에게 여러 시안을 생성하도록 요청한 뒤 팀원들이 비교 검토하여 가장 직관적인 형태를 선택함.</w:t>
-      </w:r>
-    </w:p>
-    <w:p>
-      <w:pPr>
-        <w:spacing w:before="30" w:after="30"/>
-        <w:ind w:left="360"/>
-      </w:pPr>
-      <w:r>
-        <w:rPr>
-          <w:rFonts w:ascii="맑은 고딕" w:hAnsi="맑은 고딕"/>
-          <w:b/>
-          <w:color w:val="6366F1"/>
-          <w:sz w:val="20"/>
-        </w:rPr>
-        <w:t xml:space="preserve">• </w:t>
-      </w:r>
-      <w:r>
-        <w:rPr>
-          <w:rFonts w:ascii="맑은 고딕" w:hAnsi="맑은 고딕" w:eastAsia="맑은 고딕"/>
-          <w:b/>
-          <w:color w:val="334155"/>
-          <w:sz w:val="20"/>
-        </w:rPr>
-        <w:t>Figma MCP(Model Context Protocol) 연동을 통한 대량 일괄 자동화</w:t>
+        <w:t>figma MCP 연동을 통한 대량 일괄 자동화</w:t>
       </w:r>
       <w:r>
         <w:rPr>
@@ -1646,7 +1640,24 @@
           <w:color w:val="334155"/>
           <w:sz w:val="20"/>
         </w:rPr>
-        <w:t>이를 해결하기 위해 외부 AI 에이전트(Antigravity)가 피그마 화면 구조를 직접 읽고 수정할 수 있는 연결 통로인 Figma MCP를 설정함.</w:t>
+        <w:t xml:space="preserve">이를 해결하기 위해 외부 AI 에이전트(antigravity)가 피그마 화면 구조를 직접 읽고 수정할 수 있는 연결 통로인 </w:t>
+      </w:r>
+      <w:r>
+        <w:rPr>
+          <w:rFonts w:ascii="맑은 고딕" w:hAnsi="맑은 고딕" w:eastAsia="맑은 고딕"/>
+          <w:b/>
+          <w:color w:val="334155"/>
+          <w:sz w:val="20"/>
+        </w:rPr>
+        <w:t>figma MCP</w:t>
+      </w:r>
+      <w:r>
+        <w:rPr>
+          <w:rFonts w:ascii="맑은 고딕" w:hAnsi="맑은 고딕" w:eastAsia="맑은 고딕"/>
+          <w:color w:val="334155"/>
+          <w:sz w:val="20"/>
+        </w:rPr>
+        <w:t>를 설정함.</w:t>
       </w:r>
     </w:p>
     <w:tbl>
@@ -1710,7 +1721,7 @@
                 <w:sz w:val="20"/>
               </w:rPr>
               <w:br/>
-              <w:t>텍스트 대화창에 머물러 있는 AI가 피그마 같은 외부 소프트웨어의 내부 객체 트리에 접근하여 레이아웃, 텍스트, 색상 등을 직접 읽고 수정할 수 있도록 지원하는 표준 통신 규격임.</w:t>
+              <w:t>텍스트 대화창에 머물러 있는 AI(이 경우에는 antigravity)가 피그마 같은 외부 작업 공간에 직접 연결하여 도형, 텍스트, 화면 링크 등을 읽고 조작할 수 있도록 지원하는 표준 통신 연결 통로임.</w:t>
             </w:r>
           </w:p>
         </w:tc>
@@ -1741,7 +1752,7 @@
           <w:color w:val="334155"/>
           <w:sz w:val="20"/>
         </w:rPr>
-        <w:t>AI가 스크립트를 작성하여 수십 개 화면의 텍스트와 색상 규격을 일괄 적용하고, 화면 간 이동 링크(프로토타입 인터랙션)를 피그마 캔버스에 직접 반영함.</w:t>
+        <w:t>AI가 스크립트를 작성하여 수십 개 화면의 텍스트와 색상 규격을 일괄 적용하고, 화면 간 이동 연결(프로토타입 인터랙션)을 피그마 캔버스에 직접 반영함.</w:t>
       </w:r>
     </w:p>
     <w:p>
@@ -1764,7 +1775,7 @@
           <w:color w:val="2563EB"/>
           <w:sz w:val="24"/>
         </w:rPr>
-        <w:t>3단계: 순서도·의사코드 설계, 하네스 안전 규칙 수립 및 PRD 문서화 (진행 중)</w:t>
+        <w:t>3단계: 기획명세서(PRD) 수립 및 코딩 스킬 규칙 세팅 (진행 중)</w:t>
       </w:r>
     </w:p>
     <w:p>
@@ -1788,7 +1799,7 @@
           <w:color w:val="334155"/>
           <w:sz w:val="20"/>
         </w:rPr>
-        <w:t>순서도와 의사코드(Pseudocode) 사전 작성</w:t>
+        <w:t>상세 기획명세서(PRD) 작성</w:t>
       </w:r>
       <w:r>
         <w:rPr>
@@ -1819,22 +1830,16 @@
           <w:color w:val="334155"/>
           <w:sz w:val="20"/>
         </w:rPr>
-        <w:t>실제 코딩에 들어가기 전, 기능 동작 논리를 사전에 검증하기 위해 순서도와 의사코드(자연어로 표현한 알고리즘)를 먼저 도출함.</w:t>
+        <w:t>피그마 디자인과 조원 간 의논했던 내역들을 취합하여, 프로그래밍 비전공자가 보아도 앱의 동작 방식을 대략적으로 파악할 수 있도록 상세 기획명세서(</w:t>
       </w:r>
-    </w:p>
-    <w:p>
-      <w:pPr>
-        <w:spacing w:before="30" w:after="30"/>
-        <w:ind w:left="720"/>
-      </w:pPr>
       <w:r>
         <w:rPr>
-          <w:rFonts w:ascii="맑은 고딕" w:hAnsi="맑은 고딕"/>
-          <w:b/>
-          <w:color w:val="6366F1"/>
+          <w:rFonts w:ascii="맑은 고딕" w:hAnsi="맑은 고딕" w:eastAsia="맑은 고딕"/>
+          <w:color w:val="2563EB"/>
           <w:sz w:val="20"/>
+          <w:u w:val="single"/>
         </w:rPr>
-        <w:t xml:space="preserve">⁃ </w:t>
+        <w:t>PRD_기획명세서.md</w:t>
       </w:r>
       <w:r>
         <w:rPr>
@@ -1842,7 +1847,7 @@
           <w:color w:val="334155"/>
           <w:sz w:val="20"/>
         </w:rPr>
-        <w:t>복약 버튼 탭 시 시각 기록 방식, 복용 시간 변경 및 건너뛰기 예외 처리, 며칠간 미접속 시의 알림 조건을 정리하여 팀원 간 기능 합의를 완료함.</w:t>
+        <w:t>, Word 문서)를 작성하여 조원들과 함께 검토 및 보완 중임.</w:t>
       </w:r>
     </w:p>
     <w:p>
@@ -1866,154 +1871,7 @@
           <w:color w:val="334155"/>
           <w:sz w:val="20"/>
         </w:rPr>
-        <w:t>가재코드(gjc)와 Antigravity의 역할 분담</w:t>
-      </w:r>
-      <w:r>
-        <w:rPr>
-          <w:rFonts w:ascii="맑은 고딕" w:hAnsi="맑은 고딕" w:eastAsia="맑은 고딕"/>
-          <w:color w:val="334155"/>
-          <w:sz w:val="20"/>
-        </w:rPr>
-        <w:t>:</w:t>
-      </w:r>
-    </w:p>
-    <w:p>
-      <w:pPr>
-        <w:spacing w:before="30" w:after="30"/>
-        <w:ind w:left="720"/>
-      </w:pPr>
-      <w:r>
-        <w:rPr>
-          <w:rFonts w:ascii="맑은 고딕" w:hAnsi="맑은 고딕"/>
-          <w:b/>
-          <w:color w:val="6366F1"/>
-          <w:sz w:val="20"/>
-        </w:rPr>
-        <w:t xml:space="preserve">⁃ </w:t>
-      </w:r>
-      <w:r>
-        <w:rPr>
-          <w:rFonts w:ascii="맑은 고딕" w:hAnsi="맑은 고딕" w:eastAsia="맑은 고딕"/>
-          <w:b/>
-          <w:color w:val="334155"/>
-          <w:sz w:val="20"/>
-        </w:rPr>
-        <w:t>가재코드(Gajae-Code / gjc)</w:t>
-      </w:r>
-      <w:r>
-        <w:rPr>
-          <w:rFonts w:ascii="맑은 고딕" w:hAnsi="맑은 고딕" w:eastAsia="맑은 고딕"/>
-          <w:color w:val="334155"/>
-          <w:sz w:val="20"/>
-        </w:rPr>
-        <w:t xml:space="preserve">: 코딩 AI가 기존 코드를 충분히 파악하지 않고 성급하게 수정하여 전체 구조를 망가뜨리는 문제를 방지하기 위해 </w:t>
-      </w:r>
-      <w:r>
-        <w:rPr>
-          <w:rFonts w:ascii="맑은 고딕" w:hAnsi="맑은 고딕" w:eastAsia="맑은 고딕"/>
-          <w:b/>
-          <w:color w:val="334155"/>
-          <w:sz w:val="20"/>
-        </w:rPr>
-        <w:t>안전 규칙과 작업 통제 절차</w:t>
-      </w:r>
-      <w:r>
-        <w:rPr>
-          <w:rFonts w:ascii="맑은 고딕" w:hAnsi="맑은 고딕" w:eastAsia="맑은 고딕"/>
-          <w:color w:val="334155"/>
-          <w:sz w:val="20"/>
-        </w:rPr>
-        <w:t>를 수립함. [질문 및 요구사항 확인 ➔ 작업 계획 수립 및 검토 ➔ 사용자 승인 후 코드 실행]이라는 하네스 절차를 강제하고, 모바일 메신저(디스코드/텔레그램) 원격 승인 환경을 구축함.</w:t>
-      </w:r>
-    </w:p>
-    <w:p>
-      <w:pPr>
-        <w:spacing w:before="30" w:after="30"/>
-        <w:ind w:left="720"/>
-      </w:pPr>
-      <w:r>
-        <w:rPr>
-          <w:rFonts w:ascii="맑은 고딕" w:hAnsi="맑은 고딕"/>
-          <w:b/>
-          <w:color w:val="6366F1"/>
-          <w:sz w:val="20"/>
-        </w:rPr>
-        <w:t xml:space="preserve">⁃ </w:t>
-      </w:r>
-      <w:r>
-        <w:rPr>
-          <w:rFonts w:ascii="맑은 고딕" w:hAnsi="맑은 고딕" w:eastAsia="맑은 고딕"/>
-          <w:b/>
-          <w:color w:val="334155"/>
-          <w:sz w:val="20"/>
-        </w:rPr>
-        <w:t>Antigravity (AI 실무 파트너)</w:t>
-      </w:r>
-      <w:r>
-        <w:rPr>
-          <w:rFonts w:ascii="맑은 고딕" w:hAnsi="맑은 고딕" w:eastAsia="맑은 고딕"/>
-          <w:color w:val="334155"/>
-          <w:sz w:val="20"/>
-        </w:rPr>
-        <w:t xml:space="preserve">: 공식 엔지니어링 문서인 </w:t>
-      </w:r>
-      <w:r>
-        <w:rPr>
-          <w:rFonts w:ascii="맑은 고딕" w:hAnsi="맑은 고딕" w:eastAsia="맑은 고딕"/>
-          <w:color w:val="2563EB"/>
-          <w:sz w:val="20"/>
-          <w:u w:val="single"/>
-        </w:rPr>
-        <w:t>PRD_기획명세서.md</w:t>
-      </w:r>
-      <w:r>
-        <w:rPr>
-          <w:rFonts w:ascii="맑은 고딕" w:hAnsi="맑은 고딕" w:eastAsia="맑은 고딕"/>
-          <w:color w:val="334155"/>
-          <w:sz w:val="20"/>
-        </w:rPr>
-        <w:t xml:space="preserve"> 및 Word 문서 변환, 학술적 배경 보고서 작성, 순서도 및 의사코드 실체화, Figma 스크립트 실행, Git 형상 관리 등 </w:t>
-      </w:r>
-      <w:r>
-        <w:rPr>
-          <w:rFonts w:ascii="맑은 고딕" w:hAnsi="맑은 고딕" w:eastAsia="맑은 고딕"/>
-          <w:b/>
-          <w:color w:val="334155"/>
-          <w:sz w:val="20"/>
-        </w:rPr>
-        <w:t>실제 프로젝트 산출물을 직접 제작하고 구체화</w:t>
-      </w:r>
-      <w:r>
-        <w:rPr>
-          <w:rFonts w:ascii="맑은 고딕" w:hAnsi="맑은 고딕" w:eastAsia="맑은 고딕"/>
-          <w:color w:val="334155"/>
-          <w:sz w:val="20"/>
-        </w:rPr>
-        <w:t>함.</w:t>
-      </w:r>
-    </w:p>
-    <w:p>
-      <w:pPr>
-        <w:spacing w:before="30" w:after="30"/>
-        <w:ind w:left="360"/>
-      </w:pPr>
-      <w:r>
-        <w:rPr>
-          <w:rFonts w:ascii="맑은 고딕" w:hAnsi="맑은 고딕"/>
-          <w:b/>
-          <w:color w:val="6366F1"/>
-          <w:sz w:val="20"/>
-        </w:rPr>
-        <w:t xml:space="preserve">• </w:t>
-      </w:r>
-      <w:r>
-        <w:rPr>
-          <w:rFonts w:ascii="맑은 고딕" w:hAnsi="맑은 고딕" w:eastAsia="맑은 고딕"/>
-          <w:b/>
-          <w:color w:val="334155"/>
-          <w:sz w:val="20"/>
-        </w:rPr>
-        <w:t>AI 스킬(Skills) 표준화</w:t>
+        <w:t>깃허브(github) 스킬(Skills) 사전 장착</w:t>
       </w:r>
       <w:r>
         <w:rPr>
@@ -2044,24 +1902,7 @@
           <w:color w:val="334155"/>
           <w:sz w:val="20"/>
         </w:rPr>
-        <w:t>AI가 향후 코드를 작성할 때 일관된 아키텍처 규칙을 따르도록 GitHub에서 검증된 스킬 파일들(</w:t>
-      </w:r>
-      <w:r>
-        <w:rPr>
-          <w:rFonts w:ascii="맑은 고딕" w:hAnsi="맑은 고딕" w:eastAsia="맑은 고딕"/>
-          <w:color w:val="2563EB"/>
-          <w:sz w:val="20"/>
-          <w:u w:val="single"/>
-        </w:rPr>
-        <w:t>.agents/skills/</w:t>
-      </w:r>
-      <w:r>
-        <w:rPr>
-          <w:rFonts w:ascii="맑은 고딕" w:hAnsi="맑은 고딕" w:eastAsia="맑은 고딕"/>
-          <w:color w:val="334155"/>
-          <w:sz w:val="20"/>
-        </w:rPr>
-        <w:t>)을 프로젝트에 배치함. 여기에는 피그마 위젯 변환 규칙(</w:t>
+        <w:t>AI가 코드를 작성할 때 따라야 할 규칙들을 깃허브에서 탐색하여 프로젝트에 미리 세팅해 둠. 여기에는 피그마 화면을 플러터 코드로 바꾸는 규칙(</w:t>
       </w:r>
       <w:r>
         <w:rPr>
@@ -2115,6 +1956,241 @@
         <w:t>)이 포함됨.</w:t>
       </w:r>
     </w:p>
+    <w:tbl>
+      <w:tblPr>
+        <w:tblW w:type="auto" w:w="0"/>
+        <w:jc w:val="center"/>
+        <w:tblLayout w:type="fixed"/>
+        <w:tblLook w:firstColumn="1" w:firstRow="1" w:lastColumn="0" w:lastRow="0" w:noHBand="0" w:noVBand="1" w:val="04A0"/>
+        <w:tblBorders>
+          <w:top w:val="none"/>
+          <w:bottom w:val="none"/>
+          <w:left w:val="single" w:sz="24" w:space="0" w:color="3B82F6"/>
+          <w:right w:val="none"/>
+          <w:insideH w:val="none"/>
+          <w:insideV w:val="none"/>
+        </w:tblBorders>
+      </w:tblPr>
+      <w:tblGrid>
+        <w:gridCol w:w="9360"/>
+      </w:tblGrid>
+      <w:tr>
+        <w:tc>
+          <w:tcPr>
+            <w:tcW w:type="dxa" w:w="9360"/>
+            <w:shd w:fill="EFF6FF"/>
+            <w:tcMar>
+              <w:top w:w="140" w:type="dxa"/>
+              <w:bottom w:w="140" w:type="dxa"/>
+              <w:left w:w="200" w:type="dxa"/>
+              <w:right w:w="140" w:type="dxa"/>
+            </w:tcMar>
+          </w:tcPr>
+          <w:p>
+            <w:pPr>
+              <w:spacing w:before="60" w:after="60"/>
+            </w:pPr>
+            <w:r>
+              <w:rPr>
+                <w:rFonts w:ascii="맑은 고딕" w:hAnsi="맑은 고딕" w:eastAsia="맑은 고딕"/>
+                <w:i/>
+                <w:color w:val="1E3A8A"/>
+                <w:sz w:val="20"/>
+              </w:rPr>
+              <w:t xml:space="preserve">💡 </w:t>
+            </w:r>
+            <w:r>
+              <w:rPr>
+                <w:rFonts w:ascii="맑은 고딕" w:hAnsi="맑은 고딕" w:eastAsia="맑은 고딕"/>
+                <w:b/>
+                <w:i/>
+                <w:color w:val="1E3A8A"/>
+                <w:sz w:val="20"/>
+              </w:rPr>
+              <w:t>참고: AI 스킬(Skills)이란?</w:t>
+            </w:r>
+            <w:r>
+              <w:rPr>
+                <w:rFonts w:ascii="맑은 고딕" w:hAnsi="맑은 고딕" w:eastAsia="맑은 고딕"/>
+                <w:i/>
+                <w:color w:val="1E3A8A"/>
+                <w:sz w:val="20"/>
+              </w:rPr>
+              <w:br/>
+              <w:t>AI가 특정 전문 작업(디자인 ➔ 코드 변환, 아키텍처 구성 등)을 수행할 때 일관된 품질과 표준을 유지하도록, 따라야 하는 세부 규칙과 컨벤션을 프롬프트 형태로 미리 만들어 둔 표준 지침 문서임.</w:t>
+            </w:r>
+          </w:p>
+        </w:tc>
+      </w:tr>
+    </w:tbl>
+    <w:p>
+      <w:pPr>
+        <w:spacing w:before="0" w:after="60"/>
+      </w:pPr>
+    </w:p>
+    <w:p>
+      <w:pPr>
+        <w:spacing w:before="30" w:after="30"/>
+        <w:ind w:left="360"/>
+      </w:pPr>
+      <w:r>
+        <w:rPr>
+          <w:rFonts w:ascii="맑은 고딕" w:hAnsi="맑은 고딕"/>
+          <w:b/>
+          <w:color w:val="6366F1"/>
+          <w:sz w:val="20"/>
+        </w:rPr>
+        <w:t xml:space="preserve">• </w:t>
+      </w:r>
+      <w:r>
+        <w:rPr>
+          <w:rFonts w:ascii="맑은 고딕" w:hAnsi="맑은 고딕" w:eastAsia="맑은 고딕"/>
+          <w:b/>
+          <w:color w:val="334155"/>
+          <w:sz w:val="20"/>
+        </w:rPr>
+        <w:t>가재코드(gajae-code) 안전 통제 규칙 수립</w:t>
+      </w:r>
+      <w:r>
+        <w:rPr>
+          <w:rFonts w:ascii="맑은 고딕" w:hAnsi="맑은 고딕" w:eastAsia="맑은 고딕"/>
+          <w:color w:val="334155"/>
+          <w:sz w:val="20"/>
+        </w:rPr>
+        <w:t>:</w:t>
+      </w:r>
+    </w:p>
+    <w:p>
+      <w:pPr>
+        <w:spacing w:before="30" w:after="30"/>
+        <w:ind w:left="720"/>
+      </w:pPr>
+      <w:r>
+        <w:rPr>
+          <w:rFonts w:ascii="맑은 고딕" w:hAnsi="맑은 고딕"/>
+          <w:b/>
+          <w:color w:val="6366F1"/>
+          <w:sz w:val="20"/>
+        </w:rPr>
+        <w:t xml:space="preserve">⁃ </w:t>
+      </w:r>
+      <w:r>
+        <w:rPr>
+          <w:rFonts w:ascii="맑은 고딕" w:hAnsi="맑은 고딕" w:eastAsia="맑은 고딕"/>
+          <w:color w:val="334155"/>
+          <w:sz w:val="20"/>
+        </w:rPr>
+        <w:t xml:space="preserve">코딩 AI가 기존 코드를 충분히 파악하지 않고 성급하게 수정하여 전체 프로젝트를 망가뜨리지 않도록, 오픈소스 도구인 </w:t>
+      </w:r>
+      <w:r>
+        <w:rPr>
+          <w:rFonts w:ascii="맑은 고딕" w:hAnsi="맑은 고딕" w:eastAsia="맑은 고딕"/>
+          <w:b/>
+          <w:color w:val="334155"/>
+          <w:sz w:val="20"/>
+        </w:rPr>
+        <w:t>가재코드(gajae-code)</w:t>
+      </w:r>
+      <w:r>
+        <w:rPr>
+          <w:rFonts w:ascii="맑은 고딕" w:hAnsi="맑은 고딕" w:eastAsia="맑은 고딕"/>
+          <w:color w:val="334155"/>
+          <w:sz w:val="20"/>
+        </w:rPr>
+        <w:t>를 도입하여 작업 안전 통제 절차를 정의함.</w:t>
+      </w:r>
+    </w:p>
+    <w:tbl>
+      <w:tblPr>
+        <w:tblW w:type="auto" w:w="0"/>
+        <w:jc w:val="center"/>
+        <w:tblLayout w:type="fixed"/>
+        <w:tblLook w:firstColumn="1" w:firstRow="1" w:lastColumn="0" w:lastRow="0" w:noHBand="0" w:noVBand="1" w:val="04A0"/>
+        <w:tblBorders>
+          <w:top w:val="none"/>
+          <w:bottom w:val="none"/>
+          <w:left w:val="single" w:sz="24" w:space="0" w:color="3B82F6"/>
+          <w:right w:val="none"/>
+          <w:insideH w:val="none"/>
+          <w:insideV w:val="none"/>
+        </w:tblBorders>
+      </w:tblPr>
+      <w:tblGrid>
+        <w:gridCol w:w="9360"/>
+      </w:tblGrid>
+      <w:tr>
+        <w:tc>
+          <w:tcPr>
+            <w:tcW w:type="dxa" w:w="9360"/>
+            <w:shd w:fill="EFF6FF"/>
+            <w:tcMar>
+              <w:top w:w="140" w:type="dxa"/>
+              <w:bottom w:w="140" w:type="dxa"/>
+              <w:left w:w="200" w:type="dxa"/>
+              <w:right w:w="140" w:type="dxa"/>
+            </w:tcMar>
+          </w:tcPr>
+          <w:p>
+            <w:pPr>
+              <w:spacing w:before="60" w:after="60"/>
+            </w:pPr>
+            <w:r>
+              <w:rPr>
+                <w:rFonts w:ascii="맑은 고딕" w:hAnsi="맑은 고딕" w:eastAsia="맑은 고딕"/>
+                <w:i/>
+                <w:color w:val="1E3A8A"/>
+                <w:sz w:val="20"/>
+              </w:rPr>
+              <w:t xml:space="preserve">💡 </w:t>
+            </w:r>
+            <w:r>
+              <w:rPr>
+                <w:rFonts w:ascii="맑은 고딕" w:hAnsi="맑은 고딕" w:eastAsia="맑은 고딕"/>
+                <w:b/>
+                <w:i/>
+                <w:color w:val="1E3A8A"/>
+                <w:sz w:val="20"/>
+              </w:rPr>
+              <w:t>참고: 에이전트 하네스(Harness)란?</w:t>
+            </w:r>
+            <w:r>
+              <w:rPr>
+                <w:rFonts w:ascii="맑은 고딕" w:hAnsi="맑은 고딕" w:eastAsia="맑은 고딕"/>
+                <w:i/>
+                <w:color w:val="1E3A8A"/>
+                <w:sz w:val="20"/>
+              </w:rPr>
+              <w:br/>
+              <w:t xml:space="preserve">AI가 곧바로 코드를 짜는 대신 </w:t>
+            </w:r>
+            <w:r>
+              <w:rPr>
+                <w:rFonts w:ascii="맑은 고딕" w:hAnsi="맑은 고딕" w:eastAsia="맑은 고딕"/>
+                <w:b/>
+                <w:i/>
+                <w:color w:val="1E3A8A"/>
+                <w:sz w:val="20"/>
+              </w:rPr>
+              <w:t>[심층 인터뷰(Deep-Interview) ➔ 계획 수립과 확인(Ralplan) ➔ 실행 및 증거 제시(Ultragoal)]</w:t>
+            </w:r>
+            <w:r>
+              <w:rPr>
+                <w:rFonts w:ascii="맑은 고딕" w:hAnsi="맑은 고딕" w:eastAsia="맑은 고딕"/>
+                <w:i/>
+                <w:color w:val="1E3A8A"/>
+                <w:sz w:val="20"/>
+              </w:rPr>
+              <w:t>의 단계로 나누어 프로젝트를 효율적이고 정확하게 구현하도록 돕는 오픈소스 AI 코딩 에이전트 통제·관리 도구임.</w:t>
+            </w:r>
+          </w:p>
+        </w:tc>
+      </w:tr>
+    </w:tbl>
+    <w:p>
+      <w:pPr>
+        <w:spacing w:before="0" w:after="60"/>
+      </w:pPr>
+    </w:p>
     <w:p>
       <w:pPr>
         <w:spacing w:before="160" w:after="160"/>
@@ -2135,7 +2211,7 @@
           <w:color w:val="2563EB"/>
           <w:sz w:val="24"/>
         </w:rPr>
-        <w:t>4단계: 모바일 앱 코드 전환 (Flutter, 향후 진행 예정)</w:t>
+        <w:t>4단계: 모바일 앱 코드 프로토타입 전환 (flutter, 향후 진행 예정)</w:t>
       </w:r>
     </w:p>
     <w:p>
@@ -2167,188 +2243,7 @@
           <w:color w:val="334155"/>
           <w:sz w:val="20"/>
         </w:rPr>
-        <w:t>: 확정된 기획명세서와 디자인 프로토타입을 실제 스마트폰에서 터치되고 데이터가 저장되는 Flutter 코드로 구현함.</w:t>
-      </w:r>
-    </w:p>
-    <w:p>
-      <w:pPr>
-        <w:spacing w:before="30" w:after="30"/>
-        <w:ind w:left="360"/>
-      </w:pPr>
-      <w:r>
-        <w:rPr>
-          <w:rFonts w:ascii="맑은 고딕" w:hAnsi="맑은 고딕"/>
-          <w:b/>
-          <w:color w:val="6366F1"/>
-          <w:sz w:val="20"/>
-        </w:rPr>
-        <w:t xml:space="preserve">• </w:t>
-      </w:r>
-      <w:r>
-        <w:rPr>
-          <w:rFonts w:ascii="맑은 고딕" w:hAnsi="맑은 고딕" w:eastAsia="맑은 고딕"/>
-          <w:b/>
-          <w:color w:val="334155"/>
-          <w:sz w:val="20"/>
-        </w:rPr>
-        <w:t>진행 계획</w:t>
-      </w:r>
-      <w:r>
-        <w:rPr>
-          <w:rFonts w:ascii="맑은 고딕" w:hAnsi="맑은 고딕" w:eastAsia="맑은 고딕"/>
-          <w:color w:val="334155"/>
-          <w:sz w:val="20"/>
-        </w:rPr>
-        <w:t>:</w:t>
-      </w:r>
-    </w:p>
-    <w:p>
-      <w:pPr>
-        <w:spacing w:before="30" w:after="30"/>
-        <w:ind w:left="720"/>
-      </w:pPr>
-      <w:r>
-        <w:rPr>
-          <w:rFonts w:ascii="맑은 고딕" w:hAnsi="맑은 고딕"/>
-          <w:b/>
-          <w:color w:val="2563EB"/>
-          <w:sz w:val="20"/>
-        </w:rPr>
-        <w:t xml:space="preserve">1. </w:t>
-      </w:r>
-      <w:r>
-        <w:rPr>
-          <w:rFonts w:ascii="Consolas" w:hAnsi="Consolas" w:eastAsia="맑은 고딕"/>
-          <w:color w:val="B42846"/>
-          <w:sz w:val="19"/>
-        </w:rPr>
-        <w:t>figma-to-flutter</w:t>
-      </w:r>
-      <w:r>
-        <w:rPr>
-          <w:rFonts w:ascii="맑은 고딕" w:hAnsi="맑은 고딕" w:eastAsia="맑은 고딕"/>
-          <w:color w:val="334155"/>
-          <w:sz w:val="20"/>
-        </w:rPr>
-        <w:t xml:space="preserve"> 스킬을 사용하여 피그마 프레임의 배치와 스타일을 Flutter 위젯 코드로 변환함.</w:t>
-      </w:r>
-    </w:p>
-    <w:p>
-      <w:pPr>
-        <w:spacing w:before="30" w:after="30"/>
-        <w:ind w:left="720"/>
-      </w:pPr>
-      <w:r>
-        <w:rPr>
-          <w:rFonts w:ascii="맑은 고딕" w:hAnsi="맑은 고딕"/>
-          <w:b/>
-          <w:color w:val="2563EB"/>
-          <w:sz w:val="20"/>
-        </w:rPr>
-        <w:t xml:space="preserve">2. </w:t>
-      </w:r>
-      <w:r>
-        <w:rPr>
-          <w:rFonts w:ascii="맑은 고딕" w:hAnsi="맑은 고딕" w:eastAsia="맑은 고딕"/>
-          <w:color w:val="334155"/>
-          <w:sz w:val="20"/>
-        </w:rPr>
-        <w:t xml:space="preserve">실제 코드 작성 시 </w:t>
-      </w:r>
-      <w:r>
-        <w:rPr>
-          <w:rFonts w:ascii="맑은 고딕" w:hAnsi="맑은 고딕" w:eastAsia="맑은 고딕"/>
-          <w:b/>
-          <w:color w:val="334155"/>
-          <w:sz w:val="20"/>
-        </w:rPr>
-        <w:t>가재코드(`gjc`)와 다중 모델 라우팅 허브인 `AIMy`를 본격적으로 연동</w:t>
-      </w:r>
-      <w:r>
-        <w:rPr>
-          <w:rFonts w:ascii="맑은 고딕" w:hAnsi="맑은 고딕" w:eastAsia="맑은 고딕"/>
-          <w:color w:val="334155"/>
-          <w:sz w:val="20"/>
-        </w:rPr>
-        <w:t>하여 활용함. 작업 성격(아키텍처 검토, 위젯 UI 생성, 로직 작성, 단위 테스트)에 맞춰 각 역할(Agent)마다 서로 다른 최적의 AI 모델(Claude, GPT, Gemini 등)을 AIMy로 연결하여 투입하고, 가재코드의 승인 절차를 거쳐 안전하게 구현함.</w:t>
-      </w:r>
-    </w:p>
-    <w:p>
-      <w:pPr>
-        <w:spacing w:before="30" w:after="30"/>
-        <w:ind w:left="720"/>
-      </w:pPr>
-      <w:r>
-        <w:rPr>
-          <w:rFonts w:ascii="맑은 고딕" w:hAnsi="맑은 고딕"/>
-          <w:b/>
-          <w:color w:val="2563EB"/>
-          <w:sz w:val="20"/>
-        </w:rPr>
-        <w:t xml:space="preserve">3. </w:t>
-      </w:r>
-      <w:r>
-        <w:rPr>
-          <w:rFonts w:ascii="맑은 고딕" w:hAnsi="맑은 고딕" w:eastAsia="맑은 고딕"/>
-          <w:color w:val="334155"/>
-          <w:sz w:val="20"/>
-        </w:rPr>
-        <w:t>화면 UI와 내부 데이터 처리 로직을 명확히 분리하기 위해 클린 아키텍처(Riverpod 상태 관리)를 적용하고 로컬 데이터베이스 연동 및 단위 테스트를 수행함.</w:t>
-      </w:r>
-    </w:p>
-    <w:p>
-      <w:pPr>
-        <w:spacing w:before="160" w:after="160"/>
-        <w:pBdr>
-          <w:bottom w:val="single" w:sz="6" w:space="1" w:color="E2E8F0"/>
-        </w:pBdr>
-      </w:pPr>
-    </w:p>
-    <w:p>
-      <w:pPr>
-        <w:keepNext/>
-        <w:spacing w:before="220" w:after="80"/>
-      </w:pPr>
-      <w:r>
-        <w:rPr>
-          <w:rFonts w:ascii="맑은 고딕" w:hAnsi="맑은 고딕" w:eastAsia="맑은 고딕"/>
-          <w:b/>
-          <w:color w:val="2563EB"/>
-          <w:sz w:val="24"/>
-        </w:rPr>
-        <w:t>5단계: 앱 빌드 및 구글 플레이스토어 배포 (향후 진행 예정)</w:t>
-      </w:r>
-    </w:p>
-    <w:p>
-      <w:pPr>
-        <w:spacing w:before="30" w:after="30"/>
-        <w:ind w:left="360"/>
-      </w:pPr>
-      <w:r>
-        <w:rPr>
-          <w:rFonts w:ascii="맑은 고딕" w:hAnsi="맑은 고딕"/>
-          <w:b/>
-          <w:color w:val="6366F1"/>
-          <w:sz w:val="20"/>
-        </w:rPr>
-        <w:t xml:space="preserve">• </w:t>
-      </w:r>
-      <w:r>
-        <w:rPr>
-          <w:rFonts w:ascii="맑은 고딕" w:hAnsi="맑은 고딕" w:eastAsia="맑은 고딕"/>
-          <w:b/>
-          <w:color w:val="334155"/>
-          <w:sz w:val="20"/>
-        </w:rPr>
-        <w:t>목표</w:t>
-      </w:r>
-      <w:r>
-        <w:rPr>
-          <w:rFonts w:ascii="맑은 고딕" w:hAnsi="맑은 고딕" w:eastAsia="맑은 고딕"/>
-          <w:color w:val="334155"/>
-          <w:sz w:val="20"/>
-        </w:rPr>
-        <w:t>: 과제 발표용 화면 시연에 머무르지 않고 실제 기기에 설치 가능한 정식 앱으로 출시함.</w:t>
+        <w:t>: 디자인의 최종 완성을 마냥 기다리기보다, 준비된 기획서와 지금까지 완성된 디자인을 바탕으로 실제 Flutter 코드로의 프로토타입 전환을 먼저 시도하여 동작성을 검증함.</w:t>
       </w:r>
     </w:p>
     <w:p>
@@ -2403,7 +2298,23 @@
           <w:color w:val="334155"/>
           <w:sz w:val="20"/>
         </w:rPr>
-        <w:t>앱 핵심 기능 및 프로토타입 구현이 일정 수준 완성된 후 Google Play Console 개발자 계정 등록을 진행할 예정임.</w:t>
+        <w:t>준비된 기획서와 디자인 산출물을 AI에게 전달하고, 사전 세팅된 스킬(</w:t>
+      </w:r>
+      <w:r>
+        <w:rPr>
+          <w:rFonts w:ascii="Consolas" w:hAnsi="Consolas" w:eastAsia="맑은 고딕"/>
+          <w:color w:val="B42846"/>
+          <w:sz w:val="19"/>
+        </w:rPr>
+        <w:t>figma-to-flutter</w:t>
+      </w:r>
+      <w:r>
+        <w:rPr>
+          <w:rFonts w:ascii="맑은 고딕" w:hAnsi="맑은 고딕" w:eastAsia="맑은 고딕"/>
+          <w:color w:val="334155"/>
+          <w:sz w:val="20"/>
+        </w:rPr>
+        <w:t>)을 활용해 피그마 배치를 Flutter 위젯 코드로 변환함.</w:t>
       </w:r>
     </w:p>
     <w:p>
@@ -2426,7 +2337,24 @@
           <w:color w:val="334155"/>
           <w:sz w:val="20"/>
         </w:rPr>
-        <w:t>Flutter 앱 배포용 패키지(AAB 파일)를 빌드함.</w:t>
+        <w:t xml:space="preserve">실제 코드 작성 시 </w:t>
+      </w:r>
+      <w:r>
+        <w:rPr>
+          <w:rFonts w:ascii="맑은 고딕" w:hAnsi="맑은 고딕" w:eastAsia="맑은 고딕"/>
+          <w:b/>
+          <w:color w:val="334155"/>
+          <w:sz w:val="20"/>
+        </w:rPr>
+        <w:t>가재코드(gajae-code)와 다중 모델 라우팅 허브인 AIMy를 본격 연동</w:t>
+      </w:r>
+      <w:r>
+        <w:rPr>
+          <w:rFonts w:ascii="맑은 고딕" w:hAnsi="맑은 고딕" w:eastAsia="맑은 고딕"/>
+          <w:color w:val="334155"/>
+          <w:sz w:val="20"/>
+        </w:rPr>
+        <w:t>함. 작업 성격(설계 인터뷰, 위젯 UI 생성, 상태 관리 로직, 검토)에 맞춰 각 역할마다 적합한 AI 모델(Claude, GPT, Gemini 등)을 나눠 붙여서 코드로 전환하고, 의도대로 작동할 수 있게 다듬음.</w:t>
       </w:r>
     </w:p>
     <w:p>
@@ -2449,7 +2377,163 @@
           <w:color w:val="334155"/>
           <w:sz w:val="20"/>
         </w:rPr>
-        <w:t>AI를 활용하여 앱 권한 명세서와 개인정보 처리방침 문서를 작성한 뒤 스토어 심사를 제출할 계획임.</w:t>
+        <w:t>화면 UI와 내부 데이터 처리 로직을 명확히 분리하기 위해 클린 아키텍처(Riverpod 상태 관리)를 적용하고 단위 테스트를 수행함.</w:t>
+      </w:r>
+    </w:p>
+    <w:p>
+      <w:pPr>
+        <w:spacing w:before="160" w:after="160"/>
+        <w:pBdr>
+          <w:bottom w:val="single" w:sz="6" w:space="1" w:color="E2E8F0"/>
+        </w:pBdr>
+      </w:pPr>
+    </w:p>
+    <w:p>
+      <w:pPr>
+        <w:keepNext/>
+        <w:spacing w:before="220" w:after="80"/>
+      </w:pPr>
+      <w:r>
+        <w:rPr>
+          <w:rFonts w:ascii="맑은 고딕" w:hAnsi="맑은 고딕" w:eastAsia="맑은 고딕"/>
+          <w:b/>
+          <w:color w:val="2563EB"/>
+          <w:sz w:val="24"/>
+        </w:rPr>
+        <w:t>5단계: 앱 완성 및 구글 플레이스토어 출시 검토 (향후 진행 예정)</w:t>
+      </w:r>
+    </w:p>
+    <w:p>
+      <w:pPr>
+        <w:spacing w:before="30" w:after="30"/>
+        <w:ind w:left="360"/>
+      </w:pPr>
+      <w:r>
+        <w:rPr>
+          <w:rFonts w:ascii="맑은 고딕" w:hAnsi="맑은 고딕"/>
+          <w:b/>
+          <w:color w:val="6366F1"/>
+          <w:sz w:val="20"/>
+        </w:rPr>
+        <w:t xml:space="preserve">• </w:t>
+      </w:r>
+      <w:r>
+        <w:rPr>
+          <w:rFonts w:ascii="맑은 고딕" w:hAnsi="맑은 고딕" w:eastAsia="맑은 고딕"/>
+          <w:b/>
+          <w:color w:val="334155"/>
+          <w:sz w:val="20"/>
+        </w:rPr>
+        <w:t>목표</w:t>
+      </w:r>
+      <w:r>
+        <w:rPr>
+          <w:rFonts w:ascii="맑은 고딕" w:hAnsi="맑은 고딕" w:eastAsia="맑은 고딕"/>
+          <w:color w:val="334155"/>
+          <w:sz w:val="20"/>
+        </w:rPr>
+        <w:t>: 개발된 앱의 실제 구동 완성도와 안정성을 확인한 후, 최종 스토어 출시를 검토함.</w:t>
+      </w:r>
+    </w:p>
+    <w:p>
+      <w:pPr>
+        <w:spacing w:before="30" w:after="30"/>
+        <w:ind w:left="360"/>
+      </w:pPr>
+      <w:r>
+        <w:rPr>
+          <w:rFonts w:ascii="맑은 고딕" w:hAnsi="맑은 고딕"/>
+          <w:b/>
+          <w:color w:val="6366F1"/>
+          <w:sz w:val="20"/>
+        </w:rPr>
+        <w:t xml:space="preserve">• </w:t>
+      </w:r>
+      <w:r>
+        <w:rPr>
+          <w:rFonts w:ascii="맑은 고딕" w:hAnsi="맑은 고딕" w:eastAsia="맑은 고딕"/>
+          <w:b/>
+          <w:color w:val="334155"/>
+          <w:sz w:val="20"/>
+        </w:rPr>
+        <w:t>진행 계획</w:t>
+      </w:r>
+      <w:r>
+        <w:rPr>
+          <w:rFonts w:ascii="맑은 고딕" w:hAnsi="맑은 고딕" w:eastAsia="맑은 고딕"/>
+          <w:color w:val="334155"/>
+          <w:sz w:val="20"/>
+        </w:rPr>
+        <w:t>:</w:t>
+      </w:r>
+    </w:p>
+    <w:p>
+      <w:pPr>
+        <w:spacing w:before="30" w:after="30"/>
+        <w:ind w:left="720"/>
+      </w:pPr>
+      <w:r>
+        <w:rPr>
+          <w:rFonts w:ascii="맑은 고딕" w:hAnsi="맑은 고딕"/>
+          <w:b/>
+          <w:color w:val="2563EB"/>
+          <w:sz w:val="20"/>
+        </w:rPr>
+        <w:t xml:space="preserve">1. </w:t>
+      </w:r>
+      <w:r>
+        <w:rPr>
+          <w:rFonts w:ascii="맑은 고딕" w:hAnsi="맑은 고딕" w:eastAsia="맑은 고딕"/>
+          <w:color w:val="334155"/>
+          <w:sz w:val="20"/>
+        </w:rPr>
+        <w:t>앱의 핵심 기능 및 프로토타입이 실제로 얼마나 제대로 동작하는지 확인한 후 Google Play Console 개발자 계정 등록 여부를 최종 판단함.</w:t>
+      </w:r>
+    </w:p>
+    <w:p>
+      <w:pPr>
+        <w:spacing w:before="30" w:after="30"/>
+        <w:ind w:left="720"/>
+      </w:pPr>
+      <w:r>
+        <w:rPr>
+          <w:rFonts w:ascii="맑은 고딕" w:hAnsi="맑은 고딕"/>
+          <w:b/>
+          <w:color w:val="2563EB"/>
+          <w:sz w:val="20"/>
+        </w:rPr>
+        <w:t xml:space="preserve">2. </w:t>
+      </w:r>
+      <w:r>
+        <w:rPr>
+          <w:rFonts w:ascii="맑은 고딕" w:hAnsi="맑은 고딕" w:eastAsia="맑은 고딕"/>
+          <w:color w:val="334155"/>
+          <w:sz w:val="20"/>
+        </w:rPr>
+        <w:t>출시가 확정되면 Flutter 앱 배포용 패키지(AAB 파일)를 빌드함.</w:t>
+      </w:r>
+    </w:p>
+    <w:p>
+      <w:pPr>
+        <w:spacing w:before="30" w:after="30"/>
+        <w:ind w:left="720"/>
+      </w:pPr>
+      <w:r>
+        <w:rPr>
+          <w:rFonts w:ascii="맑은 고딕" w:hAnsi="맑은 고딕"/>
+          <w:b/>
+          <w:color w:val="2563EB"/>
+          <w:sz w:val="20"/>
+        </w:rPr>
+        <w:t xml:space="preserve">3. </w:t>
+      </w:r>
+      <w:r>
+        <w:rPr>
+          <w:rFonts w:ascii="맑은 고딕" w:hAnsi="맑은 고딕" w:eastAsia="맑은 고딕"/>
+          <w:color w:val="334155"/>
+          <w:sz w:val="20"/>
+        </w:rPr>
+        <w:t>AI를 활용하여 앱 권한 명세서와 법적 개인정보 처리방침 문서를 규격에 맞게 작성한 뒤 스토어 심사에 제출할 계획임.</w:t>
       </w:r>
     </w:p>
     <w:p>
@@ -2597,7 +2681,7 @@
                 <w:color w:val="334155"/>
                 <w:sz w:val="19"/>
               </w:rPr>
-              <w:t>AI 대화 모델 (ChatGPT, Gemini, Claude, Copilot)</w:t>
+              <w:t>copilot &amp; gemini</w:t>
             </w:r>
           </w:p>
         </w:tc>
@@ -2645,7 +2729,7 @@
                 <w:color w:val="334155"/>
                 <w:sz w:val="19"/>
               </w:rPr>
-              <w:t>아이디어를 검토하고 타당성을 확인하는 대화형 보조 도구</w:t>
+              <w:t>아이디어를 검토하고 기술적 적합성을 확인하는 대화형 보조 도구</w:t>
             </w:r>
           </w:p>
         </w:tc>
@@ -2673,7 +2757,7 @@
                 <w:color w:val="334155"/>
                 <w:sz w:val="19"/>
               </w:rPr>
-              <w:t>Figma &amp; Figma AI</w:t>
+              <w:t>figma &amp; figma AI</w:t>
             </w:r>
           </w:p>
         </w:tc>
@@ -2750,7 +2834,7 @@
                 <w:color w:val="334155"/>
                 <w:sz w:val="19"/>
               </w:rPr>
-              <w:t>Figma MCP</w:t>
+              <w:t>figma MCP</w:t>
             </w:r>
           </w:p>
         </w:tc>
@@ -2798,7 +2882,7 @@
                 <w:color w:val="334155"/>
                 <w:sz w:val="19"/>
               </w:rPr>
-              <w:t>AI가 피그마 프로그램을 직접 조작할 수 있도록 돕는 도구</w:t>
+              <w:t>AI가 피그마 프로그램을 직접 조작할 수 있도록 돕는 통로</w:t>
             </w:r>
           </w:p>
         </w:tc>
@@ -2826,7 +2910,7 @@
                 <w:color w:val="334155"/>
                 <w:sz w:val="19"/>
               </w:rPr>
-              <w:t>가재코드 (gjc)</w:t>
+              <w:t>antigravity</w:t>
             </w:r>
           </w:p>
         </w:tc>
@@ -2851,7 +2935,7 @@
                 <w:color w:val="334155"/>
                 <w:sz w:val="19"/>
               </w:rPr>
-              <w:t>AI 코딩 에이전트 안전 통제 하네스</w:t>
+              <w:t>기획 문서 작성, 도구 실행, 산출물 실체화를 전담하는 통합 개발 환경</w:t>
             </w:r>
           </w:p>
         </w:tc>
@@ -2876,7 +2960,7 @@
                 <w:color w:val="334155"/>
                 <w:sz w:val="19"/>
               </w:rPr>
-              <w:t>코드 수정 전 계획과 사용자 승인을 강제하는 안전 통제 시스템</w:t>
+              <w:t>프로젝트 전체를 파악하고 실무 산출물을 직접 만드는 AI 실무 파트너</w:t>
             </w:r>
           </w:p>
         </w:tc>
@@ -2903,7 +2987,7 @@
                 <w:color w:val="334155"/>
                 <w:sz w:val="19"/>
               </w:rPr>
-              <w:t>Antigravity IDE / CLI</w:t>
+              <w:t>gajae-code (gjc)</w:t>
             </w:r>
           </w:p>
         </w:tc>
@@ -2927,7 +3011,7 @@
                 <w:color w:val="334155"/>
                 <w:sz w:val="19"/>
               </w:rPr>
-              <w:t>기획 문서 작성, 도구 실행, 산출물 실체화를 전담하는 통합 코딩 환경</w:t>
+              <w:t>AI 코딩 에이전트 안전 통제 하네스</w:t>
             </w:r>
           </w:p>
         </w:tc>
@@ -2951,7 +3035,7 @@
                 <w:color w:val="334155"/>
                 <w:sz w:val="19"/>
               </w:rPr>
-              <w:t>프로젝트 전체를 파악하고 실무 산출물을 직접 만드는 AI 실무 파트너</w:t>
+              <w:t>심층 인터뷰 ➔ 계획 확인 ➔ 실행 증거 절차를 강제하는 안전 통제 도구</w:t>
             </w:r>
           </w:p>
         </w:tc>
@@ -3056,7 +3140,7 @@
                 <w:color w:val="334155"/>
                 <w:sz w:val="19"/>
               </w:rPr>
-              <w:t>GitHub</w:t>
+              <w:t>github</w:t>
             </w:r>
           </w:p>
         </w:tc>
@@ -3080,7 +3164,7 @@
                 <w:color w:val="334155"/>
                 <w:sz w:val="19"/>
               </w:rPr>
-              <w:t>소스 코드 버전 관리(VCS) 및 협업 저장소</w:t>
+              <w:t>소스 코드 버전 관리(VCS) 및 스킬 저장소</w:t>
             </w:r>
           </w:p>
         </w:tc>
@@ -3132,7 +3216,7 @@
                 <w:color w:val="334155"/>
                 <w:sz w:val="19"/>
               </w:rPr>
-              <w:t>Flutter</w:t>
+              <w:t>flutter</w:t>
             </w:r>
           </w:p>
         </w:tc>
@@ -3292,6 +3376,61 @@
           <w:color w:val="334155"/>
           <w:sz w:val="20"/>
         </w:rPr>
+        <w:t>점진적 프로토타이핑 (Agile Prototyping)</w:t>
+      </w:r>
+      <w:r>
+        <w:rPr>
+          <w:rFonts w:ascii="맑은 고딕" w:hAnsi="맑은 고딕" w:eastAsia="맑은 고딕"/>
+          <w:color w:val="334155"/>
+          <w:sz w:val="20"/>
+        </w:rPr>
+        <w:t>:</w:t>
+      </w:r>
+    </w:p>
+    <w:p>
+      <w:pPr>
+        <w:spacing w:before="30" w:after="30"/>
+        <w:ind w:left="720"/>
+      </w:pPr>
+      <w:r>
+        <w:rPr>
+          <w:rFonts w:ascii="맑은 고딕" w:hAnsi="맑은 고딕"/>
+          <w:b/>
+          <w:color w:val="6366F1"/>
+          <w:sz w:val="20"/>
+        </w:rPr>
+        <w:t xml:space="preserve">⁃ </w:t>
+      </w:r>
+      <w:r>
+        <w:rPr>
+          <w:rFonts w:ascii="맑은 고딕" w:hAnsi="맑은 고딕" w:eastAsia="맑은 고딕"/>
+          <w:color w:val="334155"/>
+          <w:sz w:val="20"/>
+        </w:rPr>
+        <w:t>디자인이 100% 완성될 때까지 기다리기보다, 지금까지 확정된 핵심 화면과 기획명세서를 바탕으로 코드로 먼저 전환해보며 실제 동작 가능 여부를 빠르게 검증하는 유연한 개발 방식을 채택함.</w:t>
+      </w:r>
+    </w:p>
+    <w:p>
+      <w:pPr>
+        <w:spacing w:before="30" w:after="30"/>
+        <w:ind w:left="360"/>
+      </w:pPr>
+      <w:r>
+        <w:rPr>
+          <w:rFonts w:ascii="맑은 고딕" w:hAnsi="맑은 고딕"/>
+          <w:b/>
+          <w:color w:val="2563EB"/>
+          <w:sz w:val="20"/>
+        </w:rPr>
+        <w:t xml:space="preserve">3. </w:t>
+      </w:r>
+      <w:r>
+        <w:rPr>
+          <w:rFonts w:ascii="맑은 고딕" w:hAnsi="맑은 고딕" w:eastAsia="맑은 고딕"/>
+          <w:b/>
+          <w:color w:val="334155"/>
+          <w:sz w:val="20"/>
+        </w:rPr>
         <w:t>단순 프롬프트 대화 대신 체계적인 규칙 파일(스킬) 활용</w:t>
       </w:r>
       <w:r>
@@ -3355,7 +3494,7 @@
           <w:color w:val="2563EB"/>
           <w:sz w:val="20"/>
         </w:rPr>
-        <w:t xml:space="preserve">3. </w:t>
+        <w:t xml:space="preserve">4. </w:t>
       </w:r>
       <w:r>
         <w:rPr>
@@ -3433,7 +3572,7 @@
           <w:color w:val="2563EB"/>
           <w:sz w:val="20"/>
         </w:rPr>
-        <w:t xml:space="preserve">4. </w:t>
+        <w:t xml:space="preserve">5. </w:t>
       </w:r>
       <w:r>
         <w:rPr>

</xml_diff>